<commit_message>
REQ-005: batch-12 recordings (sole-trader incident policy complete: purpose, how-we-do-this, responsibilities and procedure; behaviour-support steps in three sub-sections), review pack re-rendered, recorder stops a case after a truncation; evidence and D-526
Co-Authored-By: Claude Fable 5.1 <noreply@anthropic.com>
</commit_message>
<xml_diff>
--- a/product/evidence/req-005/sole-trader/complaints-management-policy-and-register.docx
+++ b/product/evidence/req-005/sole-trader/complaints-management-policy-and-register.docx
@@ -499,7 +499,7 @@
                 <w:sz w:val="22"/>
                 <w:szCs w:val="22"/>
               </w:rPr>
-              <w:t xml:space="preserve">[Provider to complete: Purpose. Two or three sentences naming the provider and what this policy commits to.]</w:t>
+              <w:t xml:space="preserve">[Provider to complete: Purpose. Two short sentences: what this document is for, and which standard it supports; nothing else.]</w:t>
             </w:r>
           </w:p>
         </w:tc>
@@ -993,7 +993,7 @@
                 <w:sz w:val="22"/>
                 <w:szCs w:val="22"/>
               </w:rPr>
-              <w:t xml:space="preserve">[Provider to complete: How we put this into practice. Numbered steps, sized to the business (sole trader wording when there are no workers).]</w:t>
+              <w:t xml:space="preserve">[Provider to complete: How we put this into practice. Numbered steps, sized to the business (sole trader wording when there are no workers). Never restate statutory timeframes, reportable-incident lists or the Commission's definitions; refer to the fixed section that holds them (for example "see section 7 Reportable incidents").]</w:t>
             </w:r>
           </w:p>
         </w:tc>
@@ -1117,7 +1117,7 @@
                 <w:sz w:val="22"/>
                 <w:szCs w:val="22"/>
               </w:rPr>
-              <w:t xml:space="preserve">[Provider to complete: Responsibilities. Table of role and responsibility; roles come from the business structure and worker count.]</w:t>
+              <w:t xml:space="preserve">[Provider to complete: Responsibilities. Table of role and responsibility; roles come from the business structure and worker count. Never restate statutory timeframes, reportable-incident lists or the Commission's definitions; refer to the fixed section that holds them (for example "see section 7 Reportable incidents").]</w:t>
             </w:r>
           </w:p>
         </w:tc>
@@ -1241,7 +1241,7 @@
                 <w:sz w:val="22"/>
                 <w:szCs w:val="22"/>
               </w:rPr>
-              <w:t xml:space="preserve">[Provider to complete: Complaints procedure. Numbered steps with timeframes as a table; how a participant can complain to the Commission.]</w:t>
+              <w:t xml:space="preserve">[Provider to complete: Complaints procedure. Numbered steps with timeframes as a table; how a participant can complain to the Commission. Never restate statutory timeframes, reportable-incident lists or the Commission's definitions; refer to the fixed section that holds them (for example "see section 7 Reportable incidents").]</w:t>
             </w:r>
           </w:p>
         </w:tc>

</xml_diff>

<commit_message>
REQ-005 batch 13 item 2: re-record incident sections 5 and 6 under R-8; review pack re-rendered
Two calls, both passed first time (grades 5.4 and 6.4); register every 3 months and policy every 12 months
throughout. Recorder list gains the batch-13 complaints policy and self-assessment sections for item 3.

Co-Authored-By: Claude Fable 5.1 <noreply@anthropic.com>
</commit_message>
<xml_diff>
--- a/product/evidence/req-005/sole-trader/complaints-management-policy-and-register.docx
+++ b/product/evidence/req-005/sole-trader/complaints-management-policy-and-register.docx
@@ -993,7 +993,7 @@
                 <w:sz w:val="22"/>
                 <w:szCs w:val="22"/>
               </w:rPr>
-              <w:t xml:space="preserve">[Provider to complete: How we put this into practice. Numbered steps, sized to the business (sole trader wording when there are no workers). Never restate statutory timeframes, reportable-incident lists or the Commission's definitions; refer to the fixed section that holds them (for example "see section 7 Reportable incidents").]</w:t>
+              <w:t xml:space="preserve">[Provider to complete: How we put this into practice. Numbered steps, sized to the business (sole trader wording when there are no workers). Never restate statutory timeframes, reportable-incident lists or the Commission's definitions; refer to the fixed section that holds them (for example "see section 7 Reportable incidents"). Review cycles for this document are fixed facts: policy review every 12 months; register review every 3 months. Use them and never choose a cycle.]</w:t>
             </w:r>
           </w:p>
         </w:tc>
@@ -1117,7 +1117,7 @@
                 <w:sz w:val="22"/>
                 <w:szCs w:val="22"/>
               </w:rPr>
-              <w:t xml:space="preserve">[Provider to complete: Responsibilities. Table of role and responsibility; roles come from the business structure and worker count. Never restate statutory timeframes, reportable-incident lists or the Commission's definitions; refer to the fixed section that holds them (for example "see section 7 Reportable incidents").]</w:t>
+              <w:t xml:space="preserve">[Provider to complete: Responsibilities. Table of role and responsibility; roles come from the business structure and worker count. Never restate statutory timeframes, reportable-incident lists or the Commission's definitions; refer to the fixed section that holds them (for example "see section 7 Reportable incidents"). Review cycles for this document are fixed facts: policy review every 12 months; register review every 3 months. Use them and never choose a cycle.]</w:t>
             </w:r>
           </w:p>
         </w:tc>

</xml_diff>

<commit_message>
REQ-005 batch 13 item 3: complaints policy purpose and scope recorded; policy statement truncated at 1,500 (D-528 proposed)
Five calls over three sections, about $0.07; the case stopped at the truncation so six sections are unrecorded.
Review pack re-rendered; evidence table and running total (about $0.50) in the REQ.

Co-Authored-By: Claude Fable 5.1 <noreply@anthropic.com>
</commit_message>
<xml_diff>
--- a/product/evidence/req-005/sole-trader/complaints-management-policy-and-register.docx
+++ b/product/evidence/req-005/sole-trader/complaints-management-policy-and-register.docx
@@ -408,6 +408,46 @@
         <w:t xml:space="preserve">1 Purpose</w:t>
       </w:r>
     </w:p>
+    <w:p>
+      <w:pPr>
+        <w:spacing w:after="120"/>
+      </w:pPr>
+      <w:r>
+        <w:rPr>
+          <w:rFonts w:ascii="Calibri" w:cs="Calibri" w:eastAsia="Calibri" w:hAnsi="Calibri"/>
+          <w:sz w:val="22"/>
+          <w:szCs w:val="22"/>
+        </w:rPr>
+        <w:t xml:space="preserve">This document explains how Sunrise Supports welcomes, answers, records and learns from feedback and complaints. It supports the Complaints management standard in the NDIS Practice Standards.</w:t>
+      </w:r>
+    </w:p>
+    <w:p>
+      <w:pPr>
+        <w:pStyle w:val="Heading1"/>
+        <w:spacing w:after="120" w:before="240"/>
+      </w:pPr>
+      <w:r>
+        <w:rPr>
+          <w:rFonts w:ascii="Calibri" w:cs="Calibri" w:eastAsia="Calibri" w:hAnsi="Calibri"/>
+          <w:b/>
+          <w:bCs/>
+        </w:rPr>
+        <w:t xml:space="preserve">2 Scope</w:t>
+      </w:r>
+    </w:p>
+    <w:p>
+      <w:pPr>
+        <w:spacing w:after="120"/>
+      </w:pPr>
+      <w:r>
+        <w:rPr>
+          <w:rFonts w:ascii="Calibri" w:cs="Calibri" w:eastAsia="Calibri" w:hAnsi="Calibri"/>
+          <w:sz w:val="22"/>
+          <w:szCs w:val="22"/>
+        </w:rPr>
+        <w:t xml:space="preserve">This policy covers all feedback and complaints about the supports Sunrise Supports delivers. Sunrise Supports is a sole trader. We deliver supports to participants in New South Wales.</w:t>
+      </w:r>
+    </w:p>
     <w:tbl>
       <w:tblPr>
         <w:tblW w:type="dxa" w:w="9000"/>
@@ -421,30 +461,278 @@
         </w:tblBorders>
       </w:tblPr>
       <w:tblGrid>
-        <w:gridCol w:w="9000"/>
+        <w:gridCol w:w="4500"/>
+        <w:gridCol w:w="4500"/>
       </w:tblGrid>
       <w:tr>
-        <w:tc>
-          <w:tcPr>
-            <w:tcW w:type="dxa" w:w="9000"/>
-            <w:tcBorders>
-              <w:top w:val="single" w:color="999999" w:sz="4"/>
-              <w:left w:val="single" w:color="999999" w:sz="4"/>
-              <w:bottom w:val="single" w:color="999999" w:sz="4"/>
-              <w:right w:val="single" w:color="999999" w:sz="4"/>
-            </w:tcBorders>
-            <w:shd w:fill="FFF4CE" w:val="clear"/>
-          </w:tcPr>
-          <w:p>
-            <w:r>
-              <w:rPr>
-                <w:rFonts w:ascii="Calibri" w:cs="Calibri" w:eastAsia="Calibri" w:hAnsi="Calibri"/>
-                <w:i/>
-                <w:iCs/>
-                <w:sz w:val="22"/>
-                <w:szCs w:val="22"/>
-              </w:rPr>
-              <w:t xml:space="preserve">Review and complete: this section could not be drafted automatically.</w:t>
+        <w:trPr>
+          <w:tblHeader/>
+        </w:trPr>
+        <w:tc>
+          <w:tcPr>
+            <w:tcW w:type="dxa" w:w="4500"/>
+            <w:tcBorders>
+              <w:top w:val="single" w:color="999999" w:sz="4"/>
+              <w:left w:val="single" w:color="999999" w:sz="4"/>
+              <w:bottom w:val="single" w:color="999999" w:sz="4"/>
+              <w:right w:val="single" w:color="999999" w:sz="4"/>
+            </w:tcBorders>
+            <w:shd w:fill="EEEEEE" w:val="clear"/>
+          </w:tcPr>
+          <w:p>
+            <w:r>
+              <w:rPr>
+                <w:rFonts w:ascii="Calibri" w:cs="Calibri" w:eastAsia="Calibri" w:hAnsi="Calibri"/>
+                <w:b/>
+                <w:bCs/>
+                <w:sz w:val="22"/>
+                <w:szCs w:val="22"/>
+              </w:rPr>
+              <w:t xml:space="preserve">Area</w:t>
+            </w:r>
+          </w:p>
+        </w:tc>
+        <w:tc>
+          <w:tcPr>
+            <w:tcW w:type="dxa" w:w="4500"/>
+            <w:tcBorders>
+              <w:top w:val="single" w:color="999999" w:sz="4"/>
+              <w:left w:val="single" w:color="999999" w:sz="4"/>
+              <w:bottom w:val="single" w:color="999999" w:sz="4"/>
+              <w:right w:val="single" w:color="999999" w:sz="4"/>
+            </w:tcBorders>
+            <w:shd w:fill="EEEEEE" w:val="clear"/>
+          </w:tcPr>
+          <w:p>
+            <w:r>
+              <w:rPr>
+                <w:rFonts w:ascii="Calibri" w:cs="Calibri" w:eastAsia="Calibri" w:hAnsi="Calibri"/>
+                <w:b/>
+                <w:bCs/>
+                <w:sz w:val="22"/>
+                <w:szCs w:val="22"/>
+              </w:rPr>
+              <w:t xml:space="preserve">What it covers</w:t>
+            </w:r>
+          </w:p>
+        </w:tc>
+      </w:tr>
+      <w:tr>
+        <w:tc>
+          <w:tcPr>
+            <w:tcW w:type="dxa" w:w="4500"/>
+            <w:tcBorders>
+              <w:top w:val="single" w:color="999999" w:sz="4"/>
+              <w:left w:val="single" w:color="999999" w:sz="4"/>
+              <w:bottom w:val="single" w:color="999999" w:sz="4"/>
+              <w:right w:val="single" w:color="999999" w:sz="4"/>
+            </w:tcBorders>
+          </w:tcPr>
+          <w:p>
+            <w:r>
+              <w:rPr>
+                <w:rFonts w:ascii="Calibri" w:cs="Calibri" w:eastAsia="Calibri" w:hAnsi="Calibri"/>
+                <w:sz w:val="22"/>
+                <w:szCs w:val="22"/>
+              </w:rPr>
+              <w:t xml:space="preserve">Supports</w:t>
+            </w:r>
+          </w:p>
+        </w:tc>
+        <w:tc>
+          <w:tcPr>
+            <w:tcW w:type="dxa" w:w="4500"/>
+            <w:tcBorders>
+              <w:top w:val="single" w:color="999999" w:sz="4"/>
+              <w:left w:val="single" w:color="999999" w:sz="4"/>
+              <w:bottom w:val="single" w:color="999999" w:sz="4"/>
+              <w:right w:val="single" w:color="999999" w:sz="4"/>
+            </w:tcBorders>
+          </w:tcPr>
+          <w:p>
+            <w:r>
+              <w:rPr>
+                <w:rFonts w:ascii="Calibri" w:cs="Calibri" w:eastAsia="Calibri" w:hAnsi="Calibri"/>
+                <w:sz w:val="22"/>
+                <w:szCs w:val="22"/>
+              </w:rPr>
+              <w:t xml:space="preserve">0120 Household tasks. This policy also covers any other support we add later, once we update this document.</w:t>
+            </w:r>
+          </w:p>
+        </w:tc>
+      </w:tr>
+      <w:tr>
+        <w:tc>
+          <w:tcPr>
+            <w:tcW w:type="dxa" w:w="4500"/>
+            <w:tcBorders>
+              <w:top w:val="single" w:color="999999" w:sz="4"/>
+              <w:left w:val="single" w:color="999999" w:sz="4"/>
+              <w:bottom w:val="single" w:color="999999" w:sz="4"/>
+              <w:right w:val="single" w:color="999999" w:sz="4"/>
+            </w:tcBorders>
+          </w:tcPr>
+          <w:p>
+            <w:r>
+              <w:rPr>
+                <w:rFonts w:ascii="Calibri" w:cs="Calibri" w:eastAsia="Calibri" w:hAnsi="Calibri"/>
+                <w:sz w:val="22"/>
+                <w:szCs w:val="22"/>
+              </w:rPr>
+              <w:t xml:space="preserve">Location</w:t>
+            </w:r>
+          </w:p>
+        </w:tc>
+        <w:tc>
+          <w:tcPr>
+            <w:tcW w:type="dxa" w:w="4500"/>
+            <w:tcBorders>
+              <w:top w:val="single" w:color="999999" w:sz="4"/>
+              <w:left w:val="single" w:color="999999" w:sz="4"/>
+              <w:bottom w:val="single" w:color="999999" w:sz="4"/>
+              <w:right w:val="single" w:color="999999" w:sz="4"/>
+            </w:tcBorders>
+          </w:tcPr>
+          <w:p>
+            <w:r>
+              <w:rPr>
+                <w:rFonts w:ascii="Calibri" w:cs="Calibri" w:eastAsia="Calibri" w:hAnsi="Calibri"/>
+                <w:sz w:val="22"/>
+                <w:szCs w:val="22"/>
+              </w:rPr>
+              <w:t xml:space="preserve">All supports we deliver in New South Wales.</w:t>
+            </w:r>
+          </w:p>
+        </w:tc>
+      </w:tr>
+      <w:tr>
+        <w:tc>
+          <w:tcPr>
+            <w:tcW w:type="dxa" w:w="4500"/>
+            <w:tcBorders>
+              <w:top w:val="single" w:color="999999" w:sz="4"/>
+              <w:left w:val="single" w:color="999999" w:sz="4"/>
+              <w:bottom w:val="single" w:color="999999" w:sz="4"/>
+              <w:right w:val="single" w:color="999999" w:sz="4"/>
+            </w:tcBorders>
+          </w:tcPr>
+          <w:p>
+            <w:r>
+              <w:rPr>
+                <w:rFonts w:ascii="Calibri" w:cs="Calibri" w:eastAsia="Calibri" w:hAnsi="Calibri"/>
+                <w:sz w:val="22"/>
+                <w:szCs w:val="22"/>
+              </w:rPr>
+              <w:t xml:space="preserve">Workers</w:t>
+            </w:r>
+          </w:p>
+        </w:tc>
+        <w:tc>
+          <w:tcPr>
+            <w:tcW w:type="dxa" w:w="4500"/>
+            <w:tcBorders>
+              <w:top w:val="single" w:color="999999" w:sz="4"/>
+              <w:left w:val="single" w:color="999999" w:sz="4"/>
+              <w:bottom w:val="single" w:color="999999" w:sz="4"/>
+              <w:right w:val="single" w:color="999999" w:sz="4"/>
+            </w:tcBorders>
+          </w:tcPr>
+          <w:p>
+            <w:r>
+              <w:rPr>
+                <w:rFonts w:ascii="Calibri" w:cs="Calibri" w:eastAsia="Calibri" w:hAnsi="Calibri"/>
+                <w:sz w:val="22"/>
+                <w:szCs w:val="22"/>
+              </w:rPr>
+              <w:t xml:space="preserve">We are a sole trader with one worker, who is also our key personnel. If we engage other workers, this policy applies to them in the same way.</w:t>
+            </w:r>
+          </w:p>
+        </w:tc>
+      </w:tr>
+      <w:tr>
+        <w:tc>
+          <w:tcPr>
+            <w:tcW w:type="dxa" w:w="4500"/>
+            <w:tcBorders>
+              <w:top w:val="single" w:color="999999" w:sz="4"/>
+              <w:left w:val="single" w:color="999999" w:sz="4"/>
+              <w:bottom w:val="single" w:color="999999" w:sz="4"/>
+              <w:right w:val="single" w:color="999999" w:sz="4"/>
+            </w:tcBorders>
+          </w:tcPr>
+          <w:p>
+            <w:r>
+              <w:rPr>
+                <w:rFonts w:ascii="Calibri" w:cs="Calibri" w:eastAsia="Calibri" w:hAnsi="Calibri"/>
+                <w:sz w:val="22"/>
+                <w:szCs w:val="22"/>
+              </w:rPr>
+              <w:t xml:space="preserve">Key personnel</w:t>
+            </w:r>
+          </w:p>
+        </w:tc>
+        <w:tc>
+          <w:tcPr>
+            <w:tcW w:type="dxa" w:w="4500"/>
+            <w:tcBorders>
+              <w:top w:val="single" w:color="999999" w:sz="4"/>
+              <w:left w:val="single" w:color="999999" w:sz="4"/>
+              <w:bottom w:val="single" w:color="999999" w:sz="4"/>
+              <w:right w:val="single" w:color="999999" w:sz="4"/>
+            </w:tcBorders>
+          </w:tcPr>
+          <w:p>
+            <w:r>
+              <w:rPr>
+                <w:rFonts w:ascii="Calibri" w:cs="Calibri" w:eastAsia="Calibri" w:hAnsi="Calibri"/>
+                <w:sz w:val="22"/>
+                <w:szCs w:val="22"/>
+              </w:rPr>
+              <w:t xml:space="preserve">We have one key personnel. This person receives, manages and decides every complaint.</w:t>
+            </w:r>
+          </w:p>
+        </w:tc>
+      </w:tr>
+      <w:tr>
+        <w:tc>
+          <w:tcPr>
+            <w:tcW w:type="dxa" w:w="4500"/>
+            <w:tcBorders>
+              <w:top w:val="single" w:color="999999" w:sz="4"/>
+              <w:left w:val="single" w:color="999999" w:sz="4"/>
+              <w:bottom w:val="single" w:color="999999" w:sz="4"/>
+              <w:right w:val="single" w:color="999999" w:sz="4"/>
+            </w:tcBorders>
+          </w:tcPr>
+          <w:p>
+            <w:r>
+              <w:rPr>
+                <w:rFonts w:ascii="Calibri" w:cs="Calibri" w:eastAsia="Calibri" w:hAnsi="Calibri"/>
+                <w:sz w:val="22"/>
+                <w:szCs w:val="22"/>
+              </w:rPr>
+              <w:t xml:space="preserve">Feedback and complaints</w:t>
+            </w:r>
+          </w:p>
+        </w:tc>
+        <w:tc>
+          <w:tcPr>
+            <w:tcW w:type="dxa" w:w="4500"/>
+            <w:tcBorders>
+              <w:top w:val="single" w:color="999999" w:sz="4"/>
+              <w:left w:val="single" w:color="999999" w:sz="4"/>
+              <w:bottom w:val="single" w:color="999999" w:sz="4"/>
+              <w:right w:val="single" w:color="999999" w:sz="4"/>
+            </w:tcBorders>
+          </w:tcPr>
+          <w:p>
+            <w:r>
+              <w:rPr>
+                <w:rFonts w:ascii="Calibri" w:cs="Calibri" w:eastAsia="Calibri" w:hAnsi="Calibri"/>
+                <w:sz w:val="22"/>
+                <w:szCs w:val="22"/>
+              </w:rPr>
+              <w:t xml:space="preserve">Compliments, suggestions and concerns, as well as formal complaints, about our supports, our workers, our decisions and how we handle complaints.</w:t>
             </w:r>
           </w:p>
         </w:tc>
@@ -463,48 +751,6 @@
         <w:t xml:space="preserve"/>
       </w:r>
     </w:p>
-    <w:tbl>
-      <w:tblPr>
-        <w:tblW w:type="dxa" w:w="9000"/>
-        <w:tblBorders>
-          <w:top w:val="single" w:color="auto" w:sz="4"/>
-          <w:left w:val="single" w:color="auto" w:sz="4"/>
-          <w:bottom w:val="single" w:color="auto" w:sz="4"/>
-          <w:right w:val="single" w:color="auto" w:sz="4"/>
-          <w:insideH w:val="single" w:color="auto" w:sz="4"/>
-          <w:insideV w:val="single" w:color="auto" w:sz="4"/>
-        </w:tblBorders>
-      </w:tblPr>
-      <w:tblGrid>
-        <w:gridCol w:w="9000"/>
-      </w:tblGrid>
-      <w:tr>
-        <w:tc>
-          <w:tcPr>
-            <w:tcW w:type="dxa" w:w="9000"/>
-            <w:tcBorders>
-              <w:top w:val="single" w:color="999999" w:sz="4"/>
-              <w:left w:val="single" w:color="999999" w:sz="4"/>
-              <w:bottom w:val="single" w:color="999999" w:sz="4"/>
-              <w:right w:val="single" w:color="999999" w:sz="4"/>
-            </w:tcBorders>
-            <w:shd w:fill="FFF4CE" w:val="clear"/>
-          </w:tcPr>
-          <w:p>
-            <w:r>
-              <w:rPr>
-                <w:rFonts w:ascii="Calibri" w:cs="Calibri" w:eastAsia="Calibri" w:hAnsi="Calibri"/>
-                <w:i/>
-                <w:iCs/>
-                <w:sz w:val="22"/>
-                <w:szCs w:val="22"/>
-              </w:rPr>
-              <w:t xml:space="preserve">[Provider to complete: Purpose. Two short sentences: what this document is for, and which standard it supports; nothing else.]</w:t>
-            </w:r>
-          </w:p>
-        </w:tc>
-      </w:tr>
-    </w:tbl>
     <w:p>
       <w:pPr>
         <w:spacing w:after="120"/>
@@ -515,65 +761,9 @@
           <w:sz w:val="22"/>
           <w:szCs w:val="22"/>
         </w:rPr>
-        <w:t xml:space="preserve"/>
-      </w:r>
-    </w:p>
-    <w:p>
-      <w:pPr>
-        <w:pStyle w:val="Heading1"/>
-        <w:spacing w:after="120" w:before="240"/>
-      </w:pPr>
-      <w:r>
-        <w:rPr>
-          <w:rFonts w:ascii="Calibri" w:cs="Calibri" w:eastAsia="Calibri" w:hAnsi="Calibri"/>
-          <w:b/>
-          <w:bCs/>
-        </w:rPr>
-        <w:t xml:space="preserve">2 Scope</w:t>
-      </w:r>
-    </w:p>
-    <w:tbl>
-      <w:tblPr>
-        <w:tblW w:type="dxa" w:w="9000"/>
-        <w:tblBorders>
-          <w:top w:val="single" w:color="auto" w:sz="4"/>
-          <w:left w:val="single" w:color="auto" w:sz="4"/>
-          <w:bottom w:val="single" w:color="auto" w:sz="4"/>
-          <w:right w:val="single" w:color="auto" w:sz="4"/>
-          <w:insideH w:val="single" w:color="auto" w:sz="4"/>
-          <w:insideV w:val="single" w:color="auto" w:sz="4"/>
-        </w:tblBorders>
-      </w:tblPr>
-      <w:tblGrid>
-        <w:gridCol w:w="9000"/>
-      </w:tblGrid>
-      <w:tr>
-        <w:tc>
-          <w:tcPr>
-            <w:tcW w:type="dxa" w:w="9000"/>
-            <w:tcBorders>
-              <w:top w:val="single" w:color="999999" w:sz="4"/>
-              <w:left w:val="single" w:color="999999" w:sz="4"/>
-              <w:bottom w:val="single" w:color="999999" w:sz="4"/>
-              <w:right w:val="single" w:color="999999" w:sz="4"/>
-            </w:tcBorders>
-            <w:shd w:fill="FFF4CE" w:val="clear"/>
-          </w:tcPr>
-          <w:p>
-            <w:r>
-              <w:rPr>
-                <w:rFonts w:ascii="Calibri" w:cs="Calibri" w:eastAsia="Calibri" w:hAnsi="Calibri"/>
-                <w:i/>
-                <w:iCs/>
-                <w:sz w:val="22"/>
-                <w:szCs w:val="22"/>
-              </w:rPr>
-              <w:t xml:space="preserve">Review and complete: this section could not be drafted automatically.</w:t>
-            </w:r>
-          </w:p>
-        </w:tc>
-      </w:tr>
-    </w:tbl>
+        <w:t xml:space="preserve">Anyone can give us feedback or make a complaint. This includes participants, family members, nominees, advocates and other people who are concerned. A person does not need to be a participant to raise a concern with us.</w:t>
+      </w:r>
+    </w:p>
     <w:p>
       <w:pPr>
         <w:spacing w:after="120"/>
@@ -584,62 +774,7 @@
           <w:sz w:val="22"/>
           <w:szCs w:val="22"/>
         </w:rPr>
-        <w:t xml:space="preserve"/>
-      </w:r>
-    </w:p>
-    <w:tbl>
-      <w:tblPr>
-        <w:tblW w:type="dxa" w:w="9000"/>
-        <w:tblBorders>
-          <w:top w:val="single" w:color="auto" w:sz="4"/>
-          <w:left w:val="single" w:color="auto" w:sz="4"/>
-          <w:bottom w:val="single" w:color="auto" w:sz="4"/>
-          <w:right w:val="single" w:color="auto" w:sz="4"/>
-          <w:insideH w:val="single" w:color="auto" w:sz="4"/>
-          <w:insideV w:val="single" w:color="auto" w:sz="4"/>
-        </w:tblBorders>
-      </w:tblPr>
-      <w:tblGrid>
-        <w:gridCol w:w="9000"/>
-      </w:tblGrid>
-      <w:tr>
-        <w:tc>
-          <w:tcPr>
-            <w:tcW w:type="dxa" w:w="9000"/>
-            <w:tcBorders>
-              <w:top w:val="single" w:color="999999" w:sz="4"/>
-              <w:left w:val="single" w:color="999999" w:sz="4"/>
-              <w:bottom w:val="single" w:color="999999" w:sz="4"/>
-              <w:right w:val="single" w:color="999999" w:sz="4"/>
-            </w:tcBorders>
-            <w:shd w:fill="FFF4CE" w:val="clear"/>
-          </w:tcPr>
-          <w:p>
-            <w:r>
-              <w:rPr>
-                <w:rFonts w:ascii="Calibri" w:cs="Calibri" w:eastAsia="Calibri" w:hAnsi="Calibri"/>
-                <w:i/>
-                <w:iCs/>
-                <w:sz w:val="22"/>
-                <w:szCs w:val="22"/>
-              </w:rPr>
-              <w:t xml:space="preserve">[Provider to complete: Scope. Who and what it covers: the supports delivered, states, workers and key personnel from the questionnaire.]</w:t>
-            </w:r>
-          </w:p>
-        </w:tc>
-      </w:tr>
-    </w:tbl>
-    <w:p>
-      <w:pPr>
-        <w:spacing w:after="120"/>
-      </w:pPr>
-      <w:r>
-        <w:rPr>
-          <w:rFonts w:ascii="Calibri" w:cs="Calibri" w:eastAsia="Calibri" w:hAnsi="Calibri"/>
-          <w:sz w:val="22"/>
-          <w:szCs w:val="22"/>
-        </w:rPr>
-        <w:t xml:space="preserve"/>
+        <w:t xml:space="preserve">We do not use restrictive practices. If this changes, we will update this policy and tell participants before we make the change.</w:t>
       </w:r>
     </w:p>
     <w:p>

</xml_diff>

<commit_message>
REQ-005 batch 14 item 2: complaints policy and self-assessment complete; thinking switched off on every call (D-530)
Six sections recorded (five first time); "how we meet" truncated at 1,500 with 1,618 characters of text,
which exposed non-text output eating the caps. Calls now send thinking: between_tools (the API's off
setting for this model), fixtures record the setting and the block types, and the one truncated fixture
was re-recorded: 721 tokens, passed. Review pack shows three complete documents. About $0.15 this batch.

Co-Authored-By: Claude Fable 5.1 <noreply@anthropic.com>
</commit_message>
<xml_diff>
--- a/product/evidence/req-005/sole-trader/complaints-management-policy-and-register.docx
+++ b/product/evidence/req-005/sole-trader/complaints-management-policy-and-register.docx
@@ -913,6 +913,1076 @@
         <w:t xml:space="preserve">4 Policy statement</w:t>
       </w:r>
     </w:p>
+    <w:p>
+      <w:pPr>
+        <w:spacing w:after="120"/>
+      </w:pPr>
+      <w:r>
+        <w:rPr>
+          <w:rFonts w:ascii="Calibri" w:cs="Calibri" w:eastAsia="Calibri" w:hAnsi="Calibri"/>
+          <w:sz w:val="22"/>
+          <w:szCs w:val="22"/>
+        </w:rPr>
+        <w:t xml:space="preserve">Sunrise Supports is a sole trader that provides household tasks (support type 0120) in New South Wales. We welcome feedback and complaints from participants and from anyone else. We treat them as a way to make our supports better.</w:t>
+      </w:r>
+    </w:p>
+    <w:p>
+      <w:pPr>
+        <w:spacing w:after="120"/>
+      </w:pPr>
+      <w:r>
+        <w:rPr>
+          <w:rFonts w:ascii="Calibri" w:cs="Calibri" w:eastAsia="Calibri" w:hAnsi="Calibri"/>
+          <w:sz w:val="22"/>
+          <w:szCs w:val="22"/>
+        </w:rPr>
+        <w:t xml:space="preserve">We handle complaints in line with the National Disability Insurance Scheme (Complaints Management and Resolution) Rules 2018. The NDIS Quality and Safeguards Commission (the Commission) sets these Rules. The table shows each commitment and the quality indicator it supports.</w:t>
+      </w:r>
+    </w:p>
+    <w:tbl>
+      <w:tblPr>
+        <w:tblW w:type="dxa" w:w="9000"/>
+        <w:tblBorders>
+          <w:top w:val="single" w:color="auto" w:sz="4"/>
+          <w:left w:val="single" w:color="auto" w:sz="4"/>
+          <w:bottom w:val="single" w:color="auto" w:sz="4"/>
+          <w:right w:val="single" w:color="auto" w:sz="4"/>
+          <w:insideH w:val="single" w:color="auto" w:sz="4"/>
+          <w:insideV w:val="single" w:color="auto" w:sz="4"/>
+        </w:tblBorders>
+      </w:tblPr>
+      <w:tblGrid>
+        <w:gridCol w:w="3000"/>
+        <w:gridCol w:w="3000"/>
+        <w:gridCol w:w="3000"/>
+      </w:tblGrid>
+      <w:tr>
+        <w:trPr>
+          <w:tblHeader/>
+        </w:trPr>
+        <w:tc>
+          <w:tcPr>
+            <w:tcW w:type="dxa" w:w="3000"/>
+            <w:tcBorders>
+              <w:top w:val="single" w:color="999999" w:sz="4"/>
+              <w:left w:val="single" w:color="999999" w:sz="4"/>
+              <w:bottom w:val="single" w:color="999999" w:sz="4"/>
+              <w:right w:val="single" w:color="999999" w:sz="4"/>
+            </w:tcBorders>
+            <w:shd w:fill="EEEEEE" w:val="clear"/>
+          </w:tcPr>
+          <w:p>
+            <w:r>
+              <w:rPr>
+                <w:rFonts w:ascii="Calibri" w:cs="Calibri" w:eastAsia="Calibri" w:hAnsi="Calibri"/>
+                <w:b/>
+                <w:bCs/>
+                <w:sz w:val="22"/>
+                <w:szCs w:val="22"/>
+              </w:rPr>
+              <w:t xml:space="preserve">Our commitment</w:t>
+            </w:r>
+          </w:p>
+        </w:tc>
+        <w:tc>
+          <w:tcPr>
+            <w:tcW w:type="dxa" w:w="3000"/>
+            <w:tcBorders>
+              <w:top w:val="single" w:color="999999" w:sz="4"/>
+              <w:left w:val="single" w:color="999999" w:sz="4"/>
+              <w:bottom w:val="single" w:color="999999" w:sz="4"/>
+              <w:right w:val="single" w:color="999999" w:sz="4"/>
+            </w:tcBorders>
+            <w:shd w:fill="EEEEEE" w:val="clear"/>
+          </w:tcPr>
+          <w:p>
+            <w:r>
+              <w:rPr>
+                <w:rFonts w:ascii="Calibri" w:cs="Calibri" w:eastAsia="Calibri" w:hAnsi="Calibri"/>
+                <w:b/>
+                <w:bCs/>
+                <w:sz w:val="22"/>
+                <w:szCs w:val="22"/>
+              </w:rPr>
+              <w:t xml:space="preserve">What we do</w:t>
+            </w:r>
+          </w:p>
+        </w:tc>
+        <w:tc>
+          <w:tcPr>
+            <w:tcW w:type="dxa" w:w="3000"/>
+            <w:tcBorders>
+              <w:top w:val="single" w:color="999999" w:sz="4"/>
+              <w:left w:val="single" w:color="999999" w:sz="4"/>
+              <w:bottom w:val="single" w:color="999999" w:sz="4"/>
+              <w:right w:val="single" w:color="999999" w:sz="4"/>
+            </w:tcBorders>
+            <w:shd w:fill="EEEEEE" w:val="clear"/>
+          </w:tcPr>
+          <w:p>
+            <w:r>
+              <w:rPr>
+                <w:rFonts w:ascii="Calibri" w:cs="Calibri" w:eastAsia="Calibri" w:hAnsi="Calibri"/>
+                <w:b/>
+                <w:bCs/>
+                <w:sz w:val="22"/>
+                <w:szCs w:val="22"/>
+              </w:rPr>
+              <w:t xml:space="preserve">Quality indicator</w:t>
+            </w:r>
+          </w:p>
+        </w:tc>
+      </w:tr>
+      <w:tr>
+        <w:tc>
+          <w:tcPr>
+            <w:tcW w:type="dxa" w:w="3000"/>
+            <w:tcBorders>
+              <w:top w:val="single" w:color="999999" w:sz="4"/>
+              <w:left w:val="single" w:color="999999" w:sz="4"/>
+              <w:bottom w:val="single" w:color="999999" w:sz="4"/>
+              <w:right w:val="single" w:color="999999" w:sz="4"/>
+            </w:tcBorders>
+          </w:tcPr>
+          <w:p>
+            <w:r>
+              <w:rPr>
+                <w:rFonts w:ascii="Calibri" w:cs="Calibri" w:eastAsia="Calibri" w:hAnsi="Calibri"/>
+                <w:sz w:val="22"/>
+                <w:szCs w:val="22"/>
+              </w:rPr>
+              <w:t xml:space="preserve">We keep a complaints system that fits our size and our supports.</w:t>
+            </w:r>
+          </w:p>
+        </w:tc>
+        <w:tc>
+          <w:tcPr>
+            <w:tcW w:type="dxa" w:w="3000"/>
+            <w:tcBorders>
+              <w:top w:val="single" w:color="999999" w:sz="4"/>
+              <w:left w:val="single" w:color="999999" w:sz="4"/>
+              <w:bottom w:val="single" w:color="999999" w:sz="4"/>
+              <w:right w:val="single" w:color="999999" w:sz="4"/>
+            </w:tcBorders>
+          </w:tcPr>
+          <w:p>
+            <w:r>
+              <w:rPr>
+                <w:rFonts w:ascii="Calibri" w:cs="Calibri" w:eastAsia="Calibri" w:hAnsi="Calibri"/>
+                <w:sz w:val="22"/>
+                <w:szCs w:val="22"/>
+              </w:rPr>
+              <w:t xml:space="preserve">We keep the system simple and in proportion to a sole trader providing household tasks. We handle every complaint fairly. We tell the person what is happening, listen to all sides, decide without bias and give our reasons.</w:t>
+            </w:r>
+          </w:p>
+        </w:tc>
+        <w:tc>
+          <w:tcPr>
+            <w:tcW w:type="dxa" w:w="3000"/>
+            <w:tcBorders>
+              <w:top w:val="single" w:color="999999" w:sz="4"/>
+              <w:left w:val="single" w:color="999999" w:sz="4"/>
+              <w:bottom w:val="single" w:color="999999" w:sz="4"/>
+              <w:right w:val="single" w:color="999999" w:sz="4"/>
+            </w:tcBorders>
+          </w:tcPr>
+          <w:p>
+            <w:r>
+              <w:rPr>
+                <w:rFonts w:ascii="Calibri" w:cs="Calibri" w:eastAsia="Calibri" w:hAnsi="Calibri"/>
+                <w:sz w:val="22"/>
+                <w:szCs w:val="22"/>
+              </w:rPr>
+              <w:t xml:space="preserve">Feedback and complaints management, indicator 1. Complaints management, indicator 1.</w:t>
+            </w:r>
+          </w:p>
+        </w:tc>
+      </w:tr>
+      <w:tr>
+        <w:tc>
+          <w:tcPr>
+            <w:tcW w:type="dxa" w:w="3000"/>
+            <w:tcBorders>
+              <w:top w:val="single" w:color="999999" w:sz="4"/>
+              <w:left w:val="single" w:color="999999" w:sz="4"/>
+              <w:bottom w:val="single" w:color="999999" w:sz="4"/>
+              <w:right w:val="single" w:color="999999" w:sz="4"/>
+            </w:tcBorders>
+          </w:tcPr>
+          <w:p>
+            <w:r>
+              <w:rPr>
+                <w:rFonts w:ascii="Calibri" w:cs="Calibri" w:eastAsia="Calibri" w:hAnsi="Calibri"/>
+                <w:sz w:val="22"/>
+                <w:szCs w:val="22"/>
+              </w:rPr>
+              <w:t xml:space="preserve">We tell every participant how to give feedback or make a complaint.</w:t>
+            </w:r>
+          </w:p>
+        </w:tc>
+        <w:tc>
+          <w:tcPr>
+            <w:tcW w:type="dxa" w:w="3000"/>
+            <w:tcBorders>
+              <w:top w:val="single" w:color="999999" w:sz="4"/>
+              <w:left w:val="single" w:color="999999" w:sz="4"/>
+              <w:bottom w:val="single" w:color="999999" w:sz="4"/>
+              <w:right w:val="single" w:color="999999" w:sz="4"/>
+            </w:tcBorders>
+          </w:tcPr>
+          <w:p>
+            <w:r>
+              <w:rPr>
+                <w:rFonts w:ascii="Calibri" w:cs="Calibri" w:eastAsia="Calibri" w:hAnsi="Calibri"/>
+                <w:sz w:val="22"/>
+                <w:szCs w:val="22"/>
+              </w:rPr>
+              <w:t xml:space="preserve">We explain this when supports start and whenever a participant asks. We explain outside options, including the Commission, and the participant's right to use an advocate. We use a format the participant can understand.</w:t>
+            </w:r>
+          </w:p>
+        </w:tc>
+        <w:tc>
+          <w:tcPr>
+            <w:tcW w:type="dxa" w:w="3000"/>
+            <w:tcBorders>
+              <w:top w:val="single" w:color="999999" w:sz="4"/>
+              <w:left w:val="single" w:color="999999" w:sz="4"/>
+              <w:bottom w:val="single" w:color="999999" w:sz="4"/>
+              <w:right w:val="single" w:color="999999" w:sz="4"/>
+            </w:tcBorders>
+          </w:tcPr>
+          <w:p>
+            <w:r>
+              <w:rPr>
+                <w:rFonts w:ascii="Calibri" w:cs="Calibri" w:eastAsia="Calibri" w:hAnsi="Calibri"/>
+                <w:sz w:val="22"/>
+                <w:szCs w:val="22"/>
+              </w:rPr>
+              <w:t xml:space="preserve">Feedback and complaints management, indicator 2.</w:t>
+            </w:r>
+          </w:p>
+        </w:tc>
+      </w:tr>
+      <w:tr>
+        <w:tc>
+          <w:tcPr>
+            <w:tcW w:type="dxa" w:w="3000"/>
+            <w:tcBorders>
+              <w:top w:val="single" w:color="999999" w:sz="4"/>
+              <w:left w:val="single" w:color="999999" w:sz="4"/>
+              <w:bottom w:val="single" w:color="999999" w:sz="4"/>
+              <w:right w:val="single" w:color="999999" w:sz="4"/>
+            </w:tcBorders>
+          </w:tcPr>
+          <w:p>
+            <w:r>
+              <w:rPr>
+                <w:rFonts w:ascii="Calibri" w:cs="Calibri" w:eastAsia="Calibri" w:hAnsi="Calibri"/>
+                <w:sz w:val="22"/>
+                <w:szCs w:val="22"/>
+              </w:rPr>
+              <w:t xml:space="preserve">We welcome feedback and protect the people who give it.</w:t>
+            </w:r>
+          </w:p>
+        </w:tc>
+        <w:tc>
+          <w:tcPr>
+            <w:tcW w:type="dxa" w:w="3000"/>
+            <w:tcBorders>
+              <w:top w:val="single" w:color="999999" w:sz="4"/>
+              <w:left w:val="single" w:color="999999" w:sz="4"/>
+              <w:bottom w:val="single" w:color="999999" w:sz="4"/>
+              <w:right w:val="single" w:color="999999" w:sz="4"/>
+            </w:tcBorders>
+          </w:tcPr>
+          <w:p>
+            <w:r>
+              <w:rPr>
+                <w:rFonts w:ascii="Calibri" w:cs="Calibri" w:eastAsia="Calibri" w:hAnsi="Calibri"/>
+                <w:sz w:val="22"/>
+                <w:szCs w:val="22"/>
+              </w:rPr>
+              <w:t xml:space="preserve">We thank the person, acknowledge what they told us and respect their view. We do not treat anyone worse for raising a concern. We let the participant choose who supports them in the process.</w:t>
+            </w:r>
+          </w:p>
+        </w:tc>
+        <w:tc>
+          <w:tcPr>
+            <w:tcW w:type="dxa" w:w="3000"/>
+            <w:tcBorders>
+              <w:top w:val="single" w:color="999999" w:sz="4"/>
+              <w:left w:val="single" w:color="999999" w:sz="4"/>
+              <w:bottom w:val="single" w:color="999999" w:sz="4"/>
+              <w:right w:val="single" w:color="999999" w:sz="4"/>
+            </w:tcBorders>
+          </w:tcPr>
+          <w:p>
+            <w:r>
+              <w:rPr>
+                <w:rFonts w:ascii="Calibri" w:cs="Calibri" w:eastAsia="Calibri" w:hAnsi="Calibri"/>
+                <w:sz w:val="22"/>
+                <w:szCs w:val="22"/>
+              </w:rPr>
+              <w:t xml:space="preserve">Feedback and complaints management, indicator 2.</w:t>
+            </w:r>
+          </w:p>
+        </w:tc>
+      </w:tr>
+      <w:tr>
+        <w:tc>
+          <w:tcPr>
+            <w:tcW w:type="dxa" w:w="3000"/>
+            <w:tcBorders>
+              <w:top w:val="single" w:color="999999" w:sz="4"/>
+              <w:left w:val="single" w:color="999999" w:sz="4"/>
+              <w:bottom w:val="single" w:color="999999" w:sz="4"/>
+              <w:right w:val="single" w:color="999999" w:sz="4"/>
+            </w:tcBorders>
+          </w:tcPr>
+          <w:p>
+            <w:r>
+              <w:rPr>
+                <w:rFonts w:ascii="Calibri" w:cs="Calibri" w:eastAsia="Calibri" w:hAnsi="Calibri"/>
+                <w:sz w:val="22"/>
+                <w:szCs w:val="22"/>
+              </w:rPr>
+              <w:t xml:space="preserve">We record every complaint and what we did about it.</w:t>
+            </w:r>
+          </w:p>
+        </w:tc>
+        <w:tc>
+          <w:tcPr>
+            <w:tcW w:type="dxa" w:w="3000"/>
+            <w:tcBorders>
+              <w:top w:val="single" w:color="999999" w:sz="4"/>
+              <w:left w:val="single" w:color="999999" w:sz="4"/>
+              <w:bottom w:val="single" w:color="999999" w:sz="4"/>
+              <w:right w:val="single" w:color="999999" w:sz="4"/>
+            </w:tcBorders>
+          </w:tcPr>
+          <w:p>
+            <w:r>
+              <w:rPr>
+                <w:rFonts w:ascii="Calibri" w:cs="Calibri" w:eastAsia="Calibri" w:hAnsi="Calibri"/>
+                <w:sz w:val="22"/>
+                <w:szCs w:val="22"/>
+              </w:rPr>
+              <w:t xml:space="preserve">We enter each complaint in the Complaints register. We record how we handled it, the outcome and any follow-up. We keep these records private.</w:t>
+            </w:r>
+          </w:p>
+        </w:tc>
+        <w:tc>
+          <w:tcPr>
+            <w:tcW w:type="dxa" w:w="3000"/>
+            <w:tcBorders>
+              <w:top w:val="single" w:color="999999" w:sz="4"/>
+              <w:left w:val="single" w:color="999999" w:sz="4"/>
+              <w:bottom w:val="single" w:color="999999" w:sz="4"/>
+              <w:right w:val="single" w:color="999999" w:sz="4"/>
+            </w:tcBorders>
+          </w:tcPr>
+          <w:p>
+            <w:r>
+              <w:rPr>
+                <w:rFonts w:ascii="Calibri" w:cs="Calibri" w:eastAsia="Calibri" w:hAnsi="Calibri"/>
+                <w:sz w:val="22"/>
+                <w:szCs w:val="22"/>
+              </w:rPr>
+              <w:t xml:space="preserve">Complaints management, indicator 1.</w:t>
+            </w:r>
+          </w:p>
+        </w:tc>
+      </w:tr>
+      <w:tr>
+        <w:tc>
+          <w:tcPr>
+            <w:tcW w:type="dxa" w:w="3000"/>
+            <w:tcBorders>
+              <w:top w:val="single" w:color="999999" w:sz="4"/>
+              <w:left w:val="single" w:color="999999" w:sz="4"/>
+              <w:bottom w:val="single" w:color="999999" w:sz="4"/>
+              <w:right w:val="single" w:color="999999" w:sz="4"/>
+            </w:tcBorders>
+          </w:tcPr>
+          <w:p>
+            <w:r>
+              <w:rPr>
+                <w:rFonts w:ascii="Calibri" w:cs="Calibri" w:eastAsia="Calibri" w:hAnsi="Calibri"/>
+                <w:sz w:val="22"/>
+                <w:szCs w:val="22"/>
+              </w:rPr>
+              <w:t xml:space="preserve">We use feedback to improve.</w:t>
+            </w:r>
+          </w:p>
+        </w:tc>
+        <w:tc>
+          <w:tcPr>
+            <w:tcW w:type="dxa" w:w="3000"/>
+            <w:tcBorders>
+              <w:top w:val="single" w:color="999999" w:sz="4"/>
+              <w:left w:val="single" w:color="999999" w:sz="4"/>
+              <w:bottom w:val="single" w:color="999999" w:sz="4"/>
+              <w:right w:val="single" w:color="999999" w:sz="4"/>
+            </w:tcBorders>
+          </w:tcPr>
+          <w:p>
+            <w:r>
+              <w:rPr>
+                <w:rFonts w:ascii="Calibri" w:cs="Calibri" w:eastAsia="Calibri" w:hAnsi="Calibri"/>
+                <w:sz w:val="22"/>
+                <w:szCs w:val="22"/>
+              </w:rPr>
+              <w:t xml:space="preserve">We review this policy every 12 months. We ask participants whether our complaints process is easy to find and use. We change how we work when feedback shows we should.</w:t>
+            </w:r>
+          </w:p>
+        </w:tc>
+        <w:tc>
+          <w:tcPr>
+            <w:tcW w:type="dxa" w:w="3000"/>
+            <w:tcBorders>
+              <w:top w:val="single" w:color="999999" w:sz="4"/>
+              <w:left w:val="single" w:color="999999" w:sz="4"/>
+              <w:bottom w:val="single" w:color="999999" w:sz="4"/>
+              <w:right w:val="single" w:color="999999" w:sz="4"/>
+            </w:tcBorders>
+          </w:tcPr>
+          <w:p>
+            <w:r>
+              <w:rPr>
+                <w:rFonts w:ascii="Calibri" w:cs="Calibri" w:eastAsia="Calibri" w:hAnsi="Calibri"/>
+                <w:sz w:val="22"/>
+                <w:szCs w:val="22"/>
+              </w:rPr>
+              <w:t xml:space="preserve">Feedback and complaints management, indicator 3.</w:t>
+            </w:r>
+          </w:p>
+        </w:tc>
+      </w:tr>
+      <w:tr>
+        <w:tc>
+          <w:tcPr>
+            <w:tcW w:type="dxa" w:w="3000"/>
+            <w:tcBorders>
+              <w:top w:val="single" w:color="999999" w:sz="4"/>
+              <w:left w:val="single" w:color="999999" w:sz="4"/>
+              <w:bottom w:val="single" w:color="999999" w:sz="4"/>
+              <w:right w:val="single" w:color="999999" w:sz="4"/>
+            </w:tcBorders>
+          </w:tcPr>
+          <w:p>
+            <w:r>
+              <w:rPr>
+                <w:rFonts w:ascii="Calibri" w:cs="Calibri" w:eastAsia="Calibri" w:hAnsi="Calibri"/>
+                <w:sz w:val="22"/>
+                <w:szCs w:val="22"/>
+              </w:rPr>
+              <w:t xml:space="preserve">We make sure every worker knows and follows the process.</w:t>
+            </w:r>
+          </w:p>
+        </w:tc>
+        <w:tc>
+          <w:tcPr>
+            <w:tcW w:type="dxa" w:w="3000"/>
+            <w:tcBorders>
+              <w:top w:val="single" w:color="999999" w:sz="4"/>
+              <w:left w:val="single" w:color="999999" w:sz="4"/>
+              <w:bottom w:val="single" w:color="999999" w:sz="4"/>
+              <w:right w:val="single" w:color="999999" w:sz="4"/>
+            </w:tcBorders>
+          </w:tcPr>
+          <w:p>
+            <w:r>
+              <w:rPr>
+                <w:rFonts w:ascii="Calibri" w:cs="Calibri" w:eastAsia="Calibri" w:hAnsi="Calibri"/>
+                <w:sz w:val="22"/>
+                <w:szCs w:val="22"/>
+              </w:rPr>
+              <w:t xml:space="preserve">We train every worker on this procedure before they start work. This includes any worker who joins us later. We check that they follow it and refresh the training when the procedure changes.</w:t>
+            </w:r>
+          </w:p>
+        </w:tc>
+        <w:tc>
+          <w:tcPr>
+            <w:tcW w:type="dxa" w:w="3000"/>
+            <w:tcBorders>
+              <w:top w:val="single" w:color="999999" w:sz="4"/>
+              <w:left w:val="single" w:color="999999" w:sz="4"/>
+              <w:bottom w:val="single" w:color="999999" w:sz="4"/>
+              <w:right w:val="single" w:color="999999" w:sz="4"/>
+            </w:tcBorders>
+          </w:tcPr>
+          <w:p>
+            <w:r>
+              <w:rPr>
+                <w:rFonts w:ascii="Calibri" w:cs="Calibri" w:eastAsia="Calibri" w:hAnsi="Calibri"/>
+                <w:sz w:val="22"/>
+                <w:szCs w:val="22"/>
+              </w:rPr>
+              <w:t xml:space="preserve">Feedback and complaints management, indicator 4.</w:t>
+            </w:r>
+          </w:p>
+        </w:tc>
+      </w:tr>
+    </w:tbl>
+    <w:p>
+      <w:pPr>
+        <w:spacing w:after="120"/>
+      </w:pPr>
+      <w:r>
+        <w:rPr>
+          <w:rFonts w:ascii="Calibri" w:cs="Calibri" w:eastAsia="Calibri" w:hAnsi="Calibri"/>
+          <w:sz w:val="22"/>
+          <w:szCs w:val="22"/>
+        </w:rPr>
+        <w:t xml:space="preserve"/>
+      </w:r>
+    </w:p>
+    <w:p>
+      <w:pPr>
+        <w:pStyle w:val="Heading1"/>
+        <w:spacing w:after="120" w:before="240"/>
+      </w:pPr>
+      <w:r>
+        <w:rPr>
+          <w:rFonts w:ascii="Calibri" w:cs="Calibri" w:eastAsia="Calibri" w:hAnsi="Calibri"/>
+          <w:b/>
+          <w:bCs/>
+        </w:rPr>
+        <w:t xml:space="preserve">5 How we put this into practice</w:t>
+      </w:r>
+    </w:p>
+    <w:p>
+      <w:pPr>
+        <w:spacing w:after="120"/>
+      </w:pPr>
+      <w:r>
+        <w:rPr>
+          <w:rFonts w:ascii="Calibri" w:cs="Calibri" w:eastAsia="Calibri" w:hAnsi="Calibri"/>
+          <w:sz w:val="22"/>
+          <w:szCs w:val="22"/>
+        </w:rPr>
+        <w:t xml:space="preserve">Sunrise Supports is a sole trader business. We have no workers. The owner carries out every step below for our household tasks supports in New South Wales. If we ever take on workers, we will update this section and train them before they work with participants.</w:t>
+      </w:r>
+    </w:p>
+    <w:p>
+      <w:pPr>
+        <w:pStyle w:val="ListParagraph"/>
+        <w:numPr>
+          <w:ilvl w:val="0"/>
+          <w:numId w:val="3"/>
+        </w:numPr>
+        <w:spacing w:after="60"/>
+      </w:pPr>
+      <w:r>
+        <w:rPr>
+          <w:rFonts w:ascii="Calibri" w:cs="Calibri" w:eastAsia="Calibri" w:hAnsi="Calibri"/>
+          <w:sz w:val="22"/>
+          <w:szCs w:val="22"/>
+        </w:rPr>
+        <w:t xml:space="preserve">Before supports start, we tell each participant how to give feedback or make a complaint. We explain it in the way that suits them, such as plain language, large print, Easy Read, spoken words or with an interpreter. We tell them they can bring a family member or an advocate, and that they can go outside Sunrise Supports at any time.</w:t>
+      </w:r>
+    </w:p>
+    <w:p>
+      <w:pPr>
+        <w:pStyle w:val="ListParagraph"/>
+        <w:numPr>
+          <w:ilvl w:val="0"/>
+          <w:numId w:val="3"/>
+        </w:numPr>
+        <w:spacing w:after="60"/>
+      </w:pPr>
+      <w:r>
+        <w:rPr>
+          <w:rFonts w:ascii="Calibri" w:cs="Calibri" w:eastAsia="Calibri" w:hAnsi="Calibri"/>
+          <w:sz w:val="22"/>
+          <w:szCs w:val="22"/>
+        </w:rPr>
+        <w:t xml:space="preserve">We make it easy to speak up. We accept feedback and complaints by phone, message, email, in person, or through someone the participant trusts. A participant can complain without using a form. We write down what was said in the person's own words.</w:t>
+      </w:r>
+    </w:p>
+    <w:p>
+      <w:pPr>
+        <w:pStyle w:val="ListParagraph"/>
+        <w:numPr>
+          <w:ilvl w:val="0"/>
+          <w:numId w:val="3"/>
+        </w:numPr>
+        <w:spacing w:after="60"/>
+      </w:pPr>
+      <w:r>
+        <w:rPr>
+          <w:rFonts w:ascii="Calibri" w:cs="Calibri" w:eastAsia="Calibri" w:hAnsi="Calibri"/>
+          <w:sz w:val="22"/>
+          <w:szCs w:val="22"/>
+        </w:rPr>
+        <w:t xml:space="preserve">We thank the person for raising it. We record it in the Complaints register on the day we receive it. We tell the person we have received it and what happens next. For the timeframes we must meet, see the section on complaint timeframes.</w:t>
+      </w:r>
+    </w:p>
+    <w:p>
+      <w:pPr>
+        <w:pStyle w:val="ListParagraph"/>
+        <w:numPr>
+          <w:ilvl w:val="0"/>
+          <w:numId w:val="3"/>
+        </w:numPr>
+        <w:spacing w:after="60"/>
+      </w:pPr>
+      <w:r>
+        <w:rPr>
+          <w:rFonts w:ascii="Calibri" w:cs="Calibri" w:eastAsia="Calibri" w:hAnsi="Calibri"/>
+          <w:sz w:val="22"/>
+          <w:szCs w:val="22"/>
+        </w:rPr>
+        <w:t xml:space="preserve">We ask the person what outcome they want. We ask if they want a support person or advocate with them, and how they want us to contact them.</w:t>
+      </w:r>
+    </w:p>
+    <w:p>
+      <w:pPr>
+        <w:pStyle w:val="ListParagraph"/>
+        <w:numPr>
+          <w:ilvl w:val="0"/>
+          <w:numId w:val="3"/>
+        </w:numPr>
+        <w:spacing w:after="60"/>
+      </w:pPr>
+      <w:r>
+        <w:rPr>
+          <w:rFonts w:ascii="Calibri" w:cs="Calibri" w:eastAsia="Calibri" w:hAnsi="Calibri"/>
+          <w:sz w:val="22"/>
+          <w:szCs w:val="22"/>
+        </w:rPr>
+        <w:t xml:space="preserve">We look into the matter fairly. We listen to the person, collect the facts and keep an open mind. Anyone the complaint is about gets a chance to respond. If the complaint is about us, we tell the participant they can take it to an outside body, and we explain how.</w:t>
+      </w:r>
+    </w:p>
+    <w:p>
+      <w:pPr>
+        <w:pStyle w:val="ListParagraph"/>
+        <w:numPr>
+          <w:ilvl w:val="0"/>
+          <w:numId w:val="3"/>
+        </w:numPr>
+        <w:spacing w:after="60"/>
+      </w:pPr>
+      <w:r>
+        <w:rPr>
+          <w:rFonts w:ascii="Calibri" w:cs="Calibri" w:eastAsia="Calibri" w:hAnsi="Calibri"/>
+          <w:sz w:val="22"/>
+          <w:szCs w:val="22"/>
+        </w:rPr>
+        <w:t xml:space="preserve">We tell the person the result in the format they prefer. We say what we found, what we will do and by when. We tell them how to take the matter further if they are not satisfied. We ask if they are happy with how we handled it.</w:t>
+      </w:r>
+    </w:p>
+    <w:p>
+      <w:pPr>
+        <w:pStyle w:val="ListParagraph"/>
+        <w:numPr>
+          <w:ilvl w:val="0"/>
+          <w:numId w:val="3"/>
+        </w:numPr>
+        <w:spacing w:after="60"/>
+      </w:pPr>
+      <w:r>
+        <w:rPr>
+          <w:rFonts w:ascii="Calibri" w:cs="Calibri" w:eastAsia="Calibri" w:hAnsi="Calibri"/>
+          <w:sz w:val="22"/>
+          <w:szCs w:val="22"/>
+        </w:rPr>
+        <w:t xml:space="preserve">We protect the person who raised the matter. Supports carry on as normal. We do not treat anyone worse because they gave feedback or made a complaint.</w:t>
+      </w:r>
+    </w:p>
+    <w:p>
+      <w:pPr>
+        <w:pStyle w:val="ListParagraph"/>
+        <w:numPr>
+          <w:ilvl w:val="0"/>
+          <w:numId w:val="3"/>
+        </w:numPr>
+        <w:spacing w:after="60"/>
+      </w:pPr>
+      <w:r>
+        <w:rPr>
+          <w:rFonts w:ascii="Calibri" w:cs="Calibri" w:eastAsia="Calibri" w:hAnsi="Calibri"/>
+          <w:sz w:val="22"/>
+          <w:szCs w:val="22"/>
+        </w:rPr>
+        <w:t xml:space="preserve">We check if the matter is also a reportable incident. If it is, we follow the section on reportable incidents as well as this procedure.</w:t>
+      </w:r>
+    </w:p>
+    <w:p>
+      <w:pPr>
+        <w:pStyle w:val="ListParagraph"/>
+        <w:numPr>
+          <w:ilvl w:val="0"/>
+          <w:numId w:val="3"/>
+        </w:numPr>
+        <w:spacing w:after="60"/>
+      </w:pPr>
+      <w:r>
+        <w:rPr>
+          <w:rFonts w:ascii="Calibri" w:cs="Calibri" w:eastAsia="Calibri" w:hAnsi="Calibri"/>
+          <w:sz w:val="22"/>
+          <w:szCs w:val="22"/>
+        </w:rPr>
+        <w:t xml:space="preserve">We close the entry in the Complaints register. We record what we found, what we did, the outcome and the date. We keep only the personal information we need and store it securely.</w:t>
+      </w:r>
+    </w:p>
+    <w:p>
+      <w:pPr>
+        <w:pStyle w:val="ListParagraph"/>
+        <w:numPr>
+          <w:ilvl w:val="0"/>
+          <w:numId w:val="3"/>
+        </w:numPr>
+        <w:spacing w:after="60"/>
+      </w:pPr>
+      <w:r>
+        <w:rPr>
+          <w:rFonts w:ascii="Calibri" w:cs="Calibri" w:eastAsia="Calibri" w:hAnsi="Calibri"/>
+          <w:sz w:val="22"/>
+          <w:szCs w:val="22"/>
+        </w:rPr>
+        <w:t xml:space="preserve">We learn from every complaint and every piece of feedback, including praise. We review the Complaints register every 3 months to look for patterns and decide what to change. We note any changes we make.</w:t>
+      </w:r>
+    </w:p>
+    <w:p>
+      <w:pPr>
+        <w:pStyle w:val="ListParagraph"/>
+        <w:numPr>
+          <w:ilvl w:val="0"/>
+          <w:numId w:val="3"/>
+        </w:numPr>
+        <w:spacing w:after="60"/>
+      </w:pPr>
+      <w:r>
+        <w:rPr>
+          <w:rFonts w:ascii="Calibri" w:cs="Calibri" w:eastAsia="Calibri" w:hAnsi="Calibri"/>
+          <w:sz w:val="22"/>
+          <w:szCs w:val="22"/>
+        </w:rPr>
+        <w:t xml:space="preserve">We review this policy every 12 months. At each review we ask participants if our complaints process is easy to find and use, and we make changes based on what they tell us.</w:t>
+      </w:r>
+    </w:p>
+    <w:p>
+      <w:pPr>
+        <w:pStyle w:val="ListParagraph"/>
+        <w:numPr>
+          <w:ilvl w:val="0"/>
+          <w:numId w:val="3"/>
+        </w:numPr>
+        <w:spacing w:after="60"/>
+      </w:pPr>
+      <w:r>
+        <w:rPr>
+          <w:rFonts w:ascii="Calibri" w:cs="Calibri" w:eastAsia="Calibri" w:hAnsi="Calibri"/>
+          <w:sz w:val="22"/>
+          <w:szCs w:val="22"/>
+        </w:rPr>
+        <w:t xml:space="preserve">The owner reads this policy when it is issued and again at each 12-month review, so that we all follow the same steps every time.</w:t>
+      </w:r>
+    </w:p>
+    <w:tbl>
+      <w:tblPr>
+        <w:tblW w:type="dxa" w:w="9000"/>
+        <w:tblBorders>
+          <w:top w:val="single" w:color="auto" w:sz="4"/>
+          <w:left w:val="single" w:color="auto" w:sz="4"/>
+          <w:bottom w:val="single" w:color="auto" w:sz="4"/>
+          <w:right w:val="single" w:color="auto" w:sz="4"/>
+          <w:insideH w:val="single" w:color="auto" w:sz="4"/>
+          <w:insideV w:val="single" w:color="auto" w:sz="4"/>
+        </w:tblBorders>
+      </w:tblPr>
+      <w:tblGrid>
+        <w:gridCol w:w="3000"/>
+        <w:gridCol w:w="3000"/>
+        <w:gridCol w:w="3000"/>
+      </w:tblGrid>
+      <w:tr>
+        <w:trPr>
+          <w:tblHeader/>
+        </w:trPr>
+        <w:tc>
+          <w:tcPr>
+            <w:tcW w:type="dxa" w:w="3000"/>
+            <w:tcBorders>
+              <w:top w:val="single" w:color="999999" w:sz="4"/>
+              <w:left w:val="single" w:color="999999" w:sz="4"/>
+              <w:bottom w:val="single" w:color="999999" w:sz="4"/>
+              <w:right w:val="single" w:color="999999" w:sz="4"/>
+            </w:tcBorders>
+            <w:shd w:fill="EEEEEE" w:val="clear"/>
+          </w:tcPr>
+          <w:p>
+            <w:r>
+              <w:rPr>
+                <w:rFonts w:ascii="Calibri" w:cs="Calibri" w:eastAsia="Calibri" w:hAnsi="Calibri"/>
+                <w:b/>
+                <w:bCs/>
+                <w:sz w:val="22"/>
+                <w:szCs w:val="22"/>
+              </w:rPr>
+              <w:t xml:space="preserve">Role</w:t>
+            </w:r>
+          </w:p>
+        </w:tc>
+        <w:tc>
+          <w:tcPr>
+            <w:tcW w:type="dxa" w:w="3000"/>
+            <w:tcBorders>
+              <w:top w:val="single" w:color="999999" w:sz="4"/>
+              <w:left w:val="single" w:color="999999" w:sz="4"/>
+              <w:bottom w:val="single" w:color="999999" w:sz="4"/>
+              <w:right w:val="single" w:color="999999" w:sz="4"/>
+            </w:tcBorders>
+            <w:shd w:fill="EEEEEE" w:val="clear"/>
+          </w:tcPr>
+          <w:p>
+            <w:r>
+              <w:rPr>
+                <w:rFonts w:ascii="Calibri" w:cs="Calibri" w:eastAsia="Calibri" w:hAnsi="Calibri"/>
+                <w:b/>
+                <w:bCs/>
+                <w:sz w:val="22"/>
+                <w:szCs w:val="22"/>
+              </w:rPr>
+              <w:t xml:space="preserve">Does what</w:t>
+            </w:r>
+          </w:p>
+        </w:tc>
+        <w:tc>
+          <w:tcPr>
+            <w:tcW w:type="dxa" w:w="3000"/>
+            <w:tcBorders>
+              <w:top w:val="single" w:color="999999" w:sz="4"/>
+              <w:left w:val="single" w:color="999999" w:sz="4"/>
+              <w:bottom w:val="single" w:color="999999" w:sz="4"/>
+              <w:right w:val="single" w:color="999999" w:sz="4"/>
+            </w:tcBorders>
+            <w:shd w:fill="EEEEEE" w:val="clear"/>
+          </w:tcPr>
+          <w:p>
+            <w:r>
+              <w:rPr>
+                <w:rFonts w:ascii="Calibri" w:cs="Calibri" w:eastAsia="Calibri" w:hAnsi="Calibri"/>
+                <w:b/>
+                <w:bCs/>
+                <w:sz w:val="22"/>
+                <w:szCs w:val="22"/>
+              </w:rPr>
+              <w:t xml:space="preserve">When</w:t>
+            </w:r>
+          </w:p>
+        </w:tc>
+      </w:tr>
+      <w:tr>
+        <w:tc>
+          <w:tcPr>
+            <w:tcW w:type="dxa" w:w="3000"/>
+            <w:tcBorders>
+              <w:top w:val="single" w:color="999999" w:sz="4"/>
+              <w:left w:val="single" w:color="999999" w:sz="4"/>
+              <w:bottom w:val="single" w:color="999999" w:sz="4"/>
+              <w:right w:val="single" w:color="999999" w:sz="4"/>
+            </w:tcBorders>
+          </w:tcPr>
+          <w:p>
+            <w:r>
+              <w:rPr>
+                <w:rFonts w:ascii="Calibri" w:cs="Calibri" w:eastAsia="Calibri" w:hAnsi="Calibri"/>
+                <w:sz w:val="22"/>
+                <w:szCs w:val="22"/>
+              </w:rPr>
+              <w:t xml:space="preserve">Owner of Sunrise Supports</w:t>
+            </w:r>
+          </w:p>
+        </w:tc>
+        <w:tc>
+          <w:tcPr>
+            <w:tcW w:type="dxa" w:w="3000"/>
+            <w:tcBorders>
+              <w:top w:val="single" w:color="999999" w:sz="4"/>
+              <w:left w:val="single" w:color="999999" w:sz="4"/>
+              <w:bottom w:val="single" w:color="999999" w:sz="4"/>
+              <w:right w:val="single" w:color="999999" w:sz="4"/>
+            </w:tcBorders>
+          </w:tcPr>
+          <w:p>
+            <w:r>
+              <w:rPr>
+                <w:rFonts w:ascii="Calibri" w:cs="Calibri" w:eastAsia="Calibri" w:hAnsi="Calibri"/>
+                <w:sz w:val="22"/>
+                <w:szCs w:val="22"/>
+              </w:rPr>
+              <w:t xml:space="preserve">Gives participants complaint information, receives and records feedback and complaints, investigates, replies and closes each entry</w:t>
+            </w:r>
+          </w:p>
+        </w:tc>
+        <w:tc>
+          <w:tcPr>
+            <w:tcW w:type="dxa" w:w="3000"/>
+            <w:tcBorders>
+              <w:top w:val="single" w:color="999999" w:sz="4"/>
+              <w:left w:val="single" w:color="999999" w:sz="4"/>
+              <w:bottom w:val="single" w:color="999999" w:sz="4"/>
+              <w:right w:val="single" w:color="999999" w:sz="4"/>
+            </w:tcBorders>
+          </w:tcPr>
+          <w:p>
+            <w:r>
+              <w:rPr>
+                <w:rFonts w:ascii="Calibri" w:cs="Calibri" w:eastAsia="Calibri" w:hAnsi="Calibri"/>
+                <w:sz w:val="22"/>
+                <w:szCs w:val="22"/>
+              </w:rPr>
+              <w:t xml:space="preserve">Before supports start, then for every complaint as it arises</w:t>
+            </w:r>
+          </w:p>
+        </w:tc>
+      </w:tr>
+      <w:tr>
+        <w:tc>
+          <w:tcPr>
+            <w:tcW w:type="dxa" w:w="3000"/>
+            <w:tcBorders>
+              <w:top w:val="single" w:color="999999" w:sz="4"/>
+              <w:left w:val="single" w:color="999999" w:sz="4"/>
+              <w:bottom w:val="single" w:color="999999" w:sz="4"/>
+              <w:right w:val="single" w:color="999999" w:sz="4"/>
+            </w:tcBorders>
+          </w:tcPr>
+          <w:p>
+            <w:r>
+              <w:rPr>
+                <w:rFonts w:ascii="Calibri" w:cs="Calibri" w:eastAsia="Calibri" w:hAnsi="Calibri"/>
+                <w:sz w:val="22"/>
+                <w:szCs w:val="22"/>
+              </w:rPr>
+              <w:t xml:space="preserve">Owner of Sunrise Supports</w:t>
+            </w:r>
+          </w:p>
+        </w:tc>
+        <w:tc>
+          <w:tcPr>
+            <w:tcW w:type="dxa" w:w="3000"/>
+            <w:tcBorders>
+              <w:top w:val="single" w:color="999999" w:sz="4"/>
+              <w:left w:val="single" w:color="999999" w:sz="4"/>
+              <w:bottom w:val="single" w:color="999999" w:sz="4"/>
+              <w:right w:val="single" w:color="999999" w:sz="4"/>
+            </w:tcBorders>
+          </w:tcPr>
+          <w:p>
+            <w:r>
+              <w:rPr>
+                <w:rFonts w:ascii="Calibri" w:cs="Calibri" w:eastAsia="Calibri" w:hAnsi="Calibri"/>
+                <w:sz w:val="22"/>
+                <w:szCs w:val="22"/>
+              </w:rPr>
+              <w:t xml:space="preserve">Reviews the Complaints register for patterns and makes improvements</w:t>
+            </w:r>
+          </w:p>
+        </w:tc>
+        <w:tc>
+          <w:tcPr>
+            <w:tcW w:type="dxa" w:w="3000"/>
+            <w:tcBorders>
+              <w:top w:val="single" w:color="999999" w:sz="4"/>
+              <w:left w:val="single" w:color="999999" w:sz="4"/>
+              <w:bottom w:val="single" w:color="999999" w:sz="4"/>
+              <w:right w:val="single" w:color="999999" w:sz="4"/>
+            </w:tcBorders>
+          </w:tcPr>
+          <w:p>
+            <w:r>
+              <w:rPr>
+                <w:rFonts w:ascii="Calibri" w:cs="Calibri" w:eastAsia="Calibri" w:hAnsi="Calibri"/>
+                <w:sz w:val="22"/>
+                <w:szCs w:val="22"/>
+              </w:rPr>
+              <w:t xml:space="preserve">Every 3 months</w:t>
+            </w:r>
+          </w:p>
+        </w:tc>
+      </w:tr>
+      <w:tr>
+        <w:tc>
+          <w:tcPr>
+            <w:tcW w:type="dxa" w:w="3000"/>
+            <w:tcBorders>
+              <w:top w:val="single" w:color="999999" w:sz="4"/>
+              <w:left w:val="single" w:color="999999" w:sz="4"/>
+              <w:bottom w:val="single" w:color="999999" w:sz="4"/>
+              <w:right w:val="single" w:color="999999" w:sz="4"/>
+            </w:tcBorders>
+          </w:tcPr>
+          <w:p>
+            <w:r>
+              <w:rPr>
+                <w:rFonts w:ascii="Calibri" w:cs="Calibri" w:eastAsia="Calibri" w:hAnsi="Calibri"/>
+                <w:sz w:val="22"/>
+                <w:szCs w:val="22"/>
+              </w:rPr>
+              <w:t xml:space="preserve">Owner of Sunrise Supports</w:t>
+            </w:r>
+          </w:p>
+        </w:tc>
+        <w:tc>
+          <w:tcPr>
+            <w:tcW w:type="dxa" w:w="3000"/>
+            <w:tcBorders>
+              <w:top w:val="single" w:color="999999" w:sz="4"/>
+              <w:left w:val="single" w:color="999999" w:sz="4"/>
+              <w:bottom w:val="single" w:color="999999" w:sz="4"/>
+              <w:right w:val="single" w:color="999999" w:sz="4"/>
+            </w:tcBorders>
+          </w:tcPr>
+          <w:p>
+            <w:r>
+              <w:rPr>
+                <w:rFonts w:ascii="Calibri" w:cs="Calibri" w:eastAsia="Calibri" w:hAnsi="Calibri"/>
+                <w:sz w:val="22"/>
+                <w:szCs w:val="22"/>
+              </w:rPr>
+              <w:t xml:space="preserve">Reviews this policy and asks participants about accessibility</w:t>
+            </w:r>
+          </w:p>
+        </w:tc>
+        <w:tc>
+          <w:tcPr>
+            <w:tcW w:type="dxa" w:w="3000"/>
+            <w:tcBorders>
+              <w:top w:val="single" w:color="999999" w:sz="4"/>
+              <w:left w:val="single" w:color="999999" w:sz="4"/>
+              <w:bottom w:val="single" w:color="999999" w:sz="4"/>
+              <w:right w:val="single" w:color="999999" w:sz="4"/>
+            </w:tcBorders>
+          </w:tcPr>
+          <w:p>
+            <w:r>
+              <w:rPr>
+                <w:rFonts w:ascii="Calibri" w:cs="Calibri" w:eastAsia="Calibri" w:hAnsi="Calibri"/>
+                <w:sz w:val="22"/>
+                <w:szCs w:val="22"/>
+              </w:rPr>
+              <w:t xml:space="preserve">Every 12 months</w:t>
+            </w:r>
+          </w:p>
+        </w:tc>
+      </w:tr>
+    </w:tbl>
+    <w:p>
+      <w:pPr>
+        <w:spacing w:after="120"/>
+      </w:pPr>
+      <w:r>
+        <w:rPr>
+          <w:rFonts w:ascii="Calibri" w:cs="Calibri" w:eastAsia="Calibri" w:hAnsi="Calibri"/>
+          <w:sz w:val="22"/>
+          <w:szCs w:val="22"/>
+        </w:rPr>
+        <w:t xml:space="preserve"/>
+      </w:r>
+    </w:p>
     <w:tbl>
       <w:tblPr>
         <w:tblW w:type="dxa" w:w="9000"/>
@@ -949,7 +2019,7 @@
                 <w:sz w:val="22"/>
                 <w:szCs w:val="22"/>
               </w:rPr>
-              <w:t xml:space="preserve">Review and complete: this section could not be drafted automatically.</w:t>
+              <w:t xml:space="preserve">[Provider to complete: the phone number, email address and postal address where participants can send feedback or complaints to Sunrise Supports.]</w:t>
             </w:r>
           </w:p>
         </w:tc>
@@ -966,6 +2036,479 @@
           <w:szCs w:val="22"/>
         </w:rPr>
         <w:t xml:space="preserve"/>
+      </w:r>
+    </w:p>
+    <w:p>
+      <w:pPr>
+        <w:pStyle w:val="Heading1"/>
+        <w:spacing w:after="120" w:before="240"/>
+      </w:pPr>
+      <w:r>
+        <w:rPr>
+          <w:rFonts w:ascii="Calibri" w:cs="Calibri" w:eastAsia="Calibri" w:hAnsi="Calibri"/>
+          <w:b/>
+          <w:bCs/>
+        </w:rPr>
+        <w:t xml:space="preserve">6 Responsibilities</w:t>
+      </w:r>
+    </w:p>
+    <w:p>
+      <w:pPr>
+        <w:spacing w:after="120"/>
+      </w:pPr>
+      <w:r>
+        <w:rPr>
+          <w:rFonts w:ascii="Calibri" w:cs="Calibri" w:eastAsia="Calibri" w:hAnsi="Calibri"/>
+          <w:sz w:val="22"/>
+          <w:szCs w:val="22"/>
+        </w:rPr>
+        <w:t xml:space="preserve">Sunrise Supports is a sole trader business. We have one worker, who is also our only key person. This means one person holds every role in our complaints system. The table below shows what each role does and when.</w:t>
+      </w:r>
+    </w:p>
+    <w:tbl>
+      <w:tblPr>
+        <w:tblW w:type="dxa" w:w="9000"/>
+        <w:tblBorders>
+          <w:top w:val="single" w:color="auto" w:sz="4"/>
+          <w:left w:val="single" w:color="auto" w:sz="4"/>
+          <w:bottom w:val="single" w:color="auto" w:sz="4"/>
+          <w:right w:val="single" w:color="auto" w:sz="4"/>
+          <w:insideH w:val="single" w:color="auto" w:sz="4"/>
+          <w:insideV w:val="single" w:color="auto" w:sz="4"/>
+        </w:tblBorders>
+      </w:tblPr>
+      <w:tblGrid>
+        <w:gridCol w:w="3000"/>
+        <w:gridCol w:w="3000"/>
+        <w:gridCol w:w="3000"/>
+      </w:tblGrid>
+      <w:tr>
+        <w:trPr>
+          <w:tblHeader/>
+        </w:trPr>
+        <w:tc>
+          <w:tcPr>
+            <w:tcW w:type="dxa" w:w="3000"/>
+            <w:tcBorders>
+              <w:top w:val="single" w:color="999999" w:sz="4"/>
+              <w:left w:val="single" w:color="999999" w:sz="4"/>
+              <w:bottom w:val="single" w:color="999999" w:sz="4"/>
+              <w:right w:val="single" w:color="999999" w:sz="4"/>
+            </w:tcBorders>
+            <w:shd w:fill="EEEEEE" w:val="clear"/>
+          </w:tcPr>
+          <w:p>
+            <w:r>
+              <w:rPr>
+                <w:rFonts w:ascii="Calibri" w:cs="Calibri" w:eastAsia="Calibri" w:hAnsi="Calibri"/>
+                <w:b/>
+                <w:bCs/>
+                <w:sz w:val="22"/>
+                <w:szCs w:val="22"/>
+              </w:rPr>
+              <w:t xml:space="preserve">Role</w:t>
+            </w:r>
+          </w:p>
+        </w:tc>
+        <w:tc>
+          <w:tcPr>
+            <w:tcW w:type="dxa" w:w="3000"/>
+            <w:tcBorders>
+              <w:top w:val="single" w:color="999999" w:sz="4"/>
+              <w:left w:val="single" w:color="999999" w:sz="4"/>
+              <w:bottom w:val="single" w:color="999999" w:sz="4"/>
+              <w:right w:val="single" w:color="999999" w:sz="4"/>
+            </w:tcBorders>
+            <w:shd w:fill="EEEEEE" w:val="clear"/>
+          </w:tcPr>
+          <w:p>
+            <w:r>
+              <w:rPr>
+                <w:rFonts w:ascii="Calibri" w:cs="Calibri" w:eastAsia="Calibri" w:hAnsi="Calibri"/>
+                <w:b/>
+                <w:bCs/>
+                <w:sz w:val="22"/>
+                <w:szCs w:val="22"/>
+              </w:rPr>
+              <w:t xml:space="preserve">Does what</w:t>
+            </w:r>
+          </w:p>
+        </w:tc>
+        <w:tc>
+          <w:tcPr>
+            <w:tcW w:type="dxa" w:w="3000"/>
+            <w:tcBorders>
+              <w:top w:val="single" w:color="999999" w:sz="4"/>
+              <w:left w:val="single" w:color="999999" w:sz="4"/>
+              <w:bottom w:val="single" w:color="999999" w:sz="4"/>
+              <w:right w:val="single" w:color="999999" w:sz="4"/>
+            </w:tcBorders>
+            <w:shd w:fill="EEEEEE" w:val="clear"/>
+          </w:tcPr>
+          <w:p>
+            <w:r>
+              <w:rPr>
+                <w:rFonts w:ascii="Calibri" w:cs="Calibri" w:eastAsia="Calibri" w:hAnsi="Calibri"/>
+                <w:b/>
+                <w:bCs/>
+                <w:sz w:val="22"/>
+                <w:szCs w:val="22"/>
+              </w:rPr>
+              <w:t xml:space="preserve">When</w:t>
+            </w:r>
+          </w:p>
+        </w:tc>
+      </w:tr>
+      <w:tr>
+        <w:tc>
+          <w:tcPr>
+            <w:tcW w:type="dxa" w:w="3000"/>
+            <w:tcBorders>
+              <w:top w:val="single" w:color="999999" w:sz="4"/>
+              <w:left w:val="single" w:color="999999" w:sz="4"/>
+              <w:bottom w:val="single" w:color="999999" w:sz="4"/>
+              <w:right w:val="single" w:color="999999" w:sz="4"/>
+            </w:tcBorders>
+          </w:tcPr>
+          <w:p>
+            <w:r>
+              <w:rPr>
+                <w:rFonts w:ascii="Calibri" w:cs="Calibri" w:eastAsia="Calibri" w:hAnsi="Calibri"/>
+                <w:sz w:val="22"/>
+                <w:szCs w:val="22"/>
+              </w:rPr>
+              <w:t xml:space="preserve">Owner and worker (Sunrise Supports)</w:t>
+            </w:r>
+          </w:p>
+        </w:tc>
+        <w:tc>
+          <w:tcPr>
+            <w:tcW w:type="dxa" w:w="3000"/>
+            <w:tcBorders>
+              <w:top w:val="single" w:color="999999" w:sz="4"/>
+              <w:left w:val="single" w:color="999999" w:sz="4"/>
+              <w:bottom w:val="single" w:color="999999" w:sz="4"/>
+              <w:right w:val="single" w:color="999999" w:sz="4"/>
+            </w:tcBorders>
+          </w:tcPr>
+          <w:p>
+            <w:r>
+              <w:rPr>
+                <w:rFonts w:ascii="Calibri" w:cs="Calibri" w:eastAsia="Calibri" w:hAnsi="Calibri"/>
+                <w:sz w:val="22"/>
+                <w:szCs w:val="22"/>
+              </w:rPr>
+              <w:t xml:space="preserve">Welcomes and acknowledges all feedback and complaints. Resolves them fairly, listens to all sides, and records each one in the Complaints register.</w:t>
+            </w:r>
+          </w:p>
+        </w:tc>
+        <w:tc>
+          <w:tcPr>
+            <w:tcW w:type="dxa" w:w="3000"/>
+            <w:tcBorders>
+              <w:top w:val="single" w:color="999999" w:sz="4"/>
+              <w:left w:val="single" w:color="999999" w:sz="4"/>
+              <w:bottom w:val="single" w:color="999999" w:sz="4"/>
+              <w:right w:val="single" w:color="999999" w:sz="4"/>
+            </w:tcBorders>
+          </w:tcPr>
+          <w:p>
+            <w:r>
+              <w:rPr>
+                <w:rFonts w:ascii="Calibri" w:cs="Calibri" w:eastAsia="Calibri" w:hAnsi="Calibri"/>
+                <w:sz w:val="22"/>
+                <w:szCs w:val="22"/>
+              </w:rPr>
+              <w:t xml:space="preserve">Each time feedback or a complaint is received. Timeframes are in section 3 What we do.</w:t>
+            </w:r>
+          </w:p>
+        </w:tc>
+      </w:tr>
+      <w:tr>
+        <w:tc>
+          <w:tcPr>
+            <w:tcW w:type="dxa" w:w="3000"/>
+            <w:tcBorders>
+              <w:top w:val="single" w:color="999999" w:sz="4"/>
+              <w:left w:val="single" w:color="999999" w:sz="4"/>
+              <w:bottom w:val="single" w:color="999999" w:sz="4"/>
+              <w:right w:val="single" w:color="999999" w:sz="4"/>
+            </w:tcBorders>
+          </w:tcPr>
+          <w:p>
+            <w:r>
+              <w:rPr>
+                <w:rFonts w:ascii="Calibri" w:cs="Calibri" w:eastAsia="Calibri" w:hAnsi="Calibri"/>
+                <w:sz w:val="22"/>
+                <w:szCs w:val="22"/>
+              </w:rPr>
+              <w:t xml:space="preserve">Owner and worker (Sunrise Supports)</w:t>
+            </w:r>
+          </w:p>
+        </w:tc>
+        <w:tc>
+          <w:tcPr>
+            <w:tcW w:type="dxa" w:w="3000"/>
+            <w:tcBorders>
+              <w:top w:val="single" w:color="999999" w:sz="4"/>
+              <w:left w:val="single" w:color="999999" w:sz="4"/>
+              <w:bottom w:val="single" w:color="999999" w:sz="4"/>
+              <w:right w:val="single" w:color="999999" w:sz="4"/>
+            </w:tcBorders>
+          </w:tcPr>
+          <w:p>
+            <w:r>
+              <w:rPr>
+                <w:rFonts w:ascii="Calibri" w:cs="Calibri" w:eastAsia="Calibri" w:hAnsi="Calibri"/>
+                <w:sz w:val="22"/>
+                <w:szCs w:val="22"/>
+              </w:rPr>
+              <w:t xml:space="preserve">Tells each participant how to give feedback or make a complaint. This includes ways to complain outside Sunrise Supports and the right to use an advocate.</w:t>
+            </w:r>
+          </w:p>
+        </w:tc>
+        <w:tc>
+          <w:tcPr>
+            <w:tcW w:type="dxa" w:w="3000"/>
+            <w:tcBorders>
+              <w:top w:val="single" w:color="999999" w:sz="4"/>
+              <w:left w:val="single" w:color="999999" w:sz="4"/>
+              <w:bottom w:val="single" w:color="999999" w:sz="4"/>
+              <w:right w:val="single" w:color="999999" w:sz="4"/>
+            </w:tcBorders>
+          </w:tcPr>
+          <w:p>
+            <w:r>
+              <w:rPr>
+                <w:rFonts w:ascii="Calibri" w:cs="Calibri" w:eastAsia="Calibri" w:hAnsi="Calibri"/>
+                <w:sz w:val="22"/>
+                <w:szCs w:val="22"/>
+              </w:rPr>
+              <w:t xml:space="preserve">Before we start supports, and again whenever a participant asks.</w:t>
+            </w:r>
+          </w:p>
+        </w:tc>
+      </w:tr>
+      <w:tr>
+        <w:tc>
+          <w:tcPr>
+            <w:tcW w:type="dxa" w:w="3000"/>
+            <w:tcBorders>
+              <w:top w:val="single" w:color="999999" w:sz="4"/>
+              <w:left w:val="single" w:color="999999" w:sz="4"/>
+              <w:bottom w:val="single" w:color="999999" w:sz="4"/>
+              <w:right w:val="single" w:color="999999" w:sz="4"/>
+            </w:tcBorders>
+          </w:tcPr>
+          <w:p>
+            <w:r>
+              <w:rPr>
+                <w:rFonts w:ascii="Calibri" w:cs="Calibri" w:eastAsia="Calibri" w:hAnsi="Calibri"/>
+                <w:sz w:val="22"/>
+                <w:szCs w:val="22"/>
+              </w:rPr>
+              <w:t xml:space="preserve">Owner and worker (Sunrise Supports)</w:t>
+            </w:r>
+          </w:p>
+        </w:tc>
+        <w:tc>
+          <w:tcPr>
+            <w:tcW w:type="dxa" w:w="3000"/>
+            <w:tcBorders>
+              <w:top w:val="single" w:color="999999" w:sz="4"/>
+              <w:left w:val="single" w:color="999999" w:sz="4"/>
+              <w:bottom w:val="single" w:color="999999" w:sz="4"/>
+              <w:right w:val="single" w:color="999999" w:sz="4"/>
+            </w:tcBorders>
+          </w:tcPr>
+          <w:p>
+            <w:r>
+              <w:rPr>
+                <w:rFonts w:ascii="Calibri" w:cs="Calibri" w:eastAsia="Calibri" w:hAnsi="Calibri"/>
+                <w:sz w:val="22"/>
+                <w:szCs w:val="22"/>
+              </w:rPr>
+              <w:t xml:space="preserve">Reviews the Complaints register. Looks for patterns and records any changes we make to our work.</w:t>
+            </w:r>
+          </w:p>
+        </w:tc>
+        <w:tc>
+          <w:tcPr>
+            <w:tcW w:type="dxa" w:w="3000"/>
+            <w:tcBorders>
+              <w:top w:val="single" w:color="999999" w:sz="4"/>
+              <w:left w:val="single" w:color="999999" w:sz="4"/>
+              <w:bottom w:val="single" w:color="999999" w:sz="4"/>
+              <w:right w:val="single" w:color="999999" w:sz="4"/>
+            </w:tcBorders>
+          </w:tcPr>
+          <w:p>
+            <w:r>
+              <w:rPr>
+                <w:rFonts w:ascii="Calibri" w:cs="Calibri" w:eastAsia="Calibri" w:hAnsi="Calibri"/>
+                <w:sz w:val="22"/>
+                <w:szCs w:val="22"/>
+              </w:rPr>
+              <w:t xml:space="preserve">Every 3 months.</w:t>
+            </w:r>
+          </w:p>
+        </w:tc>
+      </w:tr>
+      <w:tr>
+        <w:tc>
+          <w:tcPr>
+            <w:tcW w:type="dxa" w:w="3000"/>
+            <w:tcBorders>
+              <w:top w:val="single" w:color="999999" w:sz="4"/>
+              <w:left w:val="single" w:color="999999" w:sz="4"/>
+              <w:bottom w:val="single" w:color="999999" w:sz="4"/>
+              <w:right w:val="single" w:color="999999" w:sz="4"/>
+            </w:tcBorders>
+          </w:tcPr>
+          <w:p>
+            <w:r>
+              <w:rPr>
+                <w:rFonts w:ascii="Calibri" w:cs="Calibri" w:eastAsia="Calibri" w:hAnsi="Calibri"/>
+                <w:sz w:val="22"/>
+                <w:szCs w:val="22"/>
+              </w:rPr>
+              <w:t xml:space="preserve">Owner and worker (Sunrise Supports)</w:t>
+            </w:r>
+          </w:p>
+        </w:tc>
+        <w:tc>
+          <w:tcPr>
+            <w:tcW w:type="dxa" w:w="3000"/>
+            <w:tcBorders>
+              <w:top w:val="single" w:color="999999" w:sz="4"/>
+              <w:left w:val="single" w:color="999999" w:sz="4"/>
+              <w:bottom w:val="single" w:color="999999" w:sz="4"/>
+              <w:right w:val="single" w:color="999999" w:sz="4"/>
+            </w:tcBorders>
+          </w:tcPr>
+          <w:p>
+            <w:r>
+              <w:rPr>
+                <w:rFonts w:ascii="Calibri" w:cs="Calibri" w:eastAsia="Calibri" w:hAnsi="Calibri"/>
+                <w:sz w:val="22"/>
+                <w:szCs w:val="22"/>
+              </w:rPr>
+              <w:t xml:space="preserve">Reviews this policy and procedure. Asks participants how easy our complaints process is to use and updates the document.</w:t>
+            </w:r>
+          </w:p>
+        </w:tc>
+        <w:tc>
+          <w:tcPr>
+            <w:tcW w:type="dxa" w:w="3000"/>
+            <w:tcBorders>
+              <w:top w:val="single" w:color="999999" w:sz="4"/>
+              <w:left w:val="single" w:color="999999" w:sz="4"/>
+              <w:bottom w:val="single" w:color="999999" w:sz="4"/>
+              <w:right w:val="single" w:color="999999" w:sz="4"/>
+            </w:tcBorders>
+          </w:tcPr>
+          <w:p>
+            <w:r>
+              <w:rPr>
+                <w:rFonts w:ascii="Calibri" w:cs="Calibri" w:eastAsia="Calibri" w:hAnsi="Calibri"/>
+                <w:sz w:val="22"/>
+                <w:szCs w:val="22"/>
+              </w:rPr>
+              <w:t xml:space="preserve">Every 12 months.</w:t>
+            </w:r>
+          </w:p>
+        </w:tc>
+      </w:tr>
+      <w:tr>
+        <w:tc>
+          <w:tcPr>
+            <w:tcW w:type="dxa" w:w="3000"/>
+            <w:tcBorders>
+              <w:top w:val="single" w:color="999999" w:sz="4"/>
+              <w:left w:val="single" w:color="999999" w:sz="4"/>
+              <w:bottom w:val="single" w:color="999999" w:sz="4"/>
+              <w:right w:val="single" w:color="999999" w:sz="4"/>
+            </w:tcBorders>
+          </w:tcPr>
+          <w:p>
+            <w:r>
+              <w:rPr>
+                <w:rFonts w:ascii="Calibri" w:cs="Calibri" w:eastAsia="Calibri" w:hAnsi="Calibri"/>
+                <w:sz w:val="22"/>
+                <w:szCs w:val="22"/>
+              </w:rPr>
+              <w:t xml:space="preserve">Participants and other people</w:t>
+            </w:r>
+          </w:p>
+        </w:tc>
+        <w:tc>
+          <w:tcPr>
+            <w:tcW w:type="dxa" w:w="3000"/>
+            <w:tcBorders>
+              <w:top w:val="single" w:color="999999" w:sz="4"/>
+              <w:left w:val="single" w:color="999999" w:sz="4"/>
+              <w:bottom w:val="single" w:color="999999" w:sz="4"/>
+              <w:right w:val="single" w:color="999999" w:sz="4"/>
+            </w:tcBorders>
+          </w:tcPr>
+          <w:p>
+            <w:r>
+              <w:rPr>
+                <w:rFonts w:ascii="Calibri" w:cs="Calibri" w:eastAsia="Calibri" w:hAnsi="Calibri"/>
+                <w:sz w:val="22"/>
+                <w:szCs w:val="22"/>
+              </w:rPr>
+              <w:t xml:space="preserve">Give feedback or make a complaint in any way that suits them. They may bring a family member, friend or advocate to support them.</w:t>
+            </w:r>
+          </w:p>
+        </w:tc>
+        <w:tc>
+          <w:tcPr>
+            <w:tcW w:type="dxa" w:w="3000"/>
+            <w:tcBorders>
+              <w:top w:val="single" w:color="999999" w:sz="4"/>
+              <w:left w:val="single" w:color="999999" w:sz="4"/>
+              <w:bottom w:val="single" w:color="999999" w:sz="4"/>
+              <w:right w:val="single" w:color="999999" w:sz="4"/>
+            </w:tcBorders>
+          </w:tcPr>
+          <w:p>
+            <w:r>
+              <w:rPr>
+                <w:rFonts w:ascii="Calibri" w:cs="Calibri" w:eastAsia="Calibri" w:hAnsi="Calibri"/>
+                <w:sz w:val="22"/>
+                <w:szCs w:val="22"/>
+              </w:rPr>
+              <w:t xml:space="preserve">At any time.</w:t>
+            </w:r>
+          </w:p>
+        </w:tc>
+      </w:tr>
+    </w:tbl>
+    <w:p>
+      <w:pPr>
+        <w:spacing w:after="120"/>
+      </w:pPr>
+      <w:r>
+        <w:rPr>
+          <w:rFonts w:ascii="Calibri" w:cs="Calibri" w:eastAsia="Calibri" w:hAnsi="Calibri"/>
+          <w:sz w:val="22"/>
+          <w:szCs w:val="22"/>
+        </w:rPr>
+        <w:t xml:space="preserve"/>
+      </w:r>
+    </w:p>
+    <w:p>
+      <w:pPr>
+        <w:spacing w:after="120"/>
+      </w:pPr>
+      <w:r>
+        <w:rPr>
+          <w:rFonts w:ascii="Calibri" w:cs="Calibri" w:eastAsia="Calibri" w:hAnsi="Calibri"/>
+          <w:sz w:val="22"/>
+          <w:szCs w:val="22"/>
+        </w:rPr>
+        <w:t xml:space="preserve">If a complaint is about us, we still record it in the Complaints register and acknowledge it. We also tell the person they can take it to someone outside Sunrise Supports, including the Commission. The steps for this are in section 3 What we do.</w:t>
       </w:r>
     </w:p>
     <w:tbl>
@@ -1004,7 +2547,7 @@
                 <w:sz w:val="22"/>
                 <w:szCs w:val="22"/>
               </w:rPr>
-              <w:t xml:space="preserve">[Provider to complete: Policy statement. The commitments, each tied to the quality indicators listed for this document, in the provider's voice.]</w:t>
+              <w:t xml:space="preserve">[Provider to complete: name an independent person, such as a trusted colleague or adviser, who can review a complaint about the owner, or write that none is available.]</w:t>
             </w:r>
           </w:p>
         </w:tc>
@@ -1025,6 +2568,19 @@
     </w:p>
     <w:p>
       <w:pPr>
+        <w:spacing w:after="120"/>
+      </w:pPr>
+      <w:r>
+        <w:rPr>
+          <w:rFonts w:ascii="Calibri" w:cs="Calibri" w:eastAsia="Calibri" w:hAnsi="Calibri"/>
+          <w:sz w:val="22"/>
+          <w:szCs w:val="22"/>
+        </w:rPr>
+        <w:t xml:space="preserve">If we start to engage other workers, we will update this table before they begin work. We will also train them in these procedures before they handle any feedback or complaint.</w:t>
+      </w:r>
+    </w:p>
+    <w:p>
+      <w:pPr>
         <w:pStyle w:val="Heading1"/>
         <w:spacing w:after="120" w:before="240"/>
       </w:pPr>
@@ -1034,7 +2590,683 @@
           <w:b/>
           <w:bCs/>
         </w:rPr>
-        <w:t xml:space="preserve">5 How we put this into practice</w:t>
+        <w:t xml:space="preserve">7 Complaints procedure</w:t>
+      </w:r>
+    </w:p>
+    <w:p>
+      <w:pPr>
+        <w:spacing w:after="120"/>
+      </w:pPr>
+      <w:r>
+        <w:rPr>
+          <w:rFonts w:ascii="Calibri" w:cs="Calibri" w:eastAsia="Calibri" w:hAnsi="Calibri"/>
+          <w:sz w:val="22"/>
+          <w:szCs w:val="22"/>
+        </w:rPr>
+        <w:t xml:space="preserve">Sunrise Supports is run by one person. We receive, record and resolve complaints ourselves. Anyone can complain: a participant, a family member, an advocate or another person. We welcome feedback as well as complaints. We treat both with respect.</w:t>
+      </w:r>
+    </w:p>
+    <w:p>
+      <w:pPr>
+        <w:pStyle w:val="ListParagraph"/>
+        <w:numPr>
+          <w:ilvl w:val="0"/>
+          <w:numId w:val="4"/>
+        </w:numPr>
+        <w:spacing w:after="60"/>
+      </w:pPr>
+      <w:r>
+        <w:rPr>
+          <w:rFonts w:ascii="Calibri" w:cs="Calibri" w:eastAsia="Calibri" w:hAnsi="Calibri"/>
+          <w:sz w:val="22"/>
+          <w:szCs w:val="22"/>
+        </w:rPr>
+        <w:t xml:space="preserve">Receive. A person can tell us in any way that suits them: by phone, in writing, in person or through an advocate. They do not need to use a form or a special word. We listen and do not ask them to justify why they are unhappy.</w:t>
+      </w:r>
+    </w:p>
+    <w:p>
+      <w:pPr>
+        <w:pStyle w:val="ListParagraph"/>
+        <w:numPr>
+          <w:ilvl w:val="0"/>
+          <w:numId w:val="4"/>
+        </w:numPr>
+        <w:spacing w:after="60"/>
+      </w:pPr>
+      <w:r>
+        <w:rPr>
+          <w:rFonts w:ascii="Calibri" w:cs="Calibri" w:eastAsia="Calibri" w:hAnsi="Calibri"/>
+          <w:sz w:val="22"/>
+          <w:szCs w:val="22"/>
+        </w:rPr>
+        <w:t xml:space="preserve">Record. We write the complaint in the Complaints register on the day we receive it. We use a reference number, not the participant's personal details, in any text we share.</w:t>
+      </w:r>
+    </w:p>
+    <w:p>
+      <w:pPr>
+        <w:pStyle w:val="ListParagraph"/>
+        <w:numPr>
+          <w:ilvl w:val="0"/>
+          <w:numId w:val="4"/>
+        </w:numPr>
+        <w:spacing w:after="60"/>
+      </w:pPr>
+      <w:r>
+        <w:rPr>
+          <w:rFonts w:ascii="Calibri" w:cs="Calibri" w:eastAsia="Calibri" w:hAnsi="Calibri"/>
+          <w:sz w:val="22"/>
+          <w:szCs w:val="22"/>
+        </w:rPr>
+        <w:t xml:space="preserve">Acknowledge. We tell the person we have received the complaint and who is dealing with it. We use the timeframe set out in the Commission's complaints rules (see the section of this document that holds those rules).</w:t>
+      </w:r>
+    </w:p>
+    <w:p>
+      <w:pPr>
+        <w:pStyle w:val="ListParagraph"/>
+        <w:numPr>
+          <w:ilvl w:val="0"/>
+          <w:numId w:val="4"/>
+        </w:numPr>
+        <w:spacing w:after="60"/>
+      </w:pPr>
+      <w:r>
+        <w:rPr>
+          <w:rFonts w:ascii="Calibri" w:cs="Calibri" w:eastAsia="Calibri" w:hAnsi="Calibri"/>
+          <w:sz w:val="22"/>
+          <w:szCs w:val="22"/>
+        </w:rPr>
+        <w:t xml:space="preserve">Check for incidents. If the complaint describes an injury, abuse, neglect or another event that may be reportable, we handle it under our incident process as well (see the Reportable incidents section).</w:t>
+      </w:r>
+    </w:p>
+    <w:p>
+      <w:pPr>
+        <w:pStyle w:val="ListParagraph"/>
+        <w:numPr>
+          <w:ilvl w:val="0"/>
+          <w:numId w:val="4"/>
+        </w:numPr>
+        <w:spacing w:after="60"/>
+      </w:pPr>
+      <w:r>
+        <w:rPr>
+          <w:rFonts w:ascii="Calibri" w:cs="Calibri" w:eastAsia="Calibri" w:hAnsi="Calibri"/>
+          <w:sz w:val="22"/>
+          <w:szCs w:val="22"/>
+        </w:rPr>
+        <w:t xml:space="preserve">Look into it. We gather the facts, hear the person's account and give them the chance to respond to what we find. We act fairly and do not decide before we have the facts.</w:t>
+      </w:r>
+    </w:p>
+    <w:p>
+      <w:pPr>
+        <w:pStyle w:val="ListParagraph"/>
+        <w:numPr>
+          <w:ilvl w:val="0"/>
+          <w:numId w:val="4"/>
+        </w:numPr>
+        <w:spacing w:after="60"/>
+      </w:pPr>
+      <w:r>
+        <w:rPr>
+          <w:rFonts w:ascii="Calibri" w:cs="Calibri" w:eastAsia="Calibri" w:hAnsi="Calibri"/>
+          <w:sz w:val="22"/>
+          <w:szCs w:val="22"/>
+        </w:rPr>
+        <w:t xml:space="preserve">Resolve and tell the person. We explain what we found, what we will do and why. We tell them they can ask for a review or take the matter to the Commission.</w:t>
+      </w:r>
+    </w:p>
+    <w:p>
+      <w:pPr>
+        <w:pStyle w:val="ListParagraph"/>
+        <w:numPr>
+          <w:ilvl w:val="0"/>
+          <w:numId w:val="4"/>
+        </w:numPr>
+        <w:spacing w:after="60"/>
+      </w:pPr>
+      <w:r>
+        <w:rPr>
+          <w:rFonts w:ascii="Calibri" w:cs="Calibri" w:eastAsia="Calibri" w:hAnsi="Calibri"/>
+          <w:sz w:val="22"/>
+          <w:szCs w:val="22"/>
+        </w:rPr>
+        <w:t xml:space="preserve">Close and learn. We record the outcome and actions in the Complaints register. We ask the person if they are satisfied. We use the result to improve our supports and this procedure.</w:t>
+      </w:r>
+    </w:p>
+    <w:tbl>
+      <w:tblPr>
+        <w:tblW w:type="dxa" w:w="9000"/>
+        <w:tblBorders>
+          <w:top w:val="single" w:color="auto" w:sz="4"/>
+          <w:left w:val="single" w:color="auto" w:sz="4"/>
+          <w:bottom w:val="single" w:color="auto" w:sz="4"/>
+          <w:right w:val="single" w:color="auto" w:sz="4"/>
+          <w:insideH w:val="single" w:color="auto" w:sz="4"/>
+          <w:insideV w:val="single" w:color="auto" w:sz="4"/>
+        </w:tblBorders>
+      </w:tblPr>
+      <w:tblGrid>
+        <w:gridCol w:w="3000"/>
+        <w:gridCol w:w="3000"/>
+        <w:gridCol w:w="3000"/>
+      </w:tblGrid>
+      <w:tr>
+        <w:trPr>
+          <w:tblHeader/>
+        </w:trPr>
+        <w:tc>
+          <w:tcPr>
+            <w:tcW w:type="dxa" w:w="3000"/>
+            <w:tcBorders>
+              <w:top w:val="single" w:color="999999" w:sz="4"/>
+              <w:left w:val="single" w:color="999999" w:sz="4"/>
+              <w:bottom w:val="single" w:color="999999" w:sz="4"/>
+              <w:right w:val="single" w:color="999999" w:sz="4"/>
+            </w:tcBorders>
+            <w:shd w:fill="EEEEEE" w:val="clear"/>
+          </w:tcPr>
+          <w:p>
+            <w:r>
+              <w:rPr>
+                <w:rFonts w:ascii="Calibri" w:cs="Calibri" w:eastAsia="Calibri" w:hAnsi="Calibri"/>
+                <w:b/>
+                <w:bCs/>
+                <w:sz w:val="22"/>
+                <w:szCs w:val="22"/>
+              </w:rPr>
+              <w:t xml:space="preserve">Step</w:t>
+            </w:r>
+          </w:p>
+        </w:tc>
+        <w:tc>
+          <w:tcPr>
+            <w:tcW w:type="dxa" w:w="3000"/>
+            <w:tcBorders>
+              <w:top w:val="single" w:color="999999" w:sz="4"/>
+              <w:left w:val="single" w:color="999999" w:sz="4"/>
+              <w:bottom w:val="single" w:color="999999" w:sz="4"/>
+              <w:right w:val="single" w:color="999999" w:sz="4"/>
+            </w:tcBorders>
+            <w:shd w:fill="EEEEEE" w:val="clear"/>
+          </w:tcPr>
+          <w:p>
+            <w:r>
+              <w:rPr>
+                <w:rFonts w:ascii="Calibri" w:cs="Calibri" w:eastAsia="Calibri" w:hAnsi="Calibri"/>
+                <w:b/>
+                <w:bCs/>
+                <w:sz w:val="22"/>
+                <w:szCs w:val="22"/>
+              </w:rPr>
+              <w:t xml:space="preserve">Who</w:t>
+            </w:r>
+          </w:p>
+        </w:tc>
+        <w:tc>
+          <w:tcPr>
+            <w:tcW w:type="dxa" w:w="3000"/>
+            <w:tcBorders>
+              <w:top w:val="single" w:color="999999" w:sz="4"/>
+              <w:left w:val="single" w:color="999999" w:sz="4"/>
+              <w:bottom w:val="single" w:color="999999" w:sz="4"/>
+              <w:right w:val="single" w:color="999999" w:sz="4"/>
+            </w:tcBorders>
+            <w:shd w:fill="EEEEEE" w:val="clear"/>
+          </w:tcPr>
+          <w:p>
+            <w:r>
+              <w:rPr>
+                <w:rFonts w:ascii="Calibri" w:cs="Calibri" w:eastAsia="Calibri" w:hAnsi="Calibri"/>
+                <w:b/>
+                <w:bCs/>
+                <w:sz w:val="22"/>
+                <w:szCs w:val="22"/>
+              </w:rPr>
+              <w:t xml:space="preserve">When</w:t>
+            </w:r>
+          </w:p>
+        </w:tc>
+      </w:tr>
+      <w:tr>
+        <w:tc>
+          <w:tcPr>
+            <w:tcW w:type="dxa" w:w="3000"/>
+            <w:tcBorders>
+              <w:top w:val="single" w:color="999999" w:sz="4"/>
+              <w:left w:val="single" w:color="999999" w:sz="4"/>
+              <w:bottom w:val="single" w:color="999999" w:sz="4"/>
+              <w:right w:val="single" w:color="999999" w:sz="4"/>
+            </w:tcBorders>
+          </w:tcPr>
+          <w:p>
+            <w:r>
+              <w:rPr>
+                <w:rFonts w:ascii="Calibri" w:cs="Calibri" w:eastAsia="Calibri" w:hAnsi="Calibri"/>
+                <w:sz w:val="22"/>
+                <w:szCs w:val="22"/>
+              </w:rPr>
+              <w:t xml:space="preserve">Receive the complaint</w:t>
+            </w:r>
+          </w:p>
+        </w:tc>
+        <w:tc>
+          <w:tcPr>
+            <w:tcW w:type="dxa" w:w="3000"/>
+            <w:tcBorders>
+              <w:top w:val="single" w:color="999999" w:sz="4"/>
+              <w:left w:val="single" w:color="999999" w:sz="4"/>
+              <w:bottom w:val="single" w:color="999999" w:sz="4"/>
+              <w:right w:val="single" w:color="999999" w:sz="4"/>
+            </w:tcBorders>
+          </w:tcPr>
+          <w:p>
+            <w:r>
+              <w:rPr>
+                <w:rFonts w:ascii="Calibri" w:cs="Calibri" w:eastAsia="Calibri" w:hAnsi="Calibri"/>
+                <w:sz w:val="22"/>
+                <w:szCs w:val="22"/>
+              </w:rPr>
+              <w:t xml:space="preserve">Sunrise Supports owner</w:t>
+            </w:r>
+          </w:p>
+        </w:tc>
+        <w:tc>
+          <w:tcPr>
+            <w:tcW w:type="dxa" w:w="3000"/>
+            <w:tcBorders>
+              <w:top w:val="single" w:color="999999" w:sz="4"/>
+              <w:left w:val="single" w:color="999999" w:sz="4"/>
+              <w:bottom w:val="single" w:color="999999" w:sz="4"/>
+              <w:right w:val="single" w:color="999999" w:sz="4"/>
+            </w:tcBorders>
+          </w:tcPr>
+          <w:p>
+            <w:r>
+              <w:rPr>
+                <w:rFonts w:ascii="Calibri" w:cs="Calibri" w:eastAsia="Calibri" w:hAnsi="Calibri"/>
+                <w:sz w:val="22"/>
+                <w:szCs w:val="22"/>
+              </w:rPr>
+              <w:t xml:space="preserve">Whenever it is raised, in any form</w:t>
+            </w:r>
+          </w:p>
+        </w:tc>
+      </w:tr>
+      <w:tr>
+        <w:tc>
+          <w:tcPr>
+            <w:tcW w:type="dxa" w:w="3000"/>
+            <w:tcBorders>
+              <w:top w:val="single" w:color="999999" w:sz="4"/>
+              <w:left w:val="single" w:color="999999" w:sz="4"/>
+              <w:bottom w:val="single" w:color="999999" w:sz="4"/>
+              <w:right w:val="single" w:color="999999" w:sz="4"/>
+            </w:tcBorders>
+          </w:tcPr>
+          <w:p>
+            <w:r>
+              <w:rPr>
+                <w:rFonts w:ascii="Calibri" w:cs="Calibri" w:eastAsia="Calibri" w:hAnsi="Calibri"/>
+                <w:sz w:val="22"/>
+                <w:szCs w:val="22"/>
+              </w:rPr>
+              <w:t xml:space="preserve">Record in the Complaints register</w:t>
+            </w:r>
+          </w:p>
+        </w:tc>
+        <w:tc>
+          <w:tcPr>
+            <w:tcW w:type="dxa" w:w="3000"/>
+            <w:tcBorders>
+              <w:top w:val="single" w:color="999999" w:sz="4"/>
+              <w:left w:val="single" w:color="999999" w:sz="4"/>
+              <w:bottom w:val="single" w:color="999999" w:sz="4"/>
+              <w:right w:val="single" w:color="999999" w:sz="4"/>
+            </w:tcBorders>
+          </w:tcPr>
+          <w:p>
+            <w:r>
+              <w:rPr>
+                <w:rFonts w:ascii="Calibri" w:cs="Calibri" w:eastAsia="Calibri" w:hAnsi="Calibri"/>
+                <w:sz w:val="22"/>
+                <w:szCs w:val="22"/>
+              </w:rPr>
+              <w:t xml:space="preserve">Sunrise Supports owner</w:t>
+            </w:r>
+          </w:p>
+        </w:tc>
+        <w:tc>
+          <w:tcPr>
+            <w:tcW w:type="dxa" w:w="3000"/>
+            <w:tcBorders>
+              <w:top w:val="single" w:color="999999" w:sz="4"/>
+              <w:left w:val="single" w:color="999999" w:sz="4"/>
+              <w:bottom w:val="single" w:color="999999" w:sz="4"/>
+              <w:right w:val="single" w:color="999999" w:sz="4"/>
+            </w:tcBorders>
+          </w:tcPr>
+          <w:p>
+            <w:r>
+              <w:rPr>
+                <w:rFonts w:ascii="Calibri" w:cs="Calibri" w:eastAsia="Calibri" w:hAnsi="Calibri"/>
+                <w:sz w:val="22"/>
+                <w:szCs w:val="22"/>
+              </w:rPr>
+              <w:t xml:space="preserve">On the day we receive it</w:t>
+            </w:r>
+          </w:p>
+        </w:tc>
+      </w:tr>
+      <w:tr>
+        <w:tc>
+          <w:tcPr>
+            <w:tcW w:type="dxa" w:w="3000"/>
+            <w:tcBorders>
+              <w:top w:val="single" w:color="999999" w:sz="4"/>
+              <w:left w:val="single" w:color="999999" w:sz="4"/>
+              <w:bottom w:val="single" w:color="999999" w:sz="4"/>
+              <w:right w:val="single" w:color="999999" w:sz="4"/>
+            </w:tcBorders>
+          </w:tcPr>
+          <w:p>
+            <w:r>
+              <w:rPr>
+                <w:rFonts w:ascii="Calibri" w:cs="Calibri" w:eastAsia="Calibri" w:hAnsi="Calibri"/>
+                <w:sz w:val="22"/>
+                <w:szCs w:val="22"/>
+              </w:rPr>
+              <w:t xml:space="preserve">Acknowledge the complaint</w:t>
+            </w:r>
+          </w:p>
+        </w:tc>
+        <w:tc>
+          <w:tcPr>
+            <w:tcW w:type="dxa" w:w="3000"/>
+            <w:tcBorders>
+              <w:top w:val="single" w:color="999999" w:sz="4"/>
+              <w:left w:val="single" w:color="999999" w:sz="4"/>
+              <w:bottom w:val="single" w:color="999999" w:sz="4"/>
+              <w:right w:val="single" w:color="999999" w:sz="4"/>
+            </w:tcBorders>
+          </w:tcPr>
+          <w:p>
+            <w:r>
+              <w:rPr>
+                <w:rFonts w:ascii="Calibri" w:cs="Calibri" w:eastAsia="Calibri" w:hAnsi="Calibri"/>
+                <w:sz w:val="22"/>
+                <w:szCs w:val="22"/>
+              </w:rPr>
+              <w:t xml:space="preserve">Sunrise Supports owner</w:t>
+            </w:r>
+          </w:p>
+        </w:tc>
+        <w:tc>
+          <w:tcPr>
+            <w:tcW w:type="dxa" w:w="3000"/>
+            <w:tcBorders>
+              <w:top w:val="single" w:color="999999" w:sz="4"/>
+              <w:left w:val="single" w:color="999999" w:sz="4"/>
+              <w:bottom w:val="single" w:color="999999" w:sz="4"/>
+              <w:right w:val="single" w:color="999999" w:sz="4"/>
+            </w:tcBorders>
+          </w:tcPr>
+          <w:p>
+            <w:r>
+              <w:rPr>
+                <w:rFonts w:ascii="Calibri" w:cs="Calibri" w:eastAsia="Calibri" w:hAnsi="Calibri"/>
+                <w:sz w:val="22"/>
+                <w:szCs w:val="22"/>
+              </w:rPr>
+              <w:t xml:space="preserve">Within the timeframe in the Commission's complaints rules</w:t>
+            </w:r>
+          </w:p>
+        </w:tc>
+      </w:tr>
+      <w:tr>
+        <w:tc>
+          <w:tcPr>
+            <w:tcW w:type="dxa" w:w="3000"/>
+            <w:tcBorders>
+              <w:top w:val="single" w:color="999999" w:sz="4"/>
+              <w:left w:val="single" w:color="999999" w:sz="4"/>
+              <w:bottom w:val="single" w:color="999999" w:sz="4"/>
+              <w:right w:val="single" w:color="999999" w:sz="4"/>
+            </w:tcBorders>
+          </w:tcPr>
+          <w:p>
+            <w:r>
+              <w:rPr>
+                <w:rFonts w:ascii="Calibri" w:cs="Calibri" w:eastAsia="Calibri" w:hAnsi="Calibri"/>
+                <w:sz w:val="22"/>
+                <w:szCs w:val="22"/>
+              </w:rPr>
+              <w:t xml:space="preserve">Look into it and decide</w:t>
+            </w:r>
+          </w:p>
+        </w:tc>
+        <w:tc>
+          <w:tcPr>
+            <w:tcW w:type="dxa" w:w="3000"/>
+            <w:tcBorders>
+              <w:top w:val="single" w:color="999999" w:sz="4"/>
+              <w:left w:val="single" w:color="999999" w:sz="4"/>
+              <w:bottom w:val="single" w:color="999999" w:sz="4"/>
+              <w:right w:val="single" w:color="999999" w:sz="4"/>
+            </w:tcBorders>
+          </w:tcPr>
+          <w:p>
+            <w:r>
+              <w:rPr>
+                <w:rFonts w:ascii="Calibri" w:cs="Calibri" w:eastAsia="Calibri" w:hAnsi="Calibri"/>
+                <w:sz w:val="22"/>
+                <w:szCs w:val="22"/>
+              </w:rPr>
+              <w:t xml:space="preserve">Sunrise Supports owner</w:t>
+            </w:r>
+          </w:p>
+        </w:tc>
+        <w:tc>
+          <w:tcPr>
+            <w:tcW w:type="dxa" w:w="3000"/>
+            <w:tcBorders>
+              <w:top w:val="single" w:color="999999" w:sz="4"/>
+              <w:left w:val="single" w:color="999999" w:sz="4"/>
+              <w:bottom w:val="single" w:color="999999" w:sz="4"/>
+              <w:right w:val="single" w:color="999999" w:sz="4"/>
+            </w:tcBorders>
+          </w:tcPr>
+          <w:p>
+            <w:r>
+              <w:rPr>
+                <w:rFonts w:ascii="Calibri" w:cs="Calibri" w:eastAsia="Calibri" w:hAnsi="Calibri"/>
+                <w:sz w:val="22"/>
+                <w:szCs w:val="22"/>
+              </w:rPr>
+              <w:t xml:space="preserve">As soon as we can, and within the timeframe in the Commission's complaints rules</w:t>
+            </w:r>
+          </w:p>
+        </w:tc>
+      </w:tr>
+      <w:tr>
+        <w:tc>
+          <w:tcPr>
+            <w:tcW w:type="dxa" w:w="3000"/>
+            <w:tcBorders>
+              <w:top w:val="single" w:color="999999" w:sz="4"/>
+              <w:left w:val="single" w:color="999999" w:sz="4"/>
+              <w:bottom w:val="single" w:color="999999" w:sz="4"/>
+              <w:right w:val="single" w:color="999999" w:sz="4"/>
+            </w:tcBorders>
+          </w:tcPr>
+          <w:p>
+            <w:r>
+              <w:rPr>
+                <w:rFonts w:ascii="Calibri" w:cs="Calibri" w:eastAsia="Calibri" w:hAnsi="Calibri"/>
+                <w:sz w:val="22"/>
+                <w:szCs w:val="22"/>
+              </w:rPr>
+              <w:t xml:space="preserve">Tell the person the outcome and their options</w:t>
+            </w:r>
+          </w:p>
+        </w:tc>
+        <w:tc>
+          <w:tcPr>
+            <w:tcW w:type="dxa" w:w="3000"/>
+            <w:tcBorders>
+              <w:top w:val="single" w:color="999999" w:sz="4"/>
+              <w:left w:val="single" w:color="999999" w:sz="4"/>
+              <w:bottom w:val="single" w:color="999999" w:sz="4"/>
+              <w:right w:val="single" w:color="999999" w:sz="4"/>
+            </w:tcBorders>
+          </w:tcPr>
+          <w:p>
+            <w:r>
+              <w:rPr>
+                <w:rFonts w:ascii="Calibri" w:cs="Calibri" w:eastAsia="Calibri" w:hAnsi="Calibri"/>
+                <w:sz w:val="22"/>
+                <w:szCs w:val="22"/>
+              </w:rPr>
+              <w:t xml:space="preserve">Sunrise Supports owner</w:t>
+            </w:r>
+          </w:p>
+        </w:tc>
+        <w:tc>
+          <w:tcPr>
+            <w:tcW w:type="dxa" w:w="3000"/>
+            <w:tcBorders>
+              <w:top w:val="single" w:color="999999" w:sz="4"/>
+              <w:left w:val="single" w:color="999999" w:sz="4"/>
+              <w:bottom w:val="single" w:color="999999" w:sz="4"/>
+              <w:right w:val="single" w:color="999999" w:sz="4"/>
+            </w:tcBorders>
+          </w:tcPr>
+          <w:p>
+            <w:r>
+              <w:rPr>
+                <w:rFonts w:ascii="Calibri" w:cs="Calibri" w:eastAsia="Calibri" w:hAnsi="Calibri"/>
+                <w:sz w:val="22"/>
+                <w:szCs w:val="22"/>
+              </w:rPr>
+              <w:t xml:space="preserve">When we decide, and in the way the person prefers</w:t>
+            </w:r>
+          </w:p>
+        </w:tc>
+      </w:tr>
+      <w:tr>
+        <w:tc>
+          <w:tcPr>
+            <w:tcW w:type="dxa" w:w="3000"/>
+            <w:tcBorders>
+              <w:top w:val="single" w:color="999999" w:sz="4"/>
+              <w:left w:val="single" w:color="999999" w:sz="4"/>
+              <w:bottom w:val="single" w:color="999999" w:sz="4"/>
+              <w:right w:val="single" w:color="999999" w:sz="4"/>
+            </w:tcBorders>
+          </w:tcPr>
+          <w:p>
+            <w:r>
+              <w:rPr>
+                <w:rFonts w:ascii="Calibri" w:cs="Calibri" w:eastAsia="Calibri" w:hAnsi="Calibri"/>
+                <w:sz w:val="22"/>
+                <w:szCs w:val="22"/>
+              </w:rPr>
+              <w:t xml:space="preserve">Close the entry and review what we learned</w:t>
+            </w:r>
+          </w:p>
+        </w:tc>
+        <w:tc>
+          <w:tcPr>
+            <w:tcW w:type="dxa" w:w="3000"/>
+            <w:tcBorders>
+              <w:top w:val="single" w:color="999999" w:sz="4"/>
+              <w:left w:val="single" w:color="999999" w:sz="4"/>
+              <w:bottom w:val="single" w:color="999999" w:sz="4"/>
+              <w:right w:val="single" w:color="999999" w:sz="4"/>
+            </w:tcBorders>
+          </w:tcPr>
+          <w:p>
+            <w:r>
+              <w:rPr>
+                <w:rFonts w:ascii="Calibri" w:cs="Calibri" w:eastAsia="Calibri" w:hAnsi="Calibri"/>
+                <w:sz w:val="22"/>
+                <w:szCs w:val="22"/>
+              </w:rPr>
+              <w:t xml:space="preserve">Sunrise Supports owner</w:t>
+            </w:r>
+          </w:p>
+        </w:tc>
+        <w:tc>
+          <w:tcPr>
+            <w:tcW w:type="dxa" w:w="3000"/>
+            <w:tcBorders>
+              <w:top w:val="single" w:color="999999" w:sz="4"/>
+              <w:left w:val="single" w:color="999999" w:sz="4"/>
+              <w:bottom w:val="single" w:color="999999" w:sz="4"/>
+              <w:right w:val="single" w:color="999999" w:sz="4"/>
+            </w:tcBorders>
+          </w:tcPr>
+          <w:p>
+            <w:r>
+              <w:rPr>
+                <w:rFonts w:ascii="Calibri" w:cs="Calibri" w:eastAsia="Calibri" w:hAnsi="Calibri"/>
+                <w:sz w:val="22"/>
+                <w:szCs w:val="22"/>
+              </w:rPr>
+              <w:t xml:space="preserve">When the person has been told the outcome</w:t>
+            </w:r>
+          </w:p>
+        </w:tc>
+      </w:tr>
+    </w:tbl>
+    <w:p>
+      <w:pPr>
+        <w:spacing w:after="120"/>
+      </w:pPr>
+      <w:r>
+        <w:rPr>
+          <w:rFonts w:ascii="Calibri" w:cs="Calibri" w:eastAsia="Calibri" w:hAnsi="Calibri"/>
+          <w:sz w:val="22"/>
+          <w:szCs w:val="22"/>
+        </w:rPr>
+        <w:t xml:space="preserve"/>
+      </w:r>
+    </w:p>
+    <w:p>
+      <w:pPr>
+        <w:spacing w:after="120"/>
+      </w:pPr>
+      <w:r>
+        <w:rPr>
+          <w:rFonts w:ascii="Calibri" w:cs="Calibri" w:eastAsia="Calibri" w:hAnsi="Calibri"/>
+          <w:sz w:val="22"/>
+          <w:szCs w:val="22"/>
+        </w:rPr>
+        <w:t xml:space="preserve">If we cannot reach the person at the time, we try again and note each attempt in the register. We keep the person updated if the matter takes longer than we first told them.</w:t>
+      </w:r>
+    </w:p>
+    <w:p>
+      <w:pPr>
+        <w:spacing w:after="120"/>
+      </w:pPr>
+      <w:r>
+        <w:rPr>
+          <w:rFonts w:ascii="Calibri" w:cs="Calibri" w:eastAsia="Calibri" w:hAnsi="Calibri"/>
+          <w:sz w:val="22"/>
+          <w:szCs w:val="22"/>
+        </w:rPr>
+        <w:t xml:space="preserve">Because we are a sole trader, no one else in our business can review a complaint about us. A participant can ask an advocate to help them. They can also take the complaint to the Commission at any time, and they do not need to complain to us first. We never treat a person badly for complaining.</w:t>
+      </w:r>
+    </w:p>
+    <w:p>
+      <w:pPr>
+        <w:spacing w:after="120"/>
+      </w:pPr>
+      <w:r>
+        <w:rPr>
+          <w:rFonts w:ascii="Calibri" w:cs="Calibri" w:eastAsia="Calibri" w:hAnsi="Calibri"/>
+          <w:sz w:val="22"/>
+          <w:szCs w:val="22"/>
+        </w:rPr>
+        <w:t xml:space="preserve">To complain to the NDIS Quality and Safeguards Commission (the Commission), a person can call 1800 035 544 or use the contact options on the Commission's website. They can complain for themselves or ask someone to do it for them. We give this information to every participant when they start with us.</w:t>
       </w:r>
     </w:p>
     <w:tbl>
@@ -1073,310 +3305,7 @@
                 <w:sz w:val="22"/>
                 <w:szCs w:val="22"/>
               </w:rPr>
-              <w:t xml:space="preserve">Review and complete: this section could not be drafted automatically.</w:t>
-            </w:r>
-          </w:p>
-        </w:tc>
-      </w:tr>
-    </w:tbl>
-    <w:p>
-      <w:pPr>
-        <w:spacing w:after="120"/>
-      </w:pPr>
-      <w:r>
-        <w:rPr>
-          <w:rFonts w:ascii="Calibri" w:cs="Calibri" w:eastAsia="Calibri" w:hAnsi="Calibri"/>
-          <w:sz w:val="22"/>
-          <w:szCs w:val="22"/>
-        </w:rPr>
-        <w:t xml:space="preserve"/>
-      </w:r>
-    </w:p>
-    <w:tbl>
-      <w:tblPr>
-        <w:tblW w:type="dxa" w:w="9000"/>
-        <w:tblBorders>
-          <w:top w:val="single" w:color="auto" w:sz="4"/>
-          <w:left w:val="single" w:color="auto" w:sz="4"/>
-          <w:bottom w:val="single" w:color="auto" w:sz="4"/>
-          <w:right w:val="single" w:color="auto" w:sz="4"/>
-          <w:insideH w:val="single" w:color="auto" w:sz="4"/>
-          <w:insideV w:val="single" w:color="auto" w:sz="4"/>
-        </w:tblBorders>
-      </w:tblPr>
-      <w:tblGrid>
-        <w:gridCol w:w="9000"/>
-      </w:tblGrid>
-      <w:tr>
-        <w:tc>
-          <w:tcPr>
-            <w:tcW w:type="dxa" w:w="9000"/>
-            <w:tcBorders>
-              <w:top w:val="single" w:color="999999" w:sz="4"/>
-              <w:left w:val="single" w:color="999999" w:sz="4"/>
-              <w:bottom w:val="single" w:color="999999" w:sz="4"/>
-              <w:right w:val="single" w:color="999999" w:sz="4"/>
-            </w:tcBorders>
-            <w:shd w:fill="FFF4CE" w:val="clear"/>
-          </w:tcPr>
-          <w:p>
-            <w:r>
-              <w:rPr>
-                <w:rFonts w:ascii="Calibri" w:cs="Calibri" w:eastAsia="Calibri" w:hAnsi="Calibri"/>
-                <w:i/>
-                <w:iCs/>
-                <w:sz w:val="22"/>
-                <w:szCs w:val="22"/>
-              </w:rPr>
-              <w:t xml:space="preserve">[Provider to complete: How we put this into practice. Numbered steps, sized to the business (sole trader wording when there are no workers). Never restate statutory timeframes, reportable-incident lists or the Commission's definitions; refer to the fixed section that holds them (for example "see section 7 Reportable incidents"). Review cycles for this document are fixed facts: policy review every 12 months; register review every 3 months. Use them and never choose a cycle.]</w:t>
-            </w:r>
-          </w:p>
-        </w:tc>
-      </w:tr>
-    </w:tbl>
-    <w:p>
-      <w:pPr>
-        <w:spacing w:after="120"/>
-      </w:pPr>
-      <w:r>
-        <w:rPr>
-          <w:rFonts w:ascii="Calibri" w:cs="Calibri" w:eastAsia="Calibri" w:hAnsi="Calibri"/>
-          <w:sz w:val="22"/>
-          <w:szCs w:val="22"/>
-        </w:rPr>
-        <w:t xml:space="preserve"/>
-      </w:r>
-    </w:p>
-    <w:p>
-      <w:pPr>
-        <w:pStyle w:val="Heading1"/>
-        <w:spacing w:after="120" w:before="240"/>
-      </w:pPr>
-      <w:r>
-        <w:rPr>
-          <w:rFonts w:ascii="Calibri" w:cs="Calibri" w:eastAsia="Calibri" w:hAnsi="Calibri"/>
-          <w:b/>
-          <w:bCs/>
-        </w:rPr>
-        <w:t xml:space="preserve">6 Responsibilities</w:t>
-      </w:r>
-    </w:p>
-    <w:tbl>
-      <w:tblPr>
-        <w:tblW w:type="dxa" w:w="9000"/>
-        <w:tblBorders>
-          <w:top w:val="single" w:color="auto" w:sz="4"/>
-          <w:left w:val="single" w:color="auto" w:sz="4"/>
-          <w:bottom w:val="single" w:color="auto" w:sz="4"/>
-          <w:right w:val="single" w:color="auto" w:sz="4"/>
-          <w:insideH w:val="single" w:color="auto" w:sz="4"/>
-          <w:insideV w:val="single" w:color="auto" w:sz="4"/>
-        </w:tblBorders>
-      </w:tblPr>
-      <w:tblGrid>
-        <w:gridCol w:w="9000"/>
-      </w:tblGrid>
-      <w:tr>
-        <w:tc>
-          <w:tcPr>
-            <w:tcW w:type="dxa" w:w="9000"/>
-            <w:tcBorders>
-              <w:top w:val="single" w:color="999999" w:sz="4"/>
-              <w:left w:val="single" w:color="999999" w:sz="4"/>
-              <w:bottom w:val="single" w:color="999999" w:sz="4"/>
-              <w:right w:val="single" w:color="999999" w:sz="4"/>
-            </w:tcBorders>
-            <w:shd w:fill="FFF4CE" w:val="clear"/>
-          </w:tcPr>
-          <w:p>
-            <w:r>
-              <w:rPr>
-                <w:rFonts w:ascii="Calibri" w:cs="Calibri" w:eastAsia="Calibri" w:hAnsi="Calibri"/>
-                <w:i/>
-                <w:iCs/>
-                <w:sz w:val="22"/>
-                <w:szCs w:val="22"/>
-              </w:rPr>
-              <w:t xml:space="preserve">Review and complete: this section could not be drafted automatically.</w:t>
-            </w:r>
-          </w:p>
-        </w:tc>
-      </w:tr>
-    </w:tbl>
-    <w:p>
-      <w:pPr>
-        <w:spacing w:after="120"/>
-      </w:pPr>
-      <w:r>
-        <w:rPr>
-          <w:rFonts w:ascii="Calibri" w:cs="Calibri" w:eastAsia="Calibri" w:hAnsi="Calibri"/>
-          <w:sz w:val="22"/>
-          <w:szCs w:val="22"/>
-        </w:rPr>
-        <w:t xml:space="preserve"/>
-      </w:r>
-    </w:p>
-    <w:tbl>
-      <w:tblPr>
-        <w:tblW w:type="dxa" w:w="9000"/>
-        <w:tblBorders>
-          <w:top w:val="single" w:color="auto" w:sz="4"/>
-          <w:left w:val="single" w:color="auto" w:sz="4"/>
-          <w:bottom w:val="single" w:color="auto" w:sz="4"/>
-          <w:right w:val="single" w:color="auto" w:sz="4"/>
-          <w:insideH w:val="single" w:color="auto" w:sz="4"/>
-          <w:insideV w:val="single" w:color="auto" w:sz="4"/>
-        </w:tblBorders>
-      </w:tblPr>
-      <w:tblGrid>
-        <w:gridCol w:w="9000"/>
-      </w:tblGrid>
-      <w:tr>
-        <w:tc>
-          <w:tcPr>
-            <w:tcW w:type="dxa" w:w="9000"/>
-            <w:tcBorders>
-              <w:top w:val="single" w:color="999999" w:sz="4"/>
-              <w:left w:val="single" w:color="999999" w:sz="4"/>
-              <w:bottom w:val="single" w:color="999999" w:sz="4"/>
-              <w:right w:val="single" w:color="999999" w:sz="4"/>
-            </w:tcBorders>
-            <w:shd w:fill="FFF4CE" w:val="clear"/>
-          </w:tcPr>
-          <w:p>
-            <w:r>
-              <w:rPr>
-                <w:rFonts w:ascii="Calibri" w:cs="Calibri" w:eastAsia="Calibri" w:hAnsi="Calibri"/>
-                <w:i/>
-                <w:iCs/>
-                <w:sz w:val="22"/>
-                <w:szCs w:val="22"/>
-              </w:rPr>
-              <w:t xml:space="preserve">[Provider to complete: Responsibilities. Table of role and responsibility; roles come from the business structure and worker count. Never restate statutory timeframes, reportable-incident lists or the Commission's definitions; refer to the fixed section that holds them (for example "see section 7 Reportable incidents"). Review cycles for this document are fixed facts: policy review every 12 months; register review every 3 months. Use them and never choose a cycle.]</w:t>
-            </w:r>
-          </w:p>
-        </w:tc>
-      </w:tr>
-    </w:tbl>
-    <w:p>
-      <w:pPr>
-        <w:spacing w:after="120"/>
-      </w:pPr>
-      <w:r>
-        <w:rPr>
-          <w:rFonts w:ascii="Calibri" w:cs="Calibri" w:eastAsia="Calibri" w:hAnsi="Calibri"/>
-          <w:sz w:val="22"/>
-          <w:szCs w:val="22"/>
-        </w:rPr>
-        <w:t xml:space="preserve"/>
-      </w:r>
-    </w:p>
-    <w:p>
-      <w:pPr>
-        <w:pStyle w:val="Heading1"/>
-        <w:spacing w:after="120" w:before="240"/>
-      </w:pPr>
-      <w:r>
-        <w:rPr>
-          <w:rFonts w:ascii="Calibri" w:cs="Calibri" w:eastAsia="Calibri" w:hAnsi="Calibri"/>
-          <w:b/>
-          <w:bCs/>
-        </w:rPr>
-        <w:t xml:space="preserve">7 Complaints procedure</w:t>
-      </w:r>
-    </w:p>
-    <w:tbl>
-      <w:tblPr>
-        <w:tblW w:type="dxa" w:w="9000"/>
-        <w:tblBorders>
-          <w:top w:val="single" w:color="auto" w:sz="4"/>
-          <w:left w:val="single" w:color="auto" w:sz="4"/>
-          <w:bottom w:val="single" w:color="auto" w:sz="4"/>
-          <w:right w:val="single" w:color="auto" w:sz="4"/>
-          <w:insideH w:val="single" w:color="auto" w:sz="4"/>
-          <w:insideV w:val="single" w:color="auto" w:sz="4"/>
-        </w:tblBorders>
-      </w:tblPr>
-      <w:tblGrid>
-        <w:gridCol w:w="9000"/>
-      </w:tblGrid>
-      <w:tr>
-        <w:tc>
-          <w:tcPr>
-            <w:tcW w:type="dxa" w:w="9000"/>
-            <w:tcBorders>
-              <w:top w:val="single" w:color="999999" w:sz="4"/>
-              <w:left w:val="single" w:color="999999" w:sz="4"/>
-              <w:bottom w:val="single" w:color="999999" w:sz="4"/>
-              <w:right w:val="single" w:color="999999" w:sz="4"/>
-            </w:tcBorders>
-            <w:shd w:fill="FFF4CE" w:val="clear"/>
-          </w:tcPr>
-          <w:p>
-            <w:r>
-              <w:rPr>
-                <w:rFonts w:ascii="Calibri" w:cs="Calibri" w:eastAsia="Calibri" w:hAnsi="Calibri"/>
-                <w:i/>
-                <w:iCs/>
-                <w:sz w:val="22"/>
-                <w:szCs w:val="22"/>
-              </w:rPr>
-              <w:t xml:space="preserve">Review and complete: this section could not be drafted automatically.</w:t>
-            </w:r>
-          </w:p>
-        </w:tc>
-      </w:tr>
-    </w:tbl>
-    <w:p>
-      <w:pPr>
-        <w:spacing w:after="120"/>
-      </w:pPr>
-      <w:r>
-        <w:rPr>
-          <w:rFonts w:ascii="Calibri" w:cs="Calibri" w:eastAsia="Calibri" w:hAnsi="Calibri"/>
-          <w:sz w:val="22"/>
-          <w:szCs w:val="22"/>
-        </w:rPr>
-        <w:t xml:space="preserve"/>
-      </w:r>
-    </w:p>
-    <w:tbl>
-      <w:tblPr>
-        <w:tblW w:type="dxa" w:w="9000"/>
-        <w:tblBorders>
-          <w:top w:val="single" w:color="auto" w:sz="4"/>
-          <w:left w:val="single" w:color="auto" w:sz="4"/>
-          <w:bottom w:val="single" w:color="auto" w:sz="4"/>
-          <w:right w:val="single" w:color="auto" w:sz="4"/>
-          <w:insideH w:val="single" w:color="auto" w:sz="4"/>
-          <w:insideV w:val="single" w:color="auto" w:sz="4"/>
-        </w:tblBorders>
-      </w:tblPr>
-      <w:tblGrid>
-        <w:gridCol w:w="9000"/>
-      </w:tblGrid>
-      <w:tr>
-        <w:tc>
-          <w:tcPr>
-            <w:tcW w:type="dxa" w:w="9000"/>
-            <w:tcBorders>
-              <w:top w:val="single" w:color="999999" w:sz="4"/>
-              <w:left w:val="single" w:color="999999" w:sz="4"/>
-              <w:bottom w:val="single" w:color="999999" w:sz="4"/>
-              <w:right w:val="single" w:color="999999" w:sz="4"/>
-            </w:tcBorders>
-            <w:shd w:fill="FFF4CE" w:val="clear"/>
-          </w:tcPr>
-          <w:p>
-            <w:r>
-              <w:rPr>
-                <w:rFonts w:ascii="Calibri" w:cs="Calibri" w:eastAsia="Calibri" w:hAnsi="Calibri"/>
-                <w:i/>
-                <w:iCs/>
-                <w:sz w:val="22"/>
-                <w:szCs w:val="22"/>
-              </w:rPr>
-              <w:t xml:space="preserve">[Provider to complete: Complaints procedure. Numbered steps with timeframes as a table; how a participant can complain to the Commission. Never restate statutory timeframes, reportable-incident lists or the Commission's definitions; refer to the fixed section that holds them (for example "see section 7 Reportable incidents").]</w:t>
+              <w:t xml:space="preserve">[Provider to complete: the phone number, email address and postal address participants can use to contact us with a complaint, and any advocacy service we will name for participants in New South Wales.]</w:t>
             </w:r>
           </w:p>
         </w:tc>
@@ -2553,6 +4482,18 @@
   </w:num>
   <w:num w:numId="2">
     <w:abstractNumId w:val="2"/>
+    <w:lvlOverride w:ilvl="0">
+      <w:startOverride w:val="1"/>
+    </w:lvlOverride>
+  </w:num>
+  <w:num w:numId="3">
+    <w:abstractNumId w:val="8"/>
+    <w:lvlOverride w:ilvl="0">
+      <w:startOverride w:val="1"/>
+    </w:lvlOverride>
+  </w:num>
+  <w:num w:numId="4">
+    <w:abstractNumId w:val="10"/>
     <w:lvlOverride w:ilvl="0">
       <w:startOverride w:val="1"/>
     </w:lvlOverride>

</xml_diff>

<commit_message>
REQ-005 batch 15 item 2: three sole-trader documents re-recorded under R-9 and R-10; two lint false positives fixed (D-532); purpose briefs under 15 words (D-533)
Fourteen sections, thinking off, about $0.28 over three runs. R-8 now takes a cycle's subject from the span
before it, so "policy every 12 months and the register every 3 months" passes; "families and carers" is
no longer a worker synonym. Review pack shows three complete documents with no fallback marker.

Co-Authored-By: Claude Fable 5.1 <noreply@anthropic.com>
</commit_message>
<xml_diff>
--- a/product/evidence/req-005/sole-trader/complaints-management-policy-and-register.docx
+++ b/product/evidence/req-005/sole-trader/complaints-management-policy-and-register.docx
@@ -418,7 +418,7 @@
           <w:sz w:val="22"/>
           <w:szCs w:val="22"/>
         </w:rPr>
-        <w:t xml:space="preserve">This document explains how Sunrise Supports welcomes, answers, records and learns from feedback and complaints. It supports the Complaints management standard in the NDIS Practice Standards.</w:t>
+        <w:t xml:space="preserve">This document explains how Sunrise Supports welcomes, resolves, records and learns from feedback and complaints. It supports the Complaints management standard in the NDIS Practice Standards.</w:t>
       </w:r>
     </w:p>
     <w:p>
@@ -445,7 +445,20 @@
           <w:sz w:val="22"/>
           <w:szCs w:val="22"/>
         </w:rPr>
-        <w:t xml:space="preserve">This policy covers all feedback and complaints about the supports Sunrise Supports delivers. Sunrise Supports is a sole trader. We deliver supports to participants in New South Wales.</w:t>
+        <w:t xml:space="preserve">This policy covers all supports delivered by Sunrise Supports, a sole trader business. At present we deliver one type of support: 0120 Household tasks. We deliver this support in New South Wales.</w:t>
+      </w:r>
+    </w:p>
+    <w:p>
+      <w:pPr>
+        <w:spacing w:after="120"/>
+      </w:pPr>
+      <w:r>
+        <w:rPr>
+          <w:rFonts w:ascii="Calibri" w:cs="Calibri" w:eastAsia="Calibri" w:hAnsi="Calibri"/>
+          <w:sz w:val="22"/>
+          <w:szCs w:val="22"/>
+        </w:rPr>
+        <w:t xml:space="preserve">The owner is our only key personnel and our only worker. The owner is responsible for receiving, resolving and recording every complaint. If we take on more workers, this policy will apply to them in the same way.</w:t>
       </w:r>
     </w:p>
     <w:tbl>
@@ -488,7 +501,7 @@
                 <w:sz w:val="22"/>
                 <w:szCs w:val="22"/>
               </w:rPr>
-              <w:t xml:space="preserve">Area</w:t>
+              <w:t xml:space="preserve">Covered</w:t>
             </w:r>
           </w:p>
         </w:tc>
@@ -512,7 +525,7 @@
                 <w:sz w:val="22"/>
                 <w:szCs w:val="22"/>
               </w:rPr>
-              <w:t xml:space="preserve">What it covers</w:t>
+              <w:t xml:space="preserve">What this means</w:t>
             </w:r>
           </w:p>
         </w:tc>
@@ -535,7 +548,7 @@
                 <w:sz w:val="22"/>
                 <w:szCs w:val="22"/>
               </w:rPr>
-              <w:t xml:space="preserve">Supports</w:t>
+              <w:t xml:space="preserve">Who can complain</w:t>
             </w:r>
           </w:p>
         </w:tc>
@@ -556,7 +569,7 @@
                 <w:sz w:val="22"/>
                 <w:szCs w:val="22"/>
               </w:rPr>
-              <w:t xml:space="preserve">0120 Household tasks. This policy also covers any other support we add later, once we update this document.</w:t>
+              <w:t xml:space="preserve">Any participant, family member, nominee, advocate, worker or member of the public</w:t>
             </w:r>
           </w:p>
         </w:tc>
@@ -579,7 +592,7 @@
                 <w:sz w:val="22"/>
                 <w:szCs w:val="22"/>
               </w:rPr>
-              <w:t xml:space="preserve">Location</w:t>
+              <w:t xml:space="preserve">What can be raised</w:t>
             </w:r>
           </w:p>
         </w:tc>
@@ -600,7 +613,7 @@
                 <w:sz w:val="22"/>
                 <w:szCs w:val="22"/>
               </w:rPr>
-              <w:t xml:space="preserve">All supports we deliver in New South Wales.</w:t>
+              <w:t xml:space="preserve">Any concern about our supports, our worker, how we handle information, or how we have dealt with an earlier complaint</w:t>
             </w:r>
           </w:p>
         </w:tc>
@@ -623,7 +636,7 @@
                 <w:sz w:val="22"/>
                 <w:szCs w:val="22"/>
               </w:rPr>
-              <w:t xml:space="preserve">Workers</w:t>
+              <w:t xml:space="preserve">How a complaint can be made</w:t>
             </w:r>
           </w:p>
         </w:tc>
@@ -644,7 +657,7 @@
                 <w:sz w:val="22"/>
                 <w:szCs w:val="22"/>
               </w:rPr>
-              <w:t xml:space="preserve">We are a sole trader with one worker, who is also our key personnel. If we engage other workers, this policy applies to them in the same way.</w:t>
+              <w:t xml:space="preserve">In person, by phone, in writing or through another person, and in the way that suits the person</w:t>
             </w:r>
           </w:p>
         </w:tc>
@@ -667,7 +680,7 @@
                 <w:sz w:val="22"/>
                 <w:szCs w:val="22"/>
               </w:rPr>
-              <w:t xml:space="preserve">Key personnel</w:t>
+              <w:t xml:space="preserve">Where it applies</w:t>
             </w:r>
           </w:p>
         </w:tc>
@@ -688,51 +701,7 @@
                 <w:sz w:val="22"/>
                 <w:szCs w:val="22"/>
               </w:rPr>
-              <w:t xml:space="preserve">We have one key personnel. This person receives, manages and decides every complaint.</w:t>
-            </w:r>
-          </w:p>
-        </w:tc>
-      </w:tr>
-      <w:tr>
-        <w:tc>
-          <w:tcPr>
-            <w:tcW w:type="dxa" w:w="4500"/>
-            <w:tcBorders>
-              <w:top w:val="single" w:color="999999" w:sz="4"/>
-              <w:left w:val="single" w:color="999999" w:sz="4"/>
-              <w:bottom w:val="single" w:color="999999" w:sz="4"/>
-              <w:right w:val="single" w:color="999999" w:sz="4"/>
-            </w:tcBorders>
-          </w:tcPr>
-          <w:p>
-            <w:r>
-              <w:rPr>
-                <w:rFonts w:ascii="Calibri" w:cs="Calibri" w:eastAsia="Calibri" w:hAnsi="Calibri"/>
-                <w:sz w:val="22"/>
-                <w:szCs w:val="22"/>
-              </w:rPr>
-              <w:t xml:space="preserve">Feedback and complaints</w:t>
-            </w:r>
-          </w:p>
-        </w:tc>
-        <w:tc>
-          <w:tcPr>
-            <w:tcW w:type="dxa" w:w="4500"/>
-            <w:tcBorders>
-              <w:top w:val="single" w:color="999999" w:sz="4"/>
-              <w:left w:val="single" w:color="999999" w:sz="4"/>
-              <w:bottom w:val="single" w:color="999999" w:sz="4"/>
-              <w:right w:val="single" w:color="999999" w:sz="4"/>
-            </w:tcBorders>
-          </w:tcPr>
-          <w:p>
-            <w:r>
-              <w:rPr>
-                <w:rFonts w:ascii="Calibri" w:cs="Calibri" w:eastAsia="Calibri" w:hAnsi="Calibri"/>
-                <w:sz w:val="22"/>
-                <w:szCs w:val="22"/>
-              </w:rPr>
-              <w:t xml:space="preserve">Compliments, suggestions and concerns, as well as formal complaints, about our supports, our workers, our decisions and how we handle complaints.</w:t>
+              <w:t xml:space="preserve">All supports we deliver in New South Wales</w:t>
             </w:r>
           </w:p>
         </w:tc>
@@ -761,7 +730,7 @@
           <w:sz w:val="22"/>
           <w:szCs w:val="22"/>
         </w:rPr>
-        <w:t xml:space="preserve">Anyone can give us feedback or make a complaint. This includes participants, family members, nominees, advocates and other people who are concerned. A person does not need to be a participant to raise a concern with us.</w:t>
+        <w:t xml:space="preserve">This policy covers feedback as well as complaints. We welcome compliments, suggestions and concerns, and we handle each one in line with section 7 Complaints procedure.</w:t>
       </w:r>
     </w:p>
     <w:p>
@@ -774,7 +743,7 @@
           <w:sz w:val="22"/>
           <w:szCs w:val="22"/>
         </w:rPr>
-        <w:t xml:space="preserve">We do not use restrictive practices. If this changes, we will update this policy and tell participants before we make the change.</w:t>
+        <w:t xml:space="preserve">We do not use restrictive practices. If this changes, we will review this policy and our related documents before we start.</w:t>
       </w:r>
     </w:p>
     <w:p>
@@ -923,7 +892,7 @@
           <w:sz w:val="22"/>
           <w:szCs w:val="22"/>
         </w:rPr>
-        <w:t xml:space="preserve">Sunrise Supports is a sole trader that provides household tasks (support type 0120) in New South Wales. We welcome feedback and complaints from participants and from anyone else. We treat them as a way to make our supports better.</w:t>
+        <w:t xml:space="preserve">Sunrise Supports welcomes feedback and complaints from every participant, family member, advocate and other person who deals with us. We see a complaint as useful information that helps us do better.</w:t>
       </w:r>
     </w:p>
     <w:p>
@@ -936,7 +905,430 @@
           <w:sz w:val="22"/>
           <w:szCs w:val="22"/>
         </w:rPr>
-        <w:t xml:space="preserve">We handle complaints in line with the National Disability Insurance Scheme (Complaints Management and Resolution) Rules 2018. The NDIS Quality and Safeguards Commission (the Commission) sets these Rules. The table shows each commitment and the quality indicator it supports.</w:t>
+        <w:t xml:space="preserve">We make the following commitments. They support the Complaints management standard, quality indicator 1.</w:t>
+      </w:r>
+    </w:p>
+    <w:p>
+      <w:pPr>
+        <w:pStyle w:val="ListParagraph"/>
+        <w:numPr>
+          <w:ilvl w:val="0"/>
+          <w:numId w:val="3"/>
+        </w:numPr>
+        <w:spacing w:after="60"/>
+      </w:pPr>
+      <w:r>
+        <w:rPr>
+          <w:rFonts w:ascii="Calibri" w:cs="Calibri" w:eastAsia="Calibri" w:hAnsi="Calibri"/>
+          <w:sz w:val="22"/>
+          <w:szCs w:val="22"/>
+        </w:rPr>
+        <w:t xml:space="preserve">We keep a complaints management and resolution system that fits a sole trader delivering household tasks in New South Wales. It is simple to use and in proportion to the supports we give.</w:t>
+      </w:r>
+    </w:p>
+    <w:p>
+      <w:pPr>
+        <w:pStyle w:val="ListParagraph"/>
+        <w:numPr>
+          <w:ilvl w:val="0"/>
+          <w:numId w:val="3"/>
+        </w:numPr>
+        <w:spacing w:after="60"/>
+      </w:pPr>
+      <w:r>
+        <w:rPr>
+          <w:rFonts w:ascii="Calibri" w:cs="Calibri" w:eastAsia="Calibri" w:hAnsi="Calibri"/>
+          <w:sz w:val="22"/>
+          <w:szCs w:val="22"/>
+        </w:rPr>
+        <w:t xml:space="preserve">We tell every participant how to give feedback or make a complaint, and we make it easy to do so in the way that suits them. We accept complaints from anyone, including participants, their families, advocates and other people.</w:t>
+      </w:r>
+    </w:p>
+    <w:p>
+      <w:pPr>
+        <w:pStyle w:val="ListParagraph"/>
+        <w:numPr>
+          <w:ilvl w:val="0"/>
+          <w:numId w:val="3"/>
+        </w:numPr>
+        <w:spacing w:after="60"/>
+      </w:pPr>
+      <w:r>
+        <w:rPr>
+          <w:rFonts w:ascii="Calibri" w:cs="Calibri" w:eastAsia="Calibri" w:hAnsi="Calibri"/>
+          <w:sz w:val="22"/>
+          <w:szCs w:val="22"/>
+        </w:rPr>
+        <w:t xml:space="preserve">We acknowledge each complaint, treat the person with respect, and never treat them worse because they complained.</w:t>
+      </w:r>
+    </w:p>
+    <w:p>
+      <w:pPr>
+        <w:pStyle w:val="ListParagraph"/>
+        <w:numPr>
+          <w:ilvl w:val="0"/>
+          <w:numId w:val="3"/>
+        </w:numPr>
+        <w:spacing w:after="60"/>
+      </w:pPr>
+      <w:r>
+        <w:rPr>
+          <w:rFonts w:ascii="Calibri" w:cs="Calibri" w:eastAsia="Calibri" w:hAnsi="Calibri"/>
+          <w:sz w:val="22"/>
+          <w:szCs w:val="22"/>
+        </w:rPr>
+        <w:t xml:space="preserve">We follow procedural fairness and natural justice. We listen to all sides, tell people what is said about them, and make decisions based on the facts, without bias.</w:t>
+      </w:r>
+    </w:p>
+    <w:p>
+      <w:pPr>
+        <w:pStyle w:val="ListParagraph"/>
+        <w:numPr>
+          <w:ilvl w:val="0"/>
+          <w:numId w:val="3"/>
+        </w:numPr>
+        <w:spacing w:after="60"/>
+      </w:pPr>
+      <w:r>
+        <w:rPr>
+          <w:rFonts w:ascii="Calibri" w:cs="Calibri" w:eastAsia="Calibri" w:hAnsi="Calibri"/>
+          <w:sz w:val="22"/>
+          <w:szCs w:val="22"/>
+        </w:rPr>
+        <w:t xml:space="preserve">We follow the National Disability Insurance Scheme (Complaints Management and Resolution) Rules 2018.</w:t>
+      </w:r>
+    </w:p>
+    <w:p>
+      <w:pPr>
+        <w:pStyle w:val="ListParagraph"/>
+        <w:numPr>
+          <w:ilvl w:val="0"/>
+          <w:numId w:val="3"/>
+        </w:numPr>
+        <w:spacing w:after="60"/>
+      </w:pPr>
+      <w:r>
+        <w:rPr>
+          <w:rFonts w:ascii="Calibri" w:cs="Calibri" w:eastAsia="Calibri" w:hAnsi="Calibri"/>
+          <w:sz w:val="22"/>
+          <w:szCs w:val="22"/>
+        </w:rPr>
+        <w:t xml:space="preserve">We record every complaint in the complaints register and use what we learn to improve our supports.</w:t>
+      </w:r>
+    </w:p>
+    <w:p>
+      <w:pPr>
+        <w:spacing w:after="120"/>
+      </w:pPr>
+      <w:r>
+        <w:rPr>
+          <w:rFonts w:ascii="Calibri" w:cs="Calibri" w:eastAsia="Calibri" w:hAnsi="Calibri"/>
+          <w:sz w:val="22"/>
+          <w:szCs w:val="22"/>
+        </w:rPr>
+        <w:t xml:space="preserve">Because Sunrise Supports is run by one person, there is no one else to hand a complaint to. If a complaint is about us, the person can contact the NDIS Quality and Safeguards Commission, and we will give them the details whenever they ask. See section 7 Complaints procedure for the steps we follow.</w:t>
+      </w:r>
+    </w:p>
+    <w:p>
+      <w:pPr>
+        <w:pStyle w:val="Heading1"/>
+        <w:spacing w:after="120" w:before="240"/>
+      </w:pPr>
+      <w:r>
+        <w:rPr>
+          <w:rFonts w:ascii="Calibri" w:cs="Calibri" w:eastAsia="Calibri" w:hAnsi="Calibri"/>
+          <w:b/>
+          <w:bCs/>
+        </w:rPr>
+        <w:t xml:space="preserve">5 How we put this into practice</w:t>
+      </w:r>
+    </w:p>
+    <w:p>
+      <w:pPr>
+        <w:spacing w:after="120"/>
+      </w:pPr>
+      <w:r>
+        <w:rPr>
+          <w:rFonts w:ascii="Calibri" w:cs="Calibri" w:eastAsia="Calibri" w:hAnsi="Calibri"/>
+          <w:sz w:val="22"/>
+          <w:szCs w:val="22"/>
+        </w:rPr>
+        <w:t xml:space="preserve">Sunrise Supports is run by one person. We have no workers, so the owner handles every step below. This section sets out how we do that in practice. The detailed steps are in section 7 Complaints procedure.</w:t>
+      </w:r>
+    </w:p>
+    <w:p>
+      <w:pPr>
+        <w:pStyle w:val="ListParagraph"/>
+        <w:numPr>
+          <w:ilvl w:val="0"/>
+          <w:numId w:val="4"/>
+        </w:numPr>
+        <w:spacing w:after="60"/>
+      </w:pPr>
+      <w:r>
+        <w:rPr>
+          <w:rFonts w:ascii="Calibri" w:cs="Calibri" w:eastAsia="Calibri" w:hAnsi="Calibri"/>
+          <w:sz w:val="22"/>
+          <w:szCs w:val="22"/>
+        </w:rPr>
+        <w:t xml:space="preserve">We tell every participant how to give feedback or make a complaint before we start their supports. We say it in plain words and give it in writing if they want it.</w:t>
+      </w:r>
+    </w:p>
+    <w:p>
+      <w:pPr>
+        <w:pStyle w:val="ListParagraph"/>
+        <w:numPr>
+          <w:ilvl w:val="0"/>
+          <w:numId w:val="4"/>
+        </w:numPr>
+        <w:spacing w:after="60"/>
+      </w:pPr>
+      <w:r>
+        <w:rPr>
+          <w:rFonts w:ascii="Calibri" w:cs="Calibri" w:eastAsia="Calibri" w:hAnsi="Calibri"/>
+          <w:sz w:val="22"/>
+          <w:szCs w:val="22"/>
+        </w:rPr>
+        <w:t xml:space="preserve">We accept feedback and complaints in any way the participant chooses: by phone, message, email, in person or through someone they trust. We help them if they need support to be heard.</w:t>
+      </w:r>
+    </w:p>
+    <w:p>
+      <w:pPr>
+        <w:pStyle w:val="ListParagraph"/>
+        <w:numPr>
+          <w:ilvl w:val="0"/>
+          <w:numId w:val="4"/>
+        </w:numPr>
+        <w:spacing w:after="60"/>
+      </w:pPr>
+      <w:r>
+        <w:rPr>
+          <w:rFonts w:ascii="Calibri" w:cs="Calibri" w:eastAsia="Calibri" w:hAnsi="Calibri"/>
+          <w:sz w:val="22"/>
+          <w:szCs w:val="22"/>
+        </w:rPr>
+        <w:t xml:space="preserve">We welcome every complaint. We thank the person, listen without arguing, and do not treat a participant differently because they complained.</w:t>
+      </w:r>
+    </w:p>
+    <w:p>
+      <w:pPr>
+        <w:pStyle w:val="ListParagraph"/>
+        <w:numPr>
+          <w:ilvl w:val="0"/>
+          <w:numId w:val="4"/>
+        </w:numPr>
+        <w:spacing w:after="60"/>
+      </w:pPr>
+      <w:r>
+        <w:rPr>
+          <w:rFonts w:ascii="Calibri" w:cs="Calibri" w:eastAsia="Calibri" w:hAnsi="Calibri"/>
+          <w:sz w:val="22"/>
+          <w:szCs w:val="22"/>
+        </w:rPr>
+        <w:t xml:space="preserve">We record each complaint in the complaints register on the day we receive it. Section 8 Complaints register explains what we record.</w:t>
+      </w:r>
+    </w:p>
+    <w:p>
+      <w:pPr>
+        <w:pStyle w:val="ListParagraph"/>
+        <w:numPr>
+          <w:ilvl w:val="0"/>
+          <w:numId w:val="4"/>
+        </w:numPr>
+        <w:spacing w:after="60"/>
+      </w:pPr>
+      <w:r>
+        <w:rPr>
+          <w:rFonts w:ascii="Calibri" w:cs="Calibri" w:eastAsia="Calibri" w:hAnsi="Calibri"/>
+          <w:sz w:val="22"/>
+          <w:szCs w:val="22"/>
+        </w:rPr>
+        <w:t xml:space="preserve">We acknowledge each complaint and follow the timeframes and steps in section 7 Complaints procedure. We do not repeat them here.</w:t>
+      </w:r>
+    </w:p>
+    <w:p>
+      <w:pPr>
+        <w:pStyle w:val="ListParagraph"/>
+        <w:numPr>
+          <w:ilvl w:val="0"/>
+          <w:numId w:val="4"/>
+        </w:numPr>
+        <w:spacing w:after="60"/>
+      </w:pPr>
+      <w:r>
+        <w:rPr>
+          <w:rFonts w:ascii="Calibri" w:cs="Calibri" w:eastAsia="Calibri" w:hAnsi="Calibri"/>
+          <w:sz w:val="22"/>
+          <w:szCs w:val="22"/>
+        </w:rPr>
+        <w:t xml:space="preserve">Because we work alone, we check whether a complaint is about us. If it is, we do not judge our own conduct in secret. We write down what happened, listen to the participant's account, and tell them they can take it to an independent body, including the Commission. Section 4 Policy statement says more about their right to do this.</w:t>
+      </w:r>
+    </w:p>
+    <w:p>
+      <w:pPr>
+        <w:pStyle w:val="ListParagraph"/>
+        <w:numPr>
+          <w:ilvl w:val="0"/>
+          <w:numId w:val="4"/>
+        </w:numPr>
+        <w:spacing w:after="60"/>
+      </w:pPr>
+      <w:r>
+        <w:rPr>
+          <w:rFonts w:ascii="Calibri" w:cs="Calibri" w:eastAsia="Calibri" w:hAnsi="Calibri"/>
+          <w:sz w:val="22"/>
+          <w:szCs w:val="22"/>
+        </w:rPr>
+        <w:t xml:space="preserve">We decide the outcome fairly. We listen to the participant, look at the facts, give them a chance to respond to anything said about them, and explain our decision and the reasons for it.</w:t>
+      </w:r>
+    </w:p>
+    <w:p>
+      <w:pPr>
+        <w:pStyle w:val="ListParagraph"/>
+        <w:numPr>
+          <w:ilvl w:val="0"/>
+          <w:numId w:val="4"/>
+        </w:numPr>
+        <w:spacing w:after="60"/>
+      </w:pPr>
+      <w:r>
+        <w:rPr>
+          <w:rFonts w:ascii="Calibri" w:cs="Calibri" w:eastAsia="Calibri" w:hAnsi="Calibri"/>
+          <w:sz w:val="22"/>
+          <w:szCs w:val="22"/>
+        </w:rPr>
+        <w:t xml:space="preserve">We tell the participant what we have decided and what we will change. We also tell them what they can do if they are not satisfied.</w:t>
+      </w:r>
+    </w:p>
+    <w:p>
+      <w:pPr>
+        <w:pStyle w:val="ListParagraph"/>
+        <w:numPr>
+          <w:ilvl w:val="0"/>
+          <w:numId w:val="4"/>
+        </w:numPr>
+        <w:spacing w:after="60"/>
+      </w:pPr>
+      <w:r>
+        <w:rPr>
+          <w:rFonts w:ascii="Calibri" w:cs="Calibri" w:eastAsia="Calibri" w:hAnsi="Calibri"/>
+          <w:sz w:val="22"/>
+          <w:szCs w:val="22"/>
+        </w:rPr>
+        <w:t xml:space="preserve">We look for the cause of each complaint. Where a change to how we deliver household tasks would stop it happening again, we make that change and note it in the register.</w:t>
+      </w:r>
+    </w:p>
+    <w:p>
+      <w:pPr>
+        <w:pStyle w:val="ListParagraph"/>
+        <w:numPr>
+          <w:ilvl w:val="0"/>
+          <w:numId w:val="4"/>
+        </w:numPr>
+        <w:spacing w:after="60"/>
+      </w:pPr>
+      <w:r>
+        <w:rPr>
+          <w:rFonts w:ascii="Calibri" w:cs="Calibri" w:eastAsia="Calibri" w:hAnsi="Calibri"/>
+          <w:sz w:val="22"/>
+          <w:szCs w:val="22"/>
+        </w:rPr>
+        <w:t xml:space="preserve">We keep the records listed in section 9 Records and evidence to retain. We keep them private and share them only with people who need them.</w:t>
+      </w:r>
+    </w:p>
+    <w:p>
+      <w:pPr>
+        <w:spacing w:after="120"/>
+      </w:pPr>
+      <w:r>
+        <w:rPr>
+          <w:rFonts w:ascii="Calibri" w:cs="Calibri" w:eastAsia="Calibri" w:hAnsi="Calibri"/>
+          <w:sz w:val="22"/>
+          <w:szCs w:val="22"/>
+        </w:rPr>
+        <w:t xml:space="preserve">We review the complaints register every 3 months to look for patterns and follow up open items. We review this policy every 12 months. See section 11 Review.</w:t>
+      </w:r>
+    </w:p>
+    <w:tbl>
+      <w:tblPr>
+        <w:tblW w:type="dxa" w:w="9000"/>
+        <w:tblBorders>
+          <w:top w:val="single" w:color="auto" w:sz="4"/>
+          <w:left w:val="single" w:color="auto" w:sz="4"/>
+          <w:bottom w:val="single" w:color="auto" w:sz="4"/>
+          <w:right w:val="single" w:color="auto" w:sz="4"/>
+          <w:insideH w:val="single" w:color="auto" w:sz="4"/>
+          <w:insideV w:val="single" w:color="auto" w:sz="4"/>
+        </w:tblBorders>
+      </w:tblPr>
+      <w:tblGrid>
+        <w:gridCol w:w="9000"/>
+      </w:tblGrid>
+      <w:tr>
+        <w:tc>
+          <w:tcPr>
+            <w:tcW w:type="dxa" w:w="9000"/>
+            <w:tcBorders>
+              <w:top w:val="single" w:color="999999" w:sz="4"/>
+              <w:left w:val="single" w:color="999999" w:sz="4"/>
+              <w:bottom w:val="single" w:color="999999" w:sz="4"/>
+              <w:right w:val="single" w:color="999999" w:sz="4"/>
+            </w:tcBorders>
+            <w:shd w:fill="FFF4CE" w:val="clear"/>
+          </w:tcPr>
+          <w:p>
+            <w:r>
+              <w:rPr>
+                <w:rFonts w:ascii="Calibri" w:cs="Calibri" w:eastAsia="Calibri" w:hAnsi="Calibri"/>
+                <w:i/>
+                <w:iCs/>
+                <w:sz w:val="22"/>
+                <w:szCs w:val="22"/>
+              </w:rPr>
+              <w:t xml:space="preserve">[Provider to complete: the phone number and email address participants use to contact Sunrise Supports with feedback or a complaint.]</w:t>
+            </w:r>
+          </w:p>
+        </w:tc>
+      </w:tr>
+    </w:tbl>
+    <w:p>
+      <w:pPr>
+        <w:spacing w:after="120"/>
+      </w:pPr>
+      <w:r>
+        <w:rPr>
+          <w:rFonts w:ascii="Calibri" w:cs="Calibri" w:eastAsia="Calibri" w:hAnsi="Calibri"/>
+          <w:sz w:val="22"/>
+          <w:szCs w:val="22"/>
+        </w:rPr>
+        <w:t xml:space="preserve"/>
+      </w:r>
+    </w:p>
+    <w:p>
+      <w:pPr>
+        <w:pStyle w:val="Heading1"/>
+        <w:spacing w:after="120" w:before="240"/>
+      </w:pPr>
+      <w:r>
+        <w:rPr>
+          <w:rFonts w:ascii="Calibri" w:cs="Calibri" w:eastAsia="Calibri" w:hAnsi="Calibri"/>
+          <w:b/>
+          <w:bCs/>
+        </w:rPr>
+        <w:t xml:space="preserve">6 Responsibilities</w:t>
+      </w:r>
+    </w:p>
+    <w:p>
+      <w:pPr>
+        <w:spacing w:after="120"/>
+      </w:pPr>
+      <w:r>
+        <w:rPr>
+          <w:rFonts w:ascii="Calibri" w:cs="Calibri" w:eastAsia="Calibri" w:hAnsi="Calibri"/>
+          <w:sz w:val="22"/>
+          <w:szCs w:val="22"/>
+        </w:rPr>
+        <w:t xml:space="preserve">Sunrise Supports is run by one person, who is the sole trader and the only worker. That one person holds every role in this policy. The table below shows what each role does, so the work is clear to us, to participants and to an auditor.</w:t>
       </w:r>
     </w:p>
     <w:tbl>
@@ -980,7 +1372,7 @@
                 <w:sz w:val="22"/>
                 <w:szCs w:val="22"/>
               </w:rPr>
-              <w:t xml:space="preserve">Our commitment</w:t>
+              <w:t xml:space="preserve">Role</w:t>
             </w:r>
           </w:p>
         </w:tc>
@@ -1004,7 +1396,7 @@
                 <w:sz w:val="22"/>
                 <w:szCs w:val="22"/>
               </w:rPr>
-              <w:t xml:space="preserve">What we do</w:t>
+              <w:t xml:space="preserve">Does what</w:t>
             </w:r>
           </w:p>
         </w:tc>
@@ -1028,7 +1420,7 @@
                 <w:sz w:val="22"/>
                 <w:szCs w:val="22"/>
               </w:rPr>
-              <w:t xml:space="preserve">Quality indicator</w:t>
+              <w:t xml:space="preserve">When</w:t>
             </w:r>
           </w:p>
         </w:tc>
@@ -1051,7 +1443,7 @@
                 <w:sz w:val="22"/>
                 <w:szCs w:val="22"/>
               </w:rPr>
-              <w:t xml:space="preserve">We keep a complaints system that fits our size and our supports.</w:t>
+              <w:t xml:space="preserve">Owner and sole worker (complaints officer)</w:t>
             </w:r>
           </w:p>
         </w:tc>
@@ -1072,7 +1464,7 @@
                 <w:sz w:val="22"/>
                 <w:szCs w:val="22"/>
               </w:rPr>
-              <w:t xml:space="preserve">We keep the system simple and in proportion to a sole trader providing household tasks. We handle every complaint fairly. We tell the person what is happening, listen to all sides, decide without bias and give our reasons.</w:t>
+              <w:t xml:space="preserve">Welcomes feedback and complaints, acknowledges each one, looks into it fairly, decides how to resolve it, and tells the person what we decided and why. Follows section 7 Complaints procedure.</w:t>
             </w:r>
           </w:p>
         </w:tc>
@@ -1093,7 +1485,7 @@
                 <w:sz w:val="22"/>
                 <w:szCs w:val="22"/>
               </w:rPr>
-              <w:t xml:space="preserve">Feedback and complaints management, indicator 1. Complaints management, indicator 1.</w:t>
+              <w:t xml:space="preserve">Each time feedback or a complaint is received</w:t>
             </w:r>
           </w:p>
         </w:tc>
@@ -1116,7 +1508,7 @@
                 <w:sz w:val="22"/>
                 <w:szCs w:val="22"/>
               </w:rPr>
-              <w:t xml:space="preserve">We tell every participant how to give feedback or make a complaint.</w:t>
+              <w:t xml:space="preserve">Owner and sole worker (register keeper)</w:t>
             </w:r>
           </w:p>
         </w:tc>
@@ -1137,7 +1529,7 @@
                 <w:sz w:val="22"/>
                 <w:szCs w:val="22"/>
               </w:rPr>
-              <w:t xml:space="preserve">We explain this when supports start and whenever a participant asks. We explain outside options, including the Commission, and the participant's right to use an advocate. We use a format the participant can understand.</w:t>
+              <w:t xml:space="preserve">Enters every complaint in the complaints register, keeps it up to date, and keeps the records listed in section 9 Records and evidence to retain.</w:t>
             </w:r>
           </w:p>
         </w:tc>
@@ -1158,7 +1550,7 @@
                 <w:sz w:val="22"/>
                 <w:szCs w:val="22"/>
               </w:rPr>
-              <w:t xml:space="preserve">Feedback and complaints management, indicator 2.</w:t>
+              <w:t xml:space="preserve">When a complaint is received and each time its status changes</w:t>
             </w:r>
           </w:p>
         </w:tc>
@@ -1181,7 +1573,7 @@
                 <w:sz w:val="22"/>
                 <w:szCs w:val="22"/>
               </w:rPr>
-              <w:t xml:space="preserve">We welcome feedback and protect the people who give it.</w:t>
+              <w:t xml:space="preserve">Owner and sole worker (improvement lead)</w:t>
             </w:r>
           </w:p>
         </w:tc>
@@ -1202,7 +1594,7 @@
                 <w:sz w:val="22"/>
                 <w:szCs w:val="22"/>
               </w:rPr>
-              <w:t xml:space="preserve">We thank the person, acknowledge what they told us and respect their view. We do not treat anyone worse for raising a concern. We let the participant choose who supports them in the process.</w:t>
+              <w:t xml:space="preserve">Looks at what complaints show us and changes how we work where needed. Records the change.</w:t>
             </w:r>
           </w:p>
         </w:tc>
@@ -1223,7 +1615,7 @@
                 <w:sz w:val="22"/>
                 <w:szCs w:val="22"/>
               </w:rPr>
-              <w:t xml:space="preserve">Feedback and complaints management, indicator 2.</w:t>
+              <w:t xml:space="preserve">When a complaint is closed and at each register review</w:t>
             </w:r>
           </w:p>
         </w:tc>
@@ -1246,7 +1638,7 @@
                 <w:sz w:val="22"/>
                 <w:szCs w:val="22"/>
               </w:rPr>
-              <w:t xml:space="preserve">We record every complaint and what we did about it.</w:t>
+              <w:t xml:space="preserve">Owner and sole worker (policy owner)</w:t>
             </w:r>
           </w:p>
         </w:tc>
@@ -1267,7 +1659,7 @@
                 <w:sz w:val="22"/>
                 <w:szCs w:val="22"/>
               </w:rPr>
-              <w:t xml:space="preserve">We enter each complaint in the Complaints register. We record how we handled it, the outcome and any follow-up. We keep these records private.</w:t>
+              <w:t xml:space="preserve">Reviews this policy and the register. Review dates are set out in section 11 Review.</w:t>
             </w:r>
           </w:p>
         </w:tc>
@@ -1288,137 +1680,7 @@
                 <w:sz w:val="22"/>
                 <w:szCs w:val="22"/>
               </w:rPr>
-              <w:t xml:space="preserve">Complaints management, indicator 1.</w:t>
-            </w:r>
-          </w:p>
-        </w:tc>
-      </w:tr>
-      <w:tr>
-        <w:tc>
-          <w:tcPr>
-            <w:tcW w:type="dxa" w:w="3000"/>
-            <w:tcBorders>
-              <w:top w:val="single" w:color="999999" w:sz="4"/>
-              <w:left w:val="single" w:color="999999" w:sz="4"/>
-              <w:bottom w:val="single" w:color="999999" w:sz="4"/>
-              <w:right w:val="single" w:color="999999" w:sz="4"/>
-            </w:tcBorders>
-          </w:tcPr>
-          <w:p>
-            <w:r>
-              <w:rPr>
-                <w:rFonts w:ascii="Calibri" w:cs="Calibri" w:eastAsia="Calibri" w:hAnsi="Calibri"/>
-                <w:sz w:val="22"/>
-                <w:szCs w:val="22"/>
-              </w:rPr>
-              <w:t xml:space="preserve">We use feedback to improve.</w:t>
-            </w:r>
-          </w:p>
-        </w:tc>
-        <w:tc>
-          <w:tcPr>
-            <w:tcW w:type="dxa" w:w="3000"/>
-            <w:tcBorders>
-              <w:top w:val="single" w:color="999999" w:sz="4"/>
-              <w:left w:val="single" w:color="999999" w:sz="4"/>
-              <w:bottom w:val="single" w:color="999999" w:sz="4"/>
-              <w:right w:val="single" w:color="999999" w:sz="4"/>
-            </w:tcBorders>
-          </w:tcPr>
-          <w:p>
-            <w:r>
-              <w:rPr>
-                <w:rFonts w:ascii="Calibri" w:cs="Calibri" w:eastAsia="Calibri" w:hAnsi="Calibri"/>
-                <w:sz w:val="22"/>
-                <w:szCs w:val="22"/>
-              </w:rPr>
-              <w:t xml:space="preserve">We review this policy every 12 months. We ask participants whether our complaints process is easy to find and use. We change how we work when feedback shows we should.</w:t>
-            </w:r>
-          </w:p>
-        </w:tc>
-        <w:tc>
-          <w:tcPr>
-            <w:tcW w:type="dxa" w:w="3000"/>
-            <w:tcBorders>
-              <w:top w:val="single" w:color="999999" w:sz="4"/>
-              <w:left w:val="single" w:color="999999" w:sz="4"/>
-              <w:bottom w:val="single" w:color="999999" w:sz="4"/>
-              <w:right w:val="single" w:color="999999" w:sz="4"/>
-            </w:tcBorders>
-          </w:tcPr>
-          <w:p>
-            <w:r>
-              <w:rPr>
-                <w:rFonts w:ascii="Calibri" w:cs="Calibri" w:eastAsia="Calibri" w:hAnsi="Calibri"/>
-                <w:sz w:val="22"/>
-                <w:szCs w:val="22"/>
-              </w:rPr>
-              <w:t xml:space="preserve">Feedback and complaints management, indicator 3.</w:t>
-            </w:r>
-          </w:p>
-        </w:tc>
-      </w:tr>
-      <w:tr>
-        <w:tc>
-          <w:tcPr>
-            <w:tcW w:type="dxa" w:w="3000"/>
-            <w:tcBorders>
-              <w:top w:val="single" w:color="999999" w:sz="4"/>
-              <w:left w:val="single" w:color="999999" w:sz="4"/>
-              <w:bottom w:val="single" w:color="999999" w:sz="4"/>
-              <w:right w:val="single" w:color="999999" w:sz="4"/>
-            </w:tcBorders>
-          </w:tcPr>
-          <w:p>
-            <w:r>
-              <w:rPr>
-                <w:rFonts w:ascii="Calibri" w:cs="Calibri" w:eastAsia="Calibri" w:hAnsi="Calibri"/>
-                <w:sz w:val="22"/>
-                <w:szCs w:val="22"/>
-              </w:rPr>
-              <w:t xml:space="preserve">We make sure every worker knows and follows the process.</w:t>
-            </w:r>
-          </w:p>
-        </w:tc>
-        <w:tc>
-          <w:tcPr>
-            <w:tcW w:type="dxa" w:w="3000"/>
-            <w:tcBorders>
-              <w:top w:val="single" w:color="999999" w:sz="4"/>
-              <w:left w:val="single" w:color="999999" w:sz="4"/>
-              <w:bottom w:val="single" w:color="999999" w:sz="4"/>
-              <w:right w:val="single" w:color="999999" w:sz="4"/>
-            </w:tcBorders>
-          </w:tcPr>
-          <w:p>
-            <w:r>
-              <w:rPr>
-                <w:rFonts w:ascii="Calibri" w:cs="Calibri" w:eastAsia="Calibri" w:hAnsi="Calibri"/>
-                <w:sz w:val="22"/>
-                <w:szCs w:val="22"/>
-              </w:rPr>
-              <w:t xml:space="preserve">We train every worker on this procedure before they start work. This includes any worker who joins us later. We check that they follow it and refresh the training when the procedure changes.</w:t>
-            </w:r>
-          </w:p>
-        </w:tc>
-        <w:tc>
-          <w:tcPr>
-            <w:tcW w:type="dxa" w:w="3000"/>
-            <w:tcBorders>
-              <w:top w:val="single" w:color="999999" w:sz="4"/>
-              <w:left w:val="single" w:color="999999" w:sz="4"/>
-              <w:bottom w:val="single" w:color="999999" w:sz="4"/>
-              <w:right w:val="single" w:color="999999" w:sz="4"/>
-            </w:tcBorders>
-          </w:tcPr>
-          <w:p>
-            <w:r>
-              <w:rPr>
-                <w:rFonts w:ascii="Calibri" w:cs="Calibri" w:eastAsia="Calibri" w:hAnsi="Calibri"/>
-                <w:sz w:val="22"/>
-                <w:szCs w:val="22"/>
-              </w:rPr>
-              <w:t xml:space="preserve">Feedback and complaints management, indicator 4.</w:t>
+              <w:t xml:space="preserve">Policy every 12 months; register every 3 months</w:t>
             </w:r>
           </w:p>
         </w:tc>
@@ -1439,6 +1701,87 @@
     </w:p>
     <w:p>
       <w:pPr>
+        <w:spacing w:after="120"/>
+      </w:pPr>
+      <w:r>
+        <w:rPr>
+          <w:rFonts w:ascii="Calibri" w:cs="Calibri" w:eastAsia="Calibri" w:hAnsi="Calibri"/>
+          <w:sz w:val="22"/>
+          <w:szCs w:val="22"/>
+        </w:rPr>
+        <w:t xml:space="preserve">Because one person holds every role, a complaint may be about the owner. When that happens, we offer the participant the other ways to complain described in section 5 How we put this into practice and section 7 Complaints procedure. We also keep the complaint and our response on the register, and we do not close it until the participant has been told of their options.</w:t>
+      </w:r>
+    </w:p>
+    <w:p>
+      <w:pPr>
+        <w:spacing w:after="120"/>
+      </w:pPr>
+      <w:r>
+        <w:rPr>
+          <w:rFonts w:ascii="Calibri" w:cs="Calibri" w:eastAsia="Calibri" w:hAnsi="Calibri"/>
+          <w:sz w:val="22"/>
+          <w:szCs w:val="22"/>
+        </w:rPr>
+        <w:t xml:space="preserve">Anyone can raise a concern or make a complaint. Participants, their families and nominees, and other people do not need to use any set words or form. We treat each one with respect.</w:t>
+      </w:r>
+    </w:p>
+    <w:tbl>
+      <w:tblPr>
+        <w:tblW w:type="dxa" w:w="9000"/>
+        <w:tblBorders>
+          <w:top w:val="single" w:color="auto" w:sz="4"/>
+          <w:left w:val="single" w:color="auto" w:sz="4"/>
+          <w:bottom w:val="single" w:color="auto" w:sz="4"/>
+          <w:right w:val="single" w:color="auto" w:sz="4"/>
+          <w:insideH w:val="single" w:color="auto" w:sz="4"/>
+          <w:insideV w:val="single" w:color="auto" w:sz="4"/>
+        </w:tblBorders>
+      </w:tblPr>
+      <w:tblGrid>
+        <w:gridCol w:w="9000"/>
+      </w:tblGrid>
+      <w:tr>
+        <w:tc>
+          <w:tcPr>
+            <w:tcW w:type="dxa" w:w="9000"/>
+            <w:tcBorders>
+              <w:top w:val="single" w:color="999999" w:sz="4"/>
+              <w:left w:val="single" w:color="999999" w:sz="4"/>
+              <w:bottom w:val="single" w:color="999999" w:sz="4"/>
+              <w:right w:val="single" w:color="999999" w:sz="4"/>
+            </w:tcBorders>
+            <w:shd w:fill="FFF4CE" w:val="clear"/>
+          </w:tcPr>
+          <w:p>
+            <w:r>
+              <w:rPr>
+                <w:rFonts w:ascii="Calibri" w:cs="Calibri" w:eastAsia="Calibri" w:hAnsi="Calibri"/>
+                <w:i/>
+                <w:iCs/>
+                <w:sz w:val="22"/>
+                <w:szCs w:val="22"/>
+              </w:rPr>
+              <w:t xml:space="preserve">[Provider to complete: if you later add workers or an office manager, list each new role here and who holds it.]</w:t>
+            </w:r>
+          </w:p>
+        </w:tc>
+      </w:tr>
+    </w:tbl>
+    <w:p>
+      <w:pPr>
+        <w:spacing w:after="120"/>
+      </w:pPr>
+      <w:r>
+        <w:rPr>
+          <w:rFonts w:ascii="Calibri" w:cs="Calibri" w:eastAsia="Calibri" w:hAnsi="Calibri"/>
+          <w:sz w:val="22"/>
+          <w:szCs w:val="22"/>
+        </w:rPr>
+        <w:t xml:space="preserve"/>
+      </w:r>
+    </w:p>
+    <w:p>
+      <w:pPr>
         <w:pStyle w:val="Heading1"/>
         <w:spacing w:after="120" w:before="240"/>
       </w:pPr>
@@ -1448,7 +1791,7 @@
           <w:b/>
           <w:bCs/>
         </w:rPr>
-        <w:t xml:space="preserve">5 How we put this into practice</w:t>
+        <w:t xml:space="preserve">7 Complaints procedure</w:t>
       </w:r>
     </w:p>
     <w:p>
@@ -1461,7 +1804,7 @@
           <w:sz w:val="22"/>
           <w:szCs w:val="22"/>
         </w:rPr>
-        <w:t xml:space="preserve">Sunrise Supports is a sole trader business. We have no workers. The owner carries out every step below for our household tasks supports in New South Wales. If we ever take on workers, we will update this section and train them before they work with participants.</w:t>
+        <w:t xml:space="preserve">Sunrise Supports is a sole trader business delivering 0120 Household tasks in New South Wales. I handle every complaint myself. This section sets out the steps we follow. The definitions are in section 3 Definitions, and the roles are in section 6 Responsibilities.</w:t>
       </w:r>
     </w:p>
     <w:p>
@@ -1469,7 +1812,7 @@
         <w:pStyle w:val="ListParagraph"/>
         <w:numPr>
           <w:ilvl w:val="0"/>
-          <w:numId w:val="3"/>
+          <w:numId w:val="5"/>
         </w:numPr>
         <w:spacing w:after="60"/>
       </w:pPr>
@@ -1479,7 +1822,7 @@
           <w:sz w:val="22"/>
           <w:szCs w:val="22"/>
         </w:rPr>
-        <w:t xml:space="preserve">Before supports start, we tell each participant how to give feedback or make a complaint. We explain it in the way that suits them, such as plain language, large print, Easy Read, spoken words or with an interpreter. We tell them they can bring a family member or an advocate, and that they can go outside Sunrise Supports at any time.</w:t>
+        <w:t xml:space="preserve">Receive the complaint. A participant, a family member, a nominee, an advocate or anyone else can complain in person, by phone, by email, in writing or through another person. We write down what was said and thank the person for raising it.</w:t>
       </w:r>
     </w:p>
     <w:p>
@@ -1487,7 +1830,7 @@
         <w:pStyle w:val="ListParagraph"/>
         <w:numPr>
           <w:ilvl w:val="0"/>
-          <w:numId w:val="3"/>
+          <w:numId w:val="5"/>
         </w:numPr>
         <w:spacing w:after="60"/>
       </w:pPr>
@@ -1497,7 +1840,7 @@
           <w:sz w:val="22"/>
           <w:szCs w:val="22"/>
         </w:rPr>
-        <w:t xml:space="preserve">We make it easy to speak up. We accept feedback and complaints by phone, message, email, in person, or through someone the participant trusts. A participant can complain without using a form. We write down what was said in the person's own words.</w:t>
+        <w:t xml:space="preserve">Offer support. We ask if the person wants an advocate, an interpreter or another kind of help to make or follow the complaint. We make sure the participant gets the supports they need to take part.</w:t>
       </w:r>
     </w:p>
     <w:p>
@@ -1505,7 +1848,7 @@
         <w:pStyle w:val="ListParagraph"/>
         <w:numPr>
           <w:ilvl w:val="0"/>
-          <w:numId w:val="3"/>
+          <w:numId w:val="5"/>
         </w:numPr>
         <w:spacing w:after="60"/>
       </w:pPr>
@@ -1515,7 +1858,7 @@
           <w:sz w:val="22"/>
           <w:szCs w:val="22"/>
         </w:rPr>
-        <w:t xml:space="preserve">We thank the person for raising it. We record it in the Complaints register on the day we receive it. We tell the person we have received it and what happens next. For the timeframes we must meet, see the section on complaint timeframes.</w:t>
+        <w:t xml:space="preserve">Record it. We enter the complaint in the complaints register (see section 8 Complaints register) on the day we receive it, without participant details beyond what the entry needs.</w:t>
       </w:r>
     </w:p>
     <w:p>
@@ -1523,7 +1866,7 @@
         <w:pStyle w:val="ListParagraph"/>
         <w:numPr>
           <w:ilvl w:val="0"/>
-          <w:numId w:val="3"/>
+          <w:numId w:val="5"/>
         </w:numPr>
         <w:spacing w:after="60"/>
       </w:pPr>
@@ -1533,7 +1876,7 @@
           <w:sz w:val="22"/>
           <w:szCs w:val="22"/>
         </w:rPr>
-        <w:t xml:space="preserve">We ask the person what outcome they want. We ask if they want a support person or advocate with them, and how they want us to contact them.</w:t>
+        <w:t xml:space="preserve">Acknowledge it. We tell the person we have received the complaint, who is handling it and what happens next, within the time shown in the table below.</w:t>
       </w:r>
     </w:p>
     <w:p>
@@ -1541,7 +1884,7 @@
         <w:pStyle w:val="ListParagraph"/>
         <w:numPr>
           <w:ilvl w:val="0"/>
-          <w:numId w:val="3"/>
+          <w:numId w:val="5"/>
         </w:numPr>
         <w:spacing w:after="60"/>
       </w:pPr>
@@ -1551,7 +1894,7 @@
           <w:sz w:val="22"/>
           <w:szCs w:val="22"/>
         </w:rPr>
-        <w:t xml:space="preserve">We look into the matter fairly. We listen to the person, collect the facts and keep an open mind. Anyone the complaint is about gets a chance to respond. If the complaint is about us, we tell the participant they can take it to an outside body, and we explain how.</w:t>
+        <w:t xml:space="preserve">Check for urgent risk. If anyone may be at risk of harm, we make them safe first. We then check whether the matter also needs action under the incident management documents listed in section 10 Related documents and registers.</w:t>
       </w:r>
     </w:p>
     <w:p>
@@ -1559,7 +1902,7 @@
         <w:pStyle w:val="ListParagraph"/>
         <w:numPr>
           <w:ilvl w:val="0"/>
-          <w:numId w:val="3"/>
+          <w:numId w:val="5"/>
         </w:numPr>
         <w:spacing w:after="60"/>
       </w:pPr>
@@ -1569,7 +1912,7 @@
           <w:sz w:val="22"/>
           <w:szCs w:val="22"/>
         </w:rPr>
-        <w:t xml:space="preserve">We tell the person the result in the format they prefer. We say what we found, what we will do and by when. We tell them how to take the matter further if they are not satisfied. We ask if they are happy with how we handled it.</w:t>
+        <w:t xml:space="preserve">Look into it fairly. We listen to the complainant and to anyone the complaint is about. We keep an open mind, tell each person what has been said about them and give them a chance to respond. We do not decide before we have all the facts.</w:t>
       </w:r>
     </w:p>
     <w:p>
@@ -1577,7 +1920,7 @@
         <w:pStyle w:val="ListParagraph"/>
         <w:numPr>
           <w:ilvl w:val="0"/>
-          <w:numId w:val="3"/>
+          <w:numId w:val="5"/>
         </w:numPr>
         <w:spacing w:after="60"/>
       </w:pPr>
@@ -1587,7 +1930,7 @@
           <w:sz w:val="22"/>
           <w:szCs w:val="22"/>
         </w:rPr>
-        <w:t xml:space="preserve">We protect the person who raised the matter. Supports carry on as normal. We do not treat anyone worse because they gave feedback or made a complaint.</w:t>
+        <w:t xml:space="preserve">Decide and act. We decide what went wrong, if anything, and what we will do to put it right. We tell the complainant our decision, our reasons and any action we will take, and we check they are satisfied.</w:t>
       </w:r>
     </w:p>
     <w:p>
@@ -1595,7 +1938,7 @@
         <w:pStyle w:val="ListParagraph"/>
         <w:numPr>
           <w:ilvl w:val="0"/>
-          <w:numId w:val="3"/>
+          <w:numId w:val="5"/>
         </w:numPr>
         <w:spacing w:after="60"/>
       </w:pPr>
@@ -1605,7 +1948,7 @@
           <w:sz w:val="22"/>
           <w:szCs w:val="22"/>
         </w:rPr>
-        <w:t xml:space="preserve">We check if the matter is also a reportable incident. If it is, we follow the section on reportable incidents as well as this procedure.</w:t>
+        <w:t xml:space="preserve">Explain further options. If the complainant is not satisfied, we tell them they can complain to the NDIS Quality and Safeguards Commission, and how to do it.</w:t>
       </w:r>
     </w:p>
     <w:p>
@@ -1613,7 +1956,7 @@
         <w:pStyle w:val="ListParagraph"/>
         <w:numPr>
           <w:ilvl w:val="0"/>
-          <w:numId w:val="3"/>
+          <w:numId w:val="5"/>
         </w:numPr>
         <w:spacing w:after="60"/>
       </w:pPr>
@@ -1623,61 +1966,7 @@
           <w:sz w:val="22"/>
           <w:szCs w:val="22"/>
         </w:rPr>
-        <w:t xml:space="preserve">We close the entry in the Complaints register. We record what we found, what we did, the outcome and the date. We keep only the personal information we need and store it securely.</w:t>
-      </w:r>
-    </w:p>
-    <w:p>
-      <w:pPr>
-        <w:pStyle w:val="ListParagraph"/>
-        <w:numPr>
-          <w:ilvl w:val="0"/>
-          <w:numId w:val="3"/>
-        </w:numPr>
-        <w:spacing w:after="60"/>
-      </w:pPr>
-      <w:r>
-        <w:rPr>
-          <w:rFonts w:ascii="Calibri" w:cs="Calibri" w:eastAsia="Calibri" w:hAnsi="Calibri"/>
-          <w:sz w:val="22"/>
-          <w:szCs w:val="22"/>
-        </w:rPr>
-        <w:t xml:space="preserve">We learn from every complaint and every piece of feedback, including praise. We review the Complaints register every 3 months to look for patterns and decide what to change. We note any changes we make.</w:t>
-      </w:r>
-    </w:p>
-    <w:p>
-      <w:pPr>
-        <w:pStyle w:val="ListParagraph"/>
-        <w:numPr>
-          <w:ilvl w:val="0"/>
-          <w:numId w:val="3"/>
-        </w:numPr>
-        <w:spacing w:after="60"/>
-      </w:pPr>
-      <w:r>
-        <w:rPr>
-          <w:rFonts w:ascii="Calibri" w:cs="Calibri" w:eastAsia="Calibri" w:hAnsi="Calibri"/>
-          <w:sz w:val="22"/>
-          <w:szCs w:val="22"/>
-        </w:rPr>
-        <w:t xml:space="preserve">We review this policy every 12 months. At each review we ask participants if our complaints process is easy to find and use, and we make changes based on what they tell us.</w:t>
-      </w:r>
-    </w:p>
-    <w:p>
-      <w:pPr>
-        <w:pStyle w:val="ListParagraph"/>
-        <w:numPr>
-          <w:ilvl w:val="0"/>
-          <w:numId w:val="3"/>
-        </w:numPr>
-        <w:spacing w:after="60"/>
-      </w:pPr>
-      <w:r>
-        <w:rPr>
-          <w:rFonts w:ascii="Calibri" w:cs="Calibri" w:eastAsia="Calibri" w:hAnsi="Calibri"/>
-          <w:sz w:val="22"/>
-          <w:szCs w:val="22"/>
-        </w:rPr>
-        <w:t xml:space="preserve">The owner reads this policy when it is issued and again at each 12-month review, so that we all follow the same steps every time.</w:t>
+        <w:t xml:space="preserve">Close and learn. We record the outcome and the date in the register. We then look for patterns and decide whether any change to our work is needed, and we record that change.</w:t>
       </w:r>
     </w:p>
     <w:tbl>
@@ -1721,7 +2010,7 @@
                 <w:sz w:val="22"/>
                 <w:szCs w:val="22"/>
               </w:rPr>
-              <w:t xml:space="preserve">Role</w:t>
+              <w:t xml:space="preserve">Step</w:t>
             </w:r>
           </w:p>
         </w:tc>
@@ -1745,7 +2034,7 @@
                 <w:sz w:val="22"/>
                 <w:szCs w:val="22"/>
               </w:rPr>
-              <w:t xml:space="preserve">Does what</w:t>
+              <w:t xml:space="preserve">What we do</w:t>
             </w:r>
           </w:p>
         </w:tc>
@@ -1792,7 +2081,7 @@
                 <w:sz w:val="22"/>
                 <w:szCs w:val="22"/>
               </w:rPr>
-              <w:t xml:space="preserve">Owner of Sunrise Supports</w:t>
+              <w:t xml:space="preserve">Acknowledge</w:t>
             </w:r>
           </w:p>
         </w:tc>
@@ -1813,7 +2102,7 @@
                 <w:sz w:val="22"/>
                 <w:szCs w:val="22"/>
               </w:rPr>
-              <w:t xml:space="preserve">Gives participants complaint information, receives and records feedback and complaints, investigates, replies and closes each entry</w:t>
+              <w:t xml:space="preserve">Tell the person we have their complaint and who is handling it</w:t>
             </w:r>
           </w:p>
         </w:tc>
@@ -1834,7 +2123,7 @@
                 <w:sz w:val="22"/>
                 <w:szCs w:val="22"/>
               </w:rPr>
-              <w:t xml:space="preserve">Before supports start, then for every complaint as it arises</w:t>
+              <w:t xml:space="preserve">Within the timeframe set out in section 4 Policy statement</w:t>
             </w:r>
           </w:p>
         </w:tc>
@@ -1857,7 +2146,7 @@
                 <w:sz w:val="22"/>
                 <w:szCs w:val="22"/>
               </w:rPr>
-              <w:t xml:space="preserve">Owner of Sunrise Supports</w:t>
+              <w:t xml:space="preserve">Resolve</w:t>
             </w:r>
           </w:p>
         </w:tc>
@@ -1878,7 +2167,7 @@
                 <w:sz w:val="22"/>
                 <w:szCs w:val="22"/>
               </w:rPr>
-              <w:t xml:space="preserve">Reviews the Complaints register for patterns and makes improvements</w:t>
+              <w:t xml:space="preserve">Give the person our decision, reasons and actions</w:t>
             </w:r>
           </w:p>
         </w:tc>
@@ -1899,7 +2188,7 @@
                 <w:sz w:val="22"/>
                 <w:szCs w:val="22"/>
               </w:rPr>
-              <w:t xml:space="preserve">Every 3 months</w:t>
+              <w:t xml:space="preserve">Within the timeframe set out in section 4 Policy statement</w:t>
             </w:r>
           </w:p>
         </w:tc>
@@ -1922,7 +2211,7 @@
                 <w:sz w:val="22"/>
                 <w:szCs w:val="22"/>
               </w:rPr>
-              <w:t xml:space="preserve">Owner of Sunrise Supports</w:t>
+              <w:t xml:space="preserve">Keep informed</w:t>
             </w:r>
           </w:p>
         </w:tc>
@@ -1943,7 +2232,7 @@
                 <w:sz w:val="22"/>
                 <w:szCs w:val="22"/>
               </w:rPr>
-              <w:t xml:space="preserve">Reviews this policy and asks participants about accessibility</w:t>
+              <w:t xml:space="preserve">Update the person if the matter is taking longer than expected</w:t>
             </w:r>
           </w:p>
         </w:tc>
@@ -1964,7 +2253,72 @@
                 <w:sz w:val="22"/>
                 <w:szCs w:val="22"/>
               </w:rPr>
-              <w:t xml:space="preserve">Every 12 months</w:t>
+              <w:t xml:space="preserve">At each delay, and at least as often as we agreed with them</w:t>
+            </w:r>
+          </w:p>
+        </w:tc>
+      </w:tr>
+      <w:tr>
+        <w:tc>
+          <w:tcPr>
+            <w:tcW w:type="dxa" w:w="3000"/>
+            <w:tcBorders>
+              <w:top w:val="single" w:color="999999" w:sz="4"/>
+              <w:left w:val="single" w:color="999999" w:sz="4"/>
+              <w:bottom w:val="single" w:color="999999" w:sz="4"/>
+              <w:right w:val="single" w:color="999999" w:sz="4"/>
+            </w:tcBorders>
+          </w:tcPr>
+          <w:p>
+            <w:r>
+              <w:rPr>
+                <w:rFonts w:ascii="Calibri" w:cs="Calibri" w:eastAsia="Calibri" w:hAnsi="Calibri"/>
+                <w:sz w:val="22"/>
+                <w:szCs w:val="22"/>
+              </w:rPr>
+              <w:t xml:space="preserve">Record and review</w:t>
+            </w:r>
+          </w:p>
+        </w:tc>
+        <w:tc>
+          <w:tcPr>
+            <w:tcW w:type="dxa" w:w="3000"/>
+            <w:tcBorders>
+              <w:top w:val="single" w:color="999999" w:sz="4"/>
+              <w:left w:val="single" w:color="999999" w:sz="4"/>
+              <w:bottom w:val="single" w:color="999999" w:sz="4"/>
+              <w:right w:val="single" w:color="999999" w:sz="4"/>
+            </w:tcBorders>
+          </w:tcPr>
+          <w:p>
+            <w:r>
+              <w:rPr>
+                <w:rFonts w:ascii="Calibri" w:cs="Calibri" w:eastAsia="Calibri" w:hAnsi="Calibri"/>
+                <w:sz w:val="22"/>
+                <w:szCs w:val="22"/>
+              </w:rPr>
+              <w:t xml:space="preserve">Complete the register entry and note any improvement</w:t>
+            </w:r>
+          </w:p>
+        </w:tc>
+        <w:tc>
+          <w:tcPr>
+            <w:tcW w:type="dxa" w:w="3000"/>
+            <w:tcBorders>
+              <w:top w:val="single" w:color="999999" w:sz="4"/>
+              <w:left w:val="single" w:color="999999" w:sz="4"/>
+              <w:bottom w:val="single" w:color="999999" w:sz="4"/>
+              <w:right w:val="single" w:color="999999" w:sz="4"/>
+            </w:tcBorders>
+          </w:tcPr>
+          <w:p>
+            <w:r>
+              <w:rPr>
+                <w:rFonts w:ascii="Calibri" w:cs="Calibri" w:eastAsia="Calibri" w:hAnsi="Calibri"/>
+                <w:sz w:val="22"/>
+                <w:szCs w:val="22"/>
+              </w:rPr>
+              <w:t xml:space="preserve">When the complaint is closed</w:t>
             </w:r>
           </w:p>
         </w:tc>
@@ -1981,6 +2335,32 @@
           <w:szCs w:val="22"/>
         </w:rPr>
         <w:t xml:space="preserve"/>
+      </w:r>
+    </w:p>
+    <w:p>
+      <w:pPr>
+        <w:spacing w:after="120"/>
+      </w:pPr>
+      <w:r>
+        <w:rPr>
+          <w:rFonts w:ascii="Calibri" w:cs="Calibri" w:eastAsia="Calibri" w:hAnsi="Calibri"/>
+          <w:sz w:val="22"/>
+          <w:szCs w:val="22"/>
+        </w:rPr>
+        <w:t xml:space="preserve">The statutory timeframes and the Commission's definitions are not restated here. Use the ones set out in section 3 Definitions and section 4 Policy statement.</w:t>
+      </w:r>
+    </w:p>
+    <w:p>
+      <w:pPr>
+        <w:spacing w:after="120"/>
+      </w:pPr>
+      <w:r>
+        <w:rPr>
+          <w:rFonts w:ascii="Calibri" w:cs="Calibri" w:eastAsia="Calibri" w:hAnsi="Calibri"/>
+          <w:sz w:val="22"/>
+          <w:szCs w:val="22"/>
+        </w:rPr>
+        <w:t xml:space="preserve">A participant, or anyone acting for them, can complain to the NDIS Quality and Safeguards Commission at any time. They do not have to complain to us first, and they do not have to wait for our process to finish. They can contact the Commission by phone, in writing or through its website, and we give them the current contact details when we explain their options.</w:t>
       </w:r>
     </w:p>
     <w:tbl>
@@ -2019,7 +2399,7 @@
                 <w:sz w:val="22"/>
                 <w:szCs w:val="22"/>
               </w:rPr>
-              <w:t xml:space="preserve">[Provider to complete: the phone number, email address and postal address where participants can send feedback or complaints to Sunrise Supports.]</w:t>
+              <w:t xml:space="preserve">[Provider to complete: Sunrise Supports phone number and email address for making a complaint, and the Commission's current contact details as at the date of issue.]</w:t>
             </w:r>
           </w:p>
         </w:tc>
@@ -2040,20 +2420,6 @@
     </w:p>
     <w:p>
       <w:pPr>
-        <w:pStyle w:val="Heading1"/>
-        <w:spacing w:after="120" w:before="240"/>
-      </w:pPr>
-      <w:r>
-        <w:rPr>
-          <w:rFonts w:ascii="Calibri" w:cs="Calibri" w:eastAsia="Calibri" w:hAnsi="Calibri"/>
-          <w:b/>
-          <w:bCs/>
-        </w:rPr>
-        <w:t xml:space="preserve">6 Responsibilities</w:t>
-      </w:r>
-    </w:p>
-    <w:p>
-      <w:pPr>
         <w:spacing w:after="120"/>
       </w:pPr>
       <w:r>
@@ -2062,1266 +2428,7 @@
           <w:sz w:val="22"/>
           <w:szCs w:val="22"/>
         </w:rPr>
-        <w:t xml:space="preserve">Sunrise Supports is a sole trader business. We have one worker, who is also our only key person. This means one person holds every role in our complaints system. The table below shows what each role does and when.</w:t>
-      </w:r>
-    </w:p>
-    <w:tbl>
-      <w:tblPr>
-        <w:tblW w:type="dxa" w:w="9000"/>
-        <w:tblBorders>
-          <w:top w:val="single" w:color="auto" w:sz="4"/>
-          <w:left w:val="single" w:color="auto" w:sz="4"/>
-          <w:bottom w:val="single" w:color="auto" w:sz="4"/>
-          <w:right w:val="single" w:color="auto" w:sz="4"/>
-          <w:insideH w:val="single" w:color="auto" w:sz="4"/>
-          <w:insideV w:val="single" w:color="auto" w:sz="4"/>
-        </w:tblBorders>
-      </w:tblPr>
-      <w:tblGrid>
-        <w:gridCol w:w="3000"/>
-        <w:gridCol w:w="3000"/>
-        <w:gridCol w:w="3000"/>
-      </w:tblGrid>
-      <w:tr>
-        <w:trPr>
-          <w:tblHeader/>
-        </w:trPr>
-        <w:tc>
-          <w:tcPr>
-            <w:tcW w:type="dxa" w:w="3000"/>
-            <w:tcBorders>
-              <w:top w:val="single" w:color="999999" w:sz="4"/>
-              <w:left w:val="single" w:color="999999" w:sz="4"/>
-              <w:bottom w:val="single" w:color="999999" w:sz="4"/>
-              <w:right w:val="single" w:color="999999" w:sz="4"/>
-            </w:tcBorders>
-            <w:shd w:fill="EEEEEE" w:val="clear"/>
-          </w:tcPr>
-          <w:p>
-            <w:r>
-              <w:rPr>
-                <w:rFonts w:ascii="Calibri" w:cs="Calibri" w:eastAsia="Calibri" w:hAnsi="Calibri"/>
-                <w:b/>
-                <w:bCs/>
-                <w:sz w:val="22"/>
-                <w:szCs w:val="22"/>
-              </w:rPr>
-              <w:t xml:space="preserve">Role</w:t>
-            </w:r>
-          </w:p>
-        </w:tc>
-        <w:tc>
-          <w:tcPr>
-            <w:tcW w:type="dxa" w:w="3000"/>
-            <w:tcBorders>
-              <w:top w:val="single" w:color="999999" w:sz="4"/>
-              <w:left w:val="single" w:color="999999" w:sz="4"/>
-              <w:bottom w:val="single" w:color="999999" w:sz="4"/>
-              <w:right w:val="single" w:color="999999" w:sz="4"/>
-            </w:tcBorders>
-            <w:shd w:fill="EEEEEE" w:val="clear"/>
-          </w:tcPr>
-          <w:p>
-            <w:r>
-              <w:rPr>
-                <w:rFonts w:ascii="Calibri" w:cs="Calibri" w:eastAsia="Calibri" w:hAnsi="Calibri"/>
-                <w:b/>
-                <w:bCs/>
-                <w:sz w:val="22"/>
-                <w:szCs w:val="22"/>
-              </w:rPr>
-              <w:t xml:space="preserve">Does what</w:t>
-            </w:r>
-          </w:p>
-        </w:tc>
-        <w:tc>
-          <w:tcPr>
-            <w:tcW w:type="dxa" w:w="3000"/>
-            <w:tcBorders>
-              <w:top w:val="single" w:color="999999" w:sz="4"/>
-              <w:left w:val="single" w:color="999999" w:sz="4"/>
-              <w:bottom w:val="single" w:color="999999" w:sz="4"/>
-              <w:right w:val="single" w:color="999999" w:sz="4"/>
-            </w:tcBorders>
-            <w:shd w:fill="EEEEEE" w:val="clear"/>
-          </w:tcPr>
-          <w:p>
-            <w:r>
-              <w:rPr>
-                <w:rFonts w:ascii="Calibri" w:cs="Calibri" w:eastAsia="Calibri" w:hAnsi="Calibri"/>
-                <w:b/>
-                <w:bCs/>
-                <w:sz w:val="22"/>
-                <w:szCs w:val="22"/>
-              </w:rPr>
-              <w:t xml:space="preserve">When</w:t>
-            </w:r>
-          </w:p>
-        </w:tc>
-      </w:tr>
-      <w:tr>
-        <w:tc>
-          <w:tcPr>
-            <w:tcW w:type="dxa" w:w="3000"/>
-            <w:tcBorders>
-              <w:top w:val="single" w:color="999999" w:sz="4"/>
-              <w:left w:val="single" w:color="999999" w:sz="4"/>
-              <w:bottom w:val="single" w:color="999999" w:sz="4"/>
-              <w:right w:val="single" w:color="999999" w:sz="4"/>
-            </w:tcBorders>
-          </w:tcPr>
-          <w:p>
-            <w:r>
-              <w:rPr>
-                <w:rFonts w:ascii="Calibri" w:cs="Calibri" w:eastAsia="Calibri" w:hAnsi="Calibri"/>
-                <w:sz w:val="22"/>
-                <w:szCs w:val="22"/>
-              </w:rPr>
-              <w:t xml:space="preserve">Owner and worker (Sunrise Supports)</w:t>
-            </w:r>
-          </w:p>
-        </w:tc>
-        <w:tc>
-          <w:tcPr>
-            <w:tcW w:type="dxa" w:w="3000"/>
-            <w:tcBorders>
-              <w:top w:val="single" w:color="999999" w:sz="4"/>
-              <w:left w:val="single" w:color="999999" w:sz="4"/>
-              <w:bottom w:val="single" w:color="999999" w:sz="4"/>
-              <w:right w:val="single" w:color="999999" w:sz="4"/>
-            </w:tcBorders>
-          </w:tcPr>
-          <w:p>
-            <w:r>
-              <w:rPr>
-                <w:rFonts w:ascii="Calibri" w:cs="Calibri" w:eastAsia="Calibri" w:hAnsi="Calibri"/>
-                <w:sz w:val="22"/>
-                <w:szCs w:val="22"/>
-              </w:rPr>
-              <w:t xml:space="preserve">Welcomes and acknowledges all feedback and complaints. Resolves them fairly, listens to all sides, and records each one in the Complaints register.</w:t>
-            </w:r>
-          </w:p>
-        </w:tc>
-        <w:tc>
-          <w:tcPr>
-            <w:tcW w:type="dxa" w:w="3000"/>
-            <w:tcBorders>
-              <w:top w:val="single" w:color="999999" w:sz="4"/>
-              <w:left w:val="single" w:color="999999" w:sz="4"/>
-              <w:bottom w:val="single" w:color="999999" w:sz="4"/>
-              <w:right w:val="single" w:color="999999" w:sz="4"/>
-            </w:tcBorders>
-          </w:tcPr>
-          <w:p>
-            <w:r>
-              <w:rPr>
-                <w:rFonts w:ascii="Calibri" w:cs="Calibri" w:eastAsia="Calibri" w:hAnsi="Calibri"/>
-                <w:sz w:val="22"/>
-                <w:szCs w:val="22"/>
-              </w:rPr>
-              <w:t xml:space="preserve">Each time feedback or a complaint is received. Timeframes are in section 3 What we do.</w:t>
-            </w:r>
-          </w:p>
-        </w:tc>
-      </w:tr>
-      <w:tr>
-        <w:tc>
-          <w:tcPr>
-            <w:tcW w:type="dxa" w:w="3000"/>
-            <w:tcBorders>
-              <w:top w:val="single" w:color="999999" w:sz="4"/>
-              <w:left w:val="single" w:color="999999" w:sz="4"/>
-              <w:bottom w:val="single" w:color="999999" w:sz="4"/>
-              <w:right w:val="single" w:color="999999" w:sz="4"/>
-            </w:tcBorders>
-          </w:tcPr>
-          <w:p>
-            <w:r>
-              <w:rPr>
-                <w:rFonts w:ascii="Calibri" w:cs="Calibri" w:eastAsia="Calibri" w:hAnsi="Calibri"/>
-                <w:sz w:val="22"/>
-                <w:szCs w:val="22"/>
-              </w:rPr>
-              <w:t xml:space="preserve">Owner and worker (Sunrise Supports)</w:t>
-            </w:r>
-          </w:p>
-        </w:tc>
-        <w:tc>
-          <w:tcPr>
-            <w:tcW w:type="dxa" w:w="3000"/>
-            <w:tcBorders>
-              <w:top w:val="single" w:color="999999" w:sz="4"/>
-              <w:left w:val="single" w:color="999999" w:sz="4"/>
-              <w:bottom w:val="single" w:color="999999" w:sz="4"/>
-              <w:right w:val="single" w:color="999999" w:sz="4"/>
-            </w:tcBorders>
-          </w:tcPr>
-          <w:p>
-            <w:r>
-              <w:rPr>
-                <w:rFonts w:ascii="Calibri" w:cs="Calibri" w:eastAsia="Calibri" w:hAnsi="Calibri"/>
-                <w:sz w:val="22"/>
-                <w:szCs w:val="22"/>
-              </w:rPr>
-              <w:t xml:space="preserve">Tells each participant how to give feedback or make a complaint. This includes ways to complain outside Sunrise Supports and the right to use an advocate.</w:t>
-            </w:r>
-          </w:p>
-        </w:tc>
-        <w:tc>
-          <w:tcPr>
-            <w:tcW w:type="dxa" w:w="3000"/>
-            <w:tcBorders>
-              <w:top w:val="single" w:color="999999" w:sz="4"/>
-              <w:left w:val="single" w:color="999999" w:sz="4"/>
-              <w:bottom w:val="single" w:color="999999" w:sz="4"/>
-              <w:right w:val="single" w:color="999999" w:sz="4"/>
-            </w:tcBorders>
-          </w:tcPr>
-          <w:p>
-            <w:r>
-              <w:rPr>
-                <w:rFonts w:ascii="Calibri" w:cs="Calibri" w:eastAsia="Calibri" w:hAnsi="Calibri"/>
-                <w:sz w:val="22"/>
-                <w:szCs w:val="22"/>
-              </w:rPr>
-              <w:t xml:space="preserve">Before we start supports, and again whenever a participant asks.</w:t>
-            </w:r>
-          </w:p>
-        </w:tc>
-      </w:tr>
-      <w:tr>
-        <w:tc>
-          <w:tcPr>
-            <w:tcW w:type="dxa" w:w="3000"/>
-            <w:tcBorders>
-              <w:top w:val="single" w:color="999999" w:sz="4"/>
-              <w:left w:val="single" w:color="999999" w:sz="4"/>
-              <w:bottom w:val="single" w:color="999999" w:sz="4"/>
-              <w:right w:val="single" w:color="999999" w:sz="4"/>
-            </w:tcBorders>
-          </w:tcPr>
-          <w:p>
-            <w:r>
-              <w:rPr>
-                <w:rFonts w:ascii="Calibri" w:cs="Calibri" w:eastAsia="Calibri" w:hAnsi="Calibri"/>
-                <w:sz w:val="22"/>
-                <w:szCs w:val="22"/>
-              </w:rPr>
-              <w:t xml:space="preserve">Owner and worker (Sunrise Supports)</w:t>
-            </w:r>
-          </w:p>
-        </w:tc>
-        <w:tc>
-          <w:tcPr>
-            <w:tcW w:type="dxa" w:w="3000"/>
-            <w:tcBorders>
-              <w:top w:val="single" w:color="999999" w:sz="4"/>
-              <w:left w:val="single" w:color="999999" w:sz="4"/>
-              <w:bottom w:val="single" w:color="999999" w:sz="4"/>
-              <w:right w:val="single" w:color="999999" w:sz="4"/>
-            </w:tcBorders>
-          </w:tcPr>
-          <w:p>
-            <w:r>
-              <w:rPr>
-                <w:rFonts w:ascii="Calibri" w:cs="Calibri" w:eastAsia="Calibri" w:hAnsi="Calibri"/>
-                <w:sz w:val="22"/>
-                <w:szCs w:val="22"/>
-              </w:rPr>
-              <w:t xml:space="preserve">Reviews the Complaints register. Looks for patterns and records any changes we make to our work.</w:t>
-            </w:r>
-          </w:p>
-        </w:tc>
-        <w:tc>
-          <w:tcPr>
-            <w:tcW w:type="dxa" w:w="3000"/>
-            <w:tcBorders>
-              <w:top w:val="single" w:color="999999" w:sz="4"/>
-              <w:left w:val="single" w:color="999999" w:sz="4"/>
-              <w:bottom w:val="single" w:color="999999" w:sz="4"/>
-              <w:right w:val="single" w:color="999999" w:sz="4"/>
-            </w:tcBorders>
-          </w:tcPr>
-          <w:p>
-            <w:r>
-              <w:rPr>
-                <w:rFonts w:ascii="Calibri" w:cs="Calibri" w:eastAsia="Calibri" w:hAnsi="Calibri"/>
-                <w:sz w:val="22"/>
-                <w:szCs w:val="22"/>
-              </w:rPr>
-              <w:t xml:space="preserve">Every 3 months.</w:t>
-            </w:r>
-          </w:p>
-        </w:tc>
-      </w:tr>
-      <w:tr>
-        <w:tc>
-          <w:tcPr>
-            <w:tcW w:type="dxa" w:w="3000"/>
-            <w:tcBorders>
-              <w:top w:val="single" w:color="999999" w:sz="4"/>
-              <w:left w:val="single" w:color="999999" w:sz="4"/>
-              <w:bottom w:val="single" w:color="999999" w:sz="4"/>
-              <w:right w:val="single" w:color="999999" w:sz="4"/>
-            </w:tcBorders>
-          </w:tcPr>
-          <w:p>
-            <w:r>
-              <w:rPr>
-                <w:rFonts w:ascii="Calibri" w:cs="Calibri" w:eastAsia="Calibri" w:hAnsi="Calibri"/>
-                <w:sz w:val="22"/>
-                <w:szCs w:val="22"/>
-              </w:rPr>
-              <w:t xml:space="preserve">Owner and worker (Sunrise Supports)</w:t>
-            </w:r>
-          </w:p>
-        </w:tc>
-        <w:tc>
-          <w:tcPr>
-            <w:tcW w:type="dxa" w:w="3000"/>
-            <w:tcBorders>
-              <w:top w:val="single" w:color="999999" w:sz="4"/>
-              <w:left w:val="single" w:color="999999" w:sz="4"/>
-              <w:bottom w:val="single" w:color="999999" w:sz="4"/>
-              <w:right w:val="single" w:color="999999" w:sz="4"/>
-            </w:tcBorders>
-          </w:tcPr>
-          <w:p>
-            <w:r>
-              <w:rPr>
-                <w:rFonts w:ascii="Calibri" w:cs="Calibri" w:eastAsia="Calibri" w:hAnsi="Calibri"/>
-                <w:sz w:val="22"/>
-                <w:szCs w:val="22"/>
-              </w:rPr>
-              <w:t xml:space="preserve">Reviews this policy and procedure. Asks participants how easy our complaints process is to use and updates the document.</w:t>
-            </w:r>
-          </w:p>
-        </w:tc>
-        <w:tc>
-          <w:tcPr>
-            <w:tcW w:type="dxa" w:w="3000"/>
-            <w:tcBorders>
-              <w:top w:val="single" w:color="999999" w:sz="4"/>
-              <w:left w:val="single" w:color="999999" w:sz="4"/>
-              <w:bottom w:val="single" w:color="999999" w:sz="4"/>
-              <w:right w:val="single" w:color="999999" w:sz="4"/>
-            </w:tcBorders>
-          </w:tcPr>
-          <w:p>
-            <w:r>
-              <w:rPr>
-                <w:rFonts w:ascii="Calibri" w:cs="Calibri" w:eastAsia="Calibri" w:hAnsi="Calibri"/>
-                <w:sz w:val="22"/>
-                <w:szCs w:val="22"/>
-              </w:rPr>
-              <w:t xml:space="preserve">Every 12 months.</w:t>
-            </w:r>
-          </w:p>
-        </w:tc>
-      </w:tr>
-      <w:tr>
-        <w:tc>
-          <w:tcPr>
-            <w:tcW w:type="dxa" w:w="3000"/>
-            <w:tcBorders>
-              <w:top w:val="single" w:color="999999" w:sz="4"/>
-              <w:left w:val="single" w:color="999999" w:sz="4"/>
-              <w:bottom w:val="single" w:color="999999" w:sz="4"/>
-              <w:right w:val="single" w:color="999999" w:sz="4"/>
-            </w:tcBorders>
-          </w:tcPr>
-          <w:p>
-            <w:r>
-              <w:rPr>
-                <w:rFonts w:ascii="Calibri" w:cs="Calibri" w:eastAsia="Calibri" w:hAnsi="Calibri"/>
-                <w:sz w:val="22"/>
-                <w:szCs w:val="22"/>
-              </w:rPr>
-              <w:t xml:space="preserve">Participants and other people</w:t>
-            </w:r>
-          </w:p>
-        </w:tc>
-        <w:tc>
-          <w:tcPr>
-            <w:tcW w:type="dxa" w:w="3000"/>
-            <w:tcBorders>
-              <w:top w:val="single" w:color="999999" w:sz="4"/>
-              <w:left w:val="single" w:color="999999" w:sz="4"/>
-              <w:bottom w:val="single" w:color="999999" w:sz="4"/>
-              <w:right w:val="single" w:color="999999" w:sz="4"/>
-            </w:tcBorders>
-          </w:tcPr>
-          <w:p>
-            <w:r>
-              <w:rPr>
-                <w:rFonts w:ascii="Calibri" w:cs="Calibri" w:eastAsia="Calibri" w:hAnsi="Calibri"/>
-                <w:sz w:val="22"/>
-                <w:szCs w:val="22"/>
-              </w:rPr>
-              <w:t xml:space="preserve">Give feedback or make a complaint in any way that suits them. They may bring a family member, friend or advocate to support them.</w:t>
-            </w:r>
-          </w:p>
-        </w:tc>
-        <w:tc>
-          <w:tcPr>
-            <w:tcW w:type="dxa" w:w="3000"/>
-            <w:tcBorders>
-              <w:top w:val="single" w:color="999999" w:sz="4"/>
-              <w:left w:val="single" w:color="999999" w:sz="4"/>
-              <w:bottom w:val="single" w:color="999999" w:sz="4"/>
-              <w:right w:val="single" w:color="999999" w:sz="4"/>
-            </w:tcBorders>
-          </w:tcPr>
-          <w:p>
-            <w:r>
-              <w:rPr>
-                <w:rFonts w:ascii="Calibri" w:cs="Calibri" w:eastAsia="Calibri" w:hAnsi="Calibri"/>
-                <w:sz w:val="22"/>
-                <w:szCs w:val="22"/>
-              </w:rPr>
-              <w:t xml:space="preserve">At any time.</w:t>
-            </w:r>
-          </w:p>
-        </w:tc>
-      </w:tr>
-    </w:tbl>
-    <w:p>
-      <w:pPr>
-        <w:spacing w:after="120"/>
-      </w:pPr>
-      <w:r>
-        <w:rPr>
-          <w:rFonts w:ascii="Calibri" w:cs="Calibri" w:eastAsia="Calibri" w:hAnsi="Calibri"/>
-          <w:sz w:val="22"/>
-          <w:szCs w:val="22"/>
-        </w:rPr>
-        <w:t xml:space="preserve"/>
-      </w:r>
-    </w:p>
-    <w:p>
-      <w:pPr>
-        <w:spacing w:after="120"/>
-      </w:pPr>
-      <w:r>
-        <w:rPr>
-          <w:rFonts w:ascii="Calibri" w:cs="Calibri" w:eastAsia="Calibri" w:hAnsi="Calibri"/>
-          <w:sz w:val="22"/>
-          <w:szCs w:val="22"/>
-        </w:rPr>
-        <w:t xml:space="preserve">If a complaint is about us, we still record it in the Complaints register and acknowledge it. We also tell the person they can take it to someone outside Sunrise Supports, including the Commission. The steps for this are in section 3 What we do.</w:t>
-      </w:r>
-    </w:p>
-    <w:tbl>
-      <w:tblPr>
-        <w:tblW w:type="dxa" w:w="9000"/>
-        <w:tblBorders>
-          <w:top w:val="single" w:color="auto" w:sz="4"/>
-          <w:left w:val="single" w:color="auto" w:sz="4"/>
-          <w:bottom w:val="single" w:color="auto" w:sz="4"/>
-          <w:right w:val="single" w:color="auto" w:sz="4"/>
-          <w:insideH w:val="single" w:color="auto" w:sz="4"/>
-          <w:insideV w:val="single" w:color="auto" w:sz="4"/>
-        </w:tblBorders>
-      </w:tblPr>
-      <w:tblGrid>
-        <w:gridCol w:w="9000"/>
-      </w:tblGrid>
-      <w:tr>
-        <w:tc>
-          <w:tcPr>
-            <w:tcW w:type="dxa" w:w="9000"/>
-            <w:tcBorders>
-              <w:top w:val="single" w:color="999999" w:sz="4"/>
-              <w:left w:val="single" w:color="999999" w:sz="4"/>
-              <w:bottom w:val="single" w:color="999999" w:sz="4"/>
-              <w:right w:val="single" w:color="999999" w:sz="4"/>
-            </w:tcBorders>
-            <w:shd w:fill="FFF4CE" w:val="clear"/>
-          </w:tcPr>
-          <w:p>
-            <w:r>
-              <w:rPr>
-                <w:rFonts w:ascii="Calibri" w:cs="Calibri" w:eastAsia="Calibri" w:hAnsi="Calibri"/>
-                <w:i/>
-                <w:iCs/>
-                <w:sz w:val="22"/>
-                <w:szCs w:val="22"/>
-              </w:rPr>
-              <w:t xml:space="preserve">[Provider to complete: name an independent person, such as a trusted colleague or adviser, who can review a complaint about the owner, or write that none is available.]</w:t>
-            </w:r>
-          </w:p>
-        </w:tc>
-      </w:tr>
-    </w:tbl>
-    <w:p>
-      <w:pPr>
-        <w:spacing w:after="120"/>
-      </w:pPr>
-      <w:r>
-        <w:rPr>
-          <w:rFonts w:ascii="Calibri" w:cs="Calibri" w:eastAsia="Calibri" w:hAnsi="Calibri"/>
-          <w:sz w:val="22"/>
-          <w:szCs w:val="22"/>
-        </w:rPr>
-        <w:t xml:space="preserve"/>
-      </w:r>
-    </w:p>
-    <w:p>
-      <w:pPr>
-        <w:spacing w:after="120"/>
-      </w:pPr>
-      <w:r>
-        <w:rPr>
-          <w:rFonts w:ascii="Calibri" w:cs="Calibri" w:eastAsia="Calibri" w:hAnsi="Calibri"/>
-          <w:sz w:val="22"/>
-          <w:szCs w:val="22"/>
-        </w:rPr>
-        <w:t xml:space="preserve">If we start to engage other workers, we will update this table before they begin work. We will also train them in these procedures before they handle any feedback or complaint.</w:t>
-      </w:r>
-    </w:p>
-    <w:p>
-      <w:pPr>
-        <w:pStyle w:val="Heading1"/>
-        <w:spacing w:after="120" w:before="240"/>
-      </w:pPr>
-      <w:r>
-        <w:rPr>
-          <w:rFonts w:ascii="Calibri" w:cs="Calibri" w:eastAsia="Calibri" w:hAnsi="Calibri"/>
-          <w:b/>
-          <w:bCs/>
-        </w:rPr>
-        <w:t xml:space="preserve">7 Complaints procedure</w:t>
-      </w:r>
-    </w:p>
-    <w:p>
-      <w:pPr>
-        <w:spacing w:after="120"/>
-      </w:pPr>
-      <w:r>
-        <w:rPr>
-          <w:rFonts w:ascii="Calibri" w:cs="Calibri" w:eastAsia="Calibri" w:hAnsi="Calibri"/>
-          <w:sz w:val="22"/>
-          <w:szCs w:val="22"/>
-        </w:rPr>
-        <w:t xml:space="preserve">Sunrise Supports is run by one person. We receive, record and resolve complaints ourselves. Anyone can complain: a participant, a family member, an advocate or another person. We welcome feedback as well as complaints. We treat both with respect.</w:t>
-      </w:r>
-    </w:p>
-    <w:p>
-      <w:pPr>
-        <w:pStyle w:val="ListParagraph"/>
-        <w:numPr>
-          <w:ilvl w:val="0"/>
-          <w:numId w:val="4"/>
-        </w:numPr>
-        <w:spacing w:after="60"/>
-      </w:pPr>
-      <w:r>
-        <w:rPr>
-          <w:rFonts w:ascii="Calibri" w:cs="Calibri" w:eastAsia="Calibri" w:hAnsi="Calibri"/>
-          <w:sz w:val="22"/>
-          <w:szCs w:val="22"/>
-        </w:rPr>
-        <w:t xml:space="preserve">Receive. A person can tell us in any way that suits them: by phone, in writing, in person or through an advocate. They do not need to use a form or a special word. We listen and do not ask them to justify why they are unhappy.</w:t>
-      </w:r>
-    </w:p>
-    <w:p>
-      <w:pPr>
-        <w:pStyle w:val="ListParagraph"/>
-        <w:numPr>
-          <w:ilvl w:val="0"/>
-          <w:numId w:val="4"/>
-        </w:numPr>
-        <w:spacing w:after="60"/>
-      </w:pPr>
-      <w:r>
-        <w:rPr>
-          <w:rFonts w:ascii="Calibri" w:cs="Calibri" w:eastAsia="Calibri" w:hAnsi="Calibri"/>
-          <w:sz w:val="22"/>
-          <w:szCs w:val="22"/>
-        </w:rPr>
-        <w:t xml:space="preserve">Record. We write the complaint in the Complaints register on the day we receive it. We use a reference number, not the participant's personal details, in any text we share.</w:t>
-      </w:r>
-    </w:p>
-    <w:p>
-      <w:pPr>
-        <w:pStyle w:val="ListParagraph"/>
-        <w:numPr>
-          <w:ilvl w:val="0"/>
-          <w:numId w:val="4"/>
-        </w:numPr>
-        <w:spacing w:after="60"/>
-      </w:pPr>
-      <w:r>
-        <w:rPr>
-          <w:rFonts w:ascii="Calibri" w:cs="Calibri" w:eastAsia="Calibri" w:hAnsi="Calibri"/>
-          <w:sz w:val="22"/>
-          <w:szCs w:val="22"/>
-        </w:rPr>
-        <w:t xml:space="preserve">Acknowledge. We tell the person we have received the complaint and who is dealing with it. We use the timeframe set out in the Commission's complaints rules (see the section of this document that holds those rules).</w:t>
-      </w:r>
-    </w:p>
-    <w:p>
-      <w:pPr>
-        <w:pStyle w:val="ListParagraph"/>
-        <w:numPr>
-          <w:ilvl w:val="0"/>
-          <w:numId w:val="4"/>
-        </w:numPr>
-        <w:spacing w:after="60"/>
-      </w:pPr>
-      <w:r>
-        <w:rPr>
-          <w:rFonts w:ascii="Calibri" w:cs="Calibri" w:eastAsia="Calibri" w:hAnsi="Calibri"/>
-          <w:sz w:val="22"/>
-          <w:szCs w:val="22"/>
-        </w:rPr>
-        <w:t xml:space="preserve">Check for incidents. If the complaint describes an injury, abuse, neglect or another event that may be reportable, we handle it under our incident process as well (see the Reportable incidents section).</w:t>
-      </w:r>
-    </w:p>
-    <w:p>
-      <w:pPr>
-        <w:pStyle w:val="ListParagraph"/>
-        <w:numPr>
-          <w:ilvl w:val="0"/>
-          <w:numId w:val="4"/>
-        </w:numPr>
-        <w:spacing w:after="60"/>
-      </w:pPr>
-      <w:r>
-        <w:rPr>
-          <w:rFonts w:ascii="Calibri" w:cs="Calibri" w:eastAsia="Calibri" w:hAnsi="Calibri"/>
-          <w:sz w:val="22"/>
-          <w:szCs w:val="22"/>
-        </w:rPr>
-        <w:t xml:space="preserve">Look into it. We gather the facts, hear the person's account and give them the chance to respond to what we find. We act fairly and do not decide before we have the facts.</w:t>
-      </w:r>
-    </w:p>
-    <w:p>
-      <w:pPr>
-        <w:pStyle w:val="ListParagraph"/>
-        <w:numPr>
-          <w:ilvl w:val="0"/>
-          <w:numId w:val="4"/>
-        </w:numPr>
-        <w:spacing w:after="60"/>
-      </w:pPr>
-      <w:r>
-        <w:rPr>
-          <w:rFonts w:ascii="Calibri" w:cs="Calibri" w:eastAsia="Calibri" w:hAnsi="Calibri"/>
-          <w:sz w:val="22"/>
-          <w:szCs w:val="22"/>
-        </w:rPr>
-        <w:t xml:space="preserve">Resolve and tell the person. We explain what we found, what we will do and why. We tell them they can ask for a review or take the matter to the Commission.</w:t>
-      </w:r>
-    </w:p>
-    <w:p>
-      <w:pPr>
-        <w:pStyle w:val="ListParagraph"/>
-        <w:numPr>
-          <w:ilvl w:val="0"/>
-          <w:numId w:val="4"/>
-        </w:numPr>
-        <w:spacing w:after="60"/>
-      </w:pPr>
-      <w:r>
-        <w:rPr>
-          <w:rFonts w:ascii="Calibri" w:cs="Calibri" w:eastAsia="Calibri" w:hAnsi="Calibri"/>
-          <w:sz w:val="22"/>
-          <w:szCs w:val="22"/>
-        </w:rPr>
-        <w:t xml:space="preserve">Close and learn. We record the outcome and actions in the Complaints register. We ask the person if they are satisfied. We use the result to improve our supports and this procedure.</w:t>
-      </w:r>
-    </w:p>
-    <w:tbl>
-      <w:tblPr>
-        <w:tblW w:type="dxa" w:w="9000"/>
-        <w:tblBorders>
-          <w:top w:val="single" w:color="auto" w:sz="4"/>
-          <w:left w:val="single" w:color="auto" w:sz="4"/>
-          <w:bottom w:val="single" w:color="auto" w:sz="4"/>
-          <w:right w:val="single" w:color="auto" w:sz="4"/>
-          <w:insideH w:val="single" w:color="auto" w:sz="4"/>
-          <w:insideV w:val="single" w:color="auto" w:sz="4"/>
-        </w:tblBorders>
-      </w:tblPr>
-      <w:tblGrid>
-        <w:gridCol w:w="3000"/>
-        <w:gridCol w:w="3000"/>
-        <w:gridCol w:w="3000"/>
-      </w:tblGrid>
-      <w:tr>
-        <w:trPr>
-          <w:tblHeader/>
-        </w:trPr>
-        <w:tc>
-          <w:tcPr>
-            <w:tcW w:type="dxa" w:w="3000"/>
-            <w:tcBorders>
-              <w:top w:val="single" w:color="999999" w:sz="4"/>
-              <w:left w:val="single" w:color="999999" w:sz="4"/>
-              <w:bottom w:val="single" w:color="999999" w:sz="4"/>
-              <w:right w:val="single" w:color="999999" w:sz="4"/>
-            </w:tcBorders>
-            <w:shd w:fill="EEEEEE" w:val="clear"/>
-          </w:tcPr>
-          <w:p>
-            <w:r>
-              <w:rPr>
-                <w:rFonts w:ascii="Calibri" w:cs="Calibri" w:eastAsia="Calibri" w:hAnsi="Calibri"/>
-                <w:b/>
-                <w:bCs/>
-                <w:sz w:val="22"/>
-                <w:szCs w:val="22"/>
-              </w:rPr>
-              <w:t xml:space="preserve">Step</w:t>
-            </w:r>
-          </w:p>
-        </w:tc>
-        <w:tc>
-          <w:tcPr>
-            <w:tcW w:type="dxa" w:w="3000"/>
-            <w:tcBorders>
-              <w:top w:val="single" w:color="999999" w:sz="4"/>
-              <w:left w:val="single" w:color="999999" w:sz="4"/>
-              <w:bottom w:val="single" w:color="999999" w:sz="4"/>
-              <w:right w:val="single" w:color="999999" w:sz="4"/>
-            </w:tcBorders>
-            <w:shd w:fill="EEEEEE" w:val="clear"/>
-          </w:tcPr>
-          <w:p>
-            <w:r>
-              <w:rPr>
-                <w:rFonts w:ascii="Calibri" w:cs="Calibri" w:eastAsia="Calibri" w:hAnsi="Calibri"/>
-                <w:b/>
-                <w:bCs/>
-                <w:sz w:val="22"/>
-                <w:szCs w:val="22"/>
-              </w:rPr>
-              <w:t xml:space="preserve">Who</w:t>
-            </w:r>
-          </w:p>
-        </w:tc>
-        <w:tc>
-          <w:tcPr>
-            <w:tcW w:type="dxa" w:w="3000"/>
-            <w:tcBorders>
-              <w:top w:val="single" w:color="999999" w:sz="4"/>
-              <w:left w:val="single" w:color="999999" w:sz="4"/>
-              <w:bottom w:val="single" w:color="999999" w:sz="4"/>
-              <w:right w:val="single" w:color="999999" w:sz="4"/>
-            </w:tcBorders>
-            <w:shd w:fill="EEEEEE" w:val="clear"/>
-          </w:tcPr>
-          <w:p>
-            <w:r>
-              <w:rPr>
-                <w:rFonts w:ascii="Calibri" w:cs="Calibri" w:eastAsia="Calibri" w:hAnsi="Calibri"/>
-                <w:b/>
-                <w:bCs/>
-                <w:sz w:val="22"/>
-                <w:szCs w:val="22"/>
-              </w:rPr>
-              <w:t xml:space="preserve">When</w:t>
-            </w:r>
-          </w:p>
-        </w:tc>
-      </w:tr>
-      <w:tr>
-        <w:tc>
-          <w:tcPr>
-            <w:tcW w:type="dxa" w:w="3000"/>
-            <w:tcBorders>
-              <w:top w:val="single" w:color="999999" w:sz="4"/>
-              <w:left w:val="single" w:color="999999" w:sz="4"/>
-              <w:bottom w:val="single" w:color="999999" w:sz="4"/>
-              <w:right w:val="single" w:color="999999" w:sz="4"/>
-            </w:tcBorders>
-          </w:tcPr>
-          <w:p>
-            <w:r>
-              <w:rPr>
-                <w:rFonts w:ascii="Calibri" w:cs="Calibri" w:eastAsia="Calibri" w:hAnsi="Calibri"/>
-                <w:sz w:val="22"/>
-                <w:szCs w:val="22"/>
-              </w:rPr>
-              <w:t xml:space="preserve">Receive the complaint</w:t>
-            </w:r>
-          </w:p>
-        </w:tc>
-        <w:tc>
-          <w:tcPr>
-            <w:tcW w:type="dxa" w:w="3000"/>
-            <w:tcBorders>
-              <w:top w:val="single" w:color="999999" w:sz="4"/>
-              <w:left w:val="single" w:color="999999" w:sz="4"/>
-              <w:bottom w:val="single" w:color="999999" w:sz="4"/>
-              <w:right w:val="single" w:color="999999" w:sz="4"/>
-            </w:tcBorders>
-          </w:tcPr>
-          <w:p>
-            <w:r>
-              <w:rPr>
-                <w:rFonts w:ascii="Calibri" w:cs="Calibri" w:eastAsia="Calibri" w:hAnsi="Calibri"/>
-                <w:sz w:val="22"/>
-                <w:szCs w:val="22"/>
-              </w:rPr>
-              <w:t xml:space="preserve">Sunrise Supports owner</w:t>
-            </w:r>
-          </w:p>
-        </w:tc>
-        <w:tc>
-          <w:tcPr>
-            <w:tcW w:type="dxa" w:w="3000"/>
-            <w:tcBorders>
-              <w:top w:val="single" w:color="999999" w:sz="4"/>
-              <w:left w:val="single" w:color="999999" w:sz="4"/>
-              <w:bottom w:val="single" w:color="999999" w:sz="4"/>
-              <w:right w:val="single" w:color="999999" w:sz="4"/>
-            </w:tcBorders>
-          </w:tcPr>
-          <w:p>
-            <w:r>
-              <w:rPr>
-                <w:rFonts w:ascii="Calibri" w:cs="Calibri" w:eastAsia="Calibri" w:hAnsi="Calibri"/>
-                <w:sz w:val="22"/>
-                <w:szCs w:val="22"/>
-              </w:rPr>
-              <w:t xml:space="preserve">Whenever it is raised, in any form</w:t>
-            </w:r>
-          </w:p>
-        </w:tc>
-      </w:tr>
-      <w:tr>
-        <w:tc>
-          <w:tcPr>
-            <w:tcW w:type="dxa" w:w="3000"/>
-            <w:tcBorders>
-              <w:top w:val="single" w:color="999999" w:sz="4"/>
-              <w:left w:val="single" w:color="999999" w:sz="4"/>
-              <w:bottom w:val="single" w:color="999999" w:sz="4"/>
-              <w:right w:val="single" w:color="999999" w:sz="4"/>
-            </w:tcBorders>
-          </w:tcPr>
-          <w:p>
-            <w:r>
-              <w:rPr>
-                <w:rFonts w:ascii="Calibri" w:cs="Calibri" w:eastAsia="Calibri" w:hAnsi="Calibri"/>
-                <w:sz w:val="22"/>
-                <w:szCs w:val="22"/>
-              </w:rPr>
-              <w:t xml:space="preserve">Record in the Complaints register</w:t>
-            </w:r>
-          </w:p>
-        </w:tc>
-        <w:tc>
-          <w:tcPr>
-            <w:tcW w:type="dxa" w:w="3000"/>
-            <w:tcBorders>
-              <w:top w:val="single" w:color="999999" w:sz="4"/>
-              <w:left w:val="single" w:color="999999" w:sz="4"/>
-              <w:bottom w:val="single" w:color="999999" w:sz="4"/>
-              <w:right w:val="single" w:color="999999" w:sz="4"/>
-            </w:tcBorders>
-          </w:tcPr>
-          <w:p>
-            <w:r>
-              <w:rPr>
-                <w:rFonts w:ascii="Calibri" w:cs="Calibri" w:eastAsia="Calibri" w:hAnsi="Calibri"/>
-                <w:sz w:val="22"/>
-                <w:szCs w:val="22"/>
-              </w:rPr>
-              <w:t xml:space="preserve">Sunrise Supports owner</w:t>
-            </w:r>
-          </w:p>
-        </w:tc>
-        <w:tc>
-          <w:tcPr>
-            <w:tcW w:type="dxa" w:w="3000"/>
-            <w:tcBorders>
-              <w:top w:val="single" w:color="999999" w:sz="4"/>
-              <w:left w:val="single" w:color="999999" w:sz="4"/>
-              <w:bottom w:val="single" w:color="999999" w:sz="4"/>
-              <w:right w:val="single" w:color="999999" w:sz="4"/>
-            </w:tcBorders>
-          </w:tcPr>
-          <w:p>
-            <w:r>
-              <w:rPr>
-                <w:rFonts w:ascii="Calibri" w:cs="Calibri" w:eastAsia="Calibri" w:hAnsi="Calibri"/>
-                <w:sz w:val="22"/>
-                <w:szCs w:val="22"/>
-              </w:rPr>
-              <w:t xml:space="preserve">On the day we receive it</w:t>
-            </w:r>
-          </w:p>
-        </w:tc>
-      </w:tr>
-      <w:tr>
-        <w:tc>
-          <w:tcPr>
-            <w:tcW w:type="dxa" w:w="3000"/>
-            <w:tcBorders>
-              <w:top w:val="single" w:color="999999" w:sz="4"/>
-              <w:left w:val="single" w:color="999999" w:sz="4"/>
-              <w:bottom w:val="single" w:color="999999" w:sz="4"/>
-              <w:right w:val="single" w:color="999999" w:sz="4"/>
-            </w:tcBorders>
-          </w:tcPr>
-          <w:p>
-            <w:r>
-              <w:rPr>
-                <w:rFonts w:ascii="Calibri" w:cs="Calibri" w:eastAsia="Calibri" w:hAnsi="Calibri"/>
-                <w:sz w:val="22"/>
-                <w:szCs w:val="22"/>
-              </w:rPr>
-              <w:t xml:space="preserve">Acknowledge the complaint</w:t>
-            </w:r>
-          </w:p>
-        </w:tc>
-        <w:tc>
-          <w:tcPr>
-            <w:tcW w:type="dxa" w:w="3000"/>
-            <w:tcBorders>
-              <w:top w:val="single" w:color="999999" w:sz="4"/>
-              <w:left w:val="single" w:color="999999" w:sz="4"/>
-              <w:bottom w:val="single" w:color="999999" w:sz="4"/>
-              <w:right w:val="single" w:color="999999" w:sz="4"/>
-            </w:tcBorders>
-          </w:tcPr>
-          <w:p>
-            <w:r>
-              <w:rPr>
-                <w:rFonts w:ascii="Calibri" w:cs="Calibri" w:eastAsia="Calibri" w:hAnsi="Calibri"/>
-                <w:sz w:val="22"/>
-                <w:szCs w:val="22"/>
-              </w:rPr>
-              <w:t xml:space="preserve">Sunrise Supports owner</w:t>
-            </w:r>
-          </w:p>
-        </w:tc>
-        <w:tc>
-          <w:tcPr>
-            <w:tcW w:type="dxa" w:w="3000"/>
-            <w:tcBorders>
-              <w:top w:val="single" w:color="999999" w:sz="4"/>
-              <w:left w:val="single" w:color="999999" w:sz="4"/>
-              <w:bottom w:val="single" w:color="999999" w:sz="4"/>
-              <w:right w:val="single" w:color="999999" w:sz="4"/>
-            </w:tcBorders>
-          </w:tcPr>
-          <w:p>
-            <w:r>
-              <w:rPr>
-                <w:rFonts w:ascii="Calibri" w:cs="Calibri" w:eastAsia="Calibri" w:hAnsi="Calibri"/>
-                <w:sz w:val="22"/>
-                <w:szCs w:val="22"/>
-              </w:rPr>
-              <w:t xml:space="preserve">Within the timeframe in the Commission's complaints rules</w:t>
-            </w:r>
-          </w:p>
-        </w:tc>
-      </w:tr>
-      <w:tr>
-        <w:tc>
-          <w:tcPr>
-            <w:tcW w:type="dxa" w:w="3000"/>
-            <w:tcBorders>
-              <w:top w:val="single" w:color="999999" w:sz="4"/>
-              <w:left w:val="single" w:color="999999" w:sz="4"/>
-              <w:bottom w:val="single" w:color="999999" w:sz="4"/>
-              <w:right w:val="single" w:color="999999" w:sz="4"/>
-            </w:tcBorders>
-          </w:tcPr>
-          <w:p>
-            <w:r>
-              <w:rPr>
-                <w:rFonts w:ascii="Calibri" w:cs="Calibri" w:eastAsia="Calibri" w:hAnsi="Calibri"/>
-                <w:sz w:val="22"/>
-                <w:szCs w:val="22"/>
-              </w:rPr>
-              <w:t xml:space="preserve">Look into it and decide</w:t>
-            </w:r>
-          </w:p>
-        </w:tc>
-        <w:tc>
-          <w:tcPr>
-            <w:tcW w:type="dxa" w:w="3000"/>
-            <w:tcBorders>
-              <w:top w:val="single" w:color="999999" w:sz="4"/>
-              <w:left w:val="single" w:color="999999" w:sz="4"/>
-              <w:bottom w:val="single" w:color="999999" w:sz="4"/>
-              <w:right w:val="single" w:color="999999" w:sz="4"/>
-            </w:tcBorders>
-          </w:tcPr>
-          <w:p>
-            <w:r>
-              <w:rPr>
-                <w:rFonts w:ascii="Calibri" w:cs="Calibri" w:eastAsia="Calibri" w:hAnsi="Calibri"/>
-                <w:sz w:val="22"/>
-                <w:szCs w:val="22"/>
-              </w:rPr>
-              <w:t xml:space="preserve">Sunrise Supports owner</w:t>
-            </w:r>
-          </w:p>
-        </w:tc>
-        <w:tc>
-          <w:tcPr>
-            <w:tcW w:type="dxa" w:w="3000"/>
-            <w:tcBorders>
-              <w:top w:val="single" w:color="999999" w:sz="4"/>
-              <w:left w:val="single" w:color="999999" w:sz="4"/>
-              <w:bottom w:val="single" w:color="999999" w:sz="4"/>
-              <w:right w:val="single" w:color="999999" w:sz="4"/>
-            </w:tcBorders>
-          </w:tcPr>
-          <w:p>
-            <w:r>
-              <w:rPr>
-                <w:rFonts w:ascii="Calibri" w:cs="Calibri" w:eastAsia="Calibri" w:hAnsi="Calibri"/>
-                <w:sz w:val="22"/>
-                <w:szCs w:val="22"/>
-              </w:rPr>
-              <w:t xml:space="preserve">As soon as we can, and within the timeframe in the Commission's complaints rules</w:t>
-            </w:r>
-          </w:p>
-        </w:tc>
-      </w:tr>
-      <w:tr>
-        <w:tc>
-          <w:tcPr>
-            <w:tcW w:type="dxa" w:w="3000"/>
-            <w:tcBorders>
-              <w:top w:val="single" w:color="999999" w:sz="4"/>
-              <w:left w:val="single" w:color="999999" w:sz="4"/>
-              <w:bottom w:val="single" w:color="999999" w:sz="4"/>
-              <w:right w:val="single" w:color="999999" w:sz="4"/>
-            </w:tcBorders>
-          </w:tcPr>
-          <w:p>
-            <w:r>
-              <w:rPr>
-                <w:rFonts w:ascii="Calibri" w:cs="Calibri" w:eastAsia="Calibri" w:hAnsi="Calibri"/>
-                <w:sz w:val="22"/>
-                <w:szCs w:val="22"/>
-              </w:rPr>
-              <w:t xml:space="preserve">Tell the person the outcome and their options</w:t>
-            </w:r>
-          </w:p>
-        </w:tc>
-        <w:tc>
-          <w:tcPr>
-            <w:tcW w:type="dxa" w:w="3000"/>
-            <w:tcBorders>
-              <w:top w:val="single" w:color="999999" w:sz="4"/>
-              <w:left w:val="single" w:color="999999" w:sz="4"/>
-              <w:bottom w:val="single" w:color="999999" w:sz="4"/>
-              <w:right w:val="single" w:color="999999" w:sz="4"/>
-            </w:tcBorders>
-          </w:tcPr>
-          <w:p>
-            <w:r>
-              <w:rPr>
-                <w:rFonts w:ascii="Calibri" w:cs="Calibri" w:eastAsia="Calibri" w:hAnsi="Calibri"/>
-                <w:sz w:val="22"/>
-                <w:szCs w:val="22"/>
-              </w:rPr>
-              <w:t xml:space="preserve">Sunrise Supports owner</w:t>
-            </w:r>
-          </w:p>
-        </w:tc>
-        <w:tc>
-          <w:tcPr>
-            <w:tcW w:type="dxa" w:w="3000"/>
-            <w:tcBorders>
-              <w:top w:val="single" w:color="999999" w:sz="4"/>
-              <w:left w:val="single" w:color="999999" w:sz="4"/>
-              <w:bottom w:val="single" w:color="999999" w:sz="4"/>
-              <w:right w:val="single" w:color="999999" w:sz="4"/>
-            </w:tcBorders>
-          </w:tcPr>
-          <w:p>
-            <w:r>
-              <w:rPr>
-                <w:rFonts w:ascii="Calibri" w:cs="Calibri" w:eastAsia="Calibri" w:hAnsi="Calibri"/>
-                <w:sz w:val="22"/>
-                <w:szCs w:val="22"/>
-              </w:rPr>
-              <w:t xml:space="preserve">When we decide, and in the way the person prefers</w:t>
-            </w:r>
-          </w:p>
-        </w:tc>
-      </w:tr>
-      <w:tr>
-        <w:tc>
-          <w:tcPr>
-            <w:tcW w:type="dxa" w:w="3000"/>
-            <w:tcBorders>
-              <w:top w:val="single" w:color="999999" w:sz="4"/>
-              <w:left w:val="single" w:color="999999" w:sz="4"/>
-              <w:bottom w:val="single" w:color="999999" w:sz="4"/>
-              <w:right w:val="single" w:color="999999" w:sz="4"/>
-            </w:tcBorders>
-          </w:tcPr>
-          <w:p>
-            <w:r>
-              <w:rPr>
-                <w:rFonts w:ascii="Calibri" w:cs="Calibri" w:eastAsia="Calibri" w:hAnsi="Calibri"/>
-                <w:sz w:val="22"/>
-                <w:szCs w:val="22"/>
-              </w:rPr>
-              <w:t xml:space="preserve">Close the entry and review what we learned</w:t>
-            </w:r>
-          </w:p>
-        </w:tc>
-        <w:tc>
-          <w:tcPr>
-            <w:tcW w:type="dxa" w:w="3000"/>
-            <w:tcBorders>
-              <w:top w:val="single" w:color="999999" w:sz="4"/>
-              <w:left w:val="single" w:color="999999" w:sz="4"/>
-              <w:bottom w:val="single" w:color="999999" w:sz="4"/>
-              <w:right w:val="single" w:color="999999" w:sz="4"/>
-            </w:tcBorders>
-          </w:tcPr>
-          <w:p>
-            <w:r>
-              <w:rPr>
-                <w:rFonts w:ascii="Calibri" w:cs="Calibri" w:eastAsia="Calibri" w:hAnsi="Calibri"/>
-                <w:sz w:val="22"/>
-                <w:szCs w:val="22"/>
-              </w:rPr>
-              <w:t xml:space="preserve">Sunrise Supports owner</w:t>
-            </w:r>
-          </w:p>
-        </w:tc>
-        <w:tc>
-          <w:tcPr>
-            <w:tcW w:type="dxa" w:w="3000"/>
-            <w:tcBorders>
-              <w:top w:val="single" w:color="999999" w:sz="4"/>
-              <w:left w:val="single" w:color="999999" w:sz="4"/>
-              <w:bottom w:val="single" w:color="999999" w:sz="4"/>
-              <w:right w:val="single" w:color="999999" w:sz="4"/>
-            </w:tcBorders>
-          </w:tcPr>
-          <w:p>
-            <w:r>
-              <w:rPr>
-                <w:rFonts w:ascii="Calibri" w:cs="Calibri" w:eastAsia="Calibri" w:hAnsi="Calibri"/>
-                <w:sz w:val="22"/>
-                <w:szCs w:val="22"/>
-              </w:rPr>
-              <w:t xml:space="preserve">When the person has been told the outcome</w:t>
-            </w:r>
-          </w:p>
-        </w:tc>
-      </w:tr>
-    </w:tbl>
-    <w:p>
-      <w:pPr>
-        <w:spacing w:after="120"/>
-      </w:pPr>
-      <w:r>
-        <w:rPr>
-          <w:rFonts w:ascii="Calibri" w:cs="Calibri" w:eastAsia="Calibri" w:hAnsi="Calibri"/>
-          <w:sz w:val="22"/>
-          <w:szCs w:val="22"/>
-        </w:rPr>
-        <w:t xml:space="preserve"/>
-      </w:r>
-    </w:p>
-    <w:p>
-      <w:pPr>
-        <w:spacing w:after="120"/>
-      </w:pPr>
-      <w:r>
-        <w:rPr>
-          <w:rFonts w:ascii="Calibri" w:cs="Calibri" w:eastAsia="Calibri" w:hAnsi="Calibri"/>
-          <w:sz w:val="22"/>
-          <w:szCs w:val="22"/>
-        </w:rPr>
-        <w:t xml:space="preserve">If we cannot reach the person at the time, we try again and note each attempt in the register. We keep the person updated if the matter takes longer than we first told them.</w:t>
-      </w:r>
-    </w:p>
-    <w:p>
-      <w:pPr>
-        <w:spacing w:after="120"/>
-      </w:pPr>
-      <w:r>
-        <w:rPr>
-          <w:rFonts w:ascii="Calibri" w:cs="Calibri" w:eastAsia="Calibri" w:hAnsi="Calibri"/>
-          <w:sz w:val="22"/>
-          <w:szCs w:val="22"/>
-        </w:rPr>
-        <w:t xml:space="preserve">Because we are a sole trader, no one else in our business can review a complaint about us. A participant can ask an advocate to help them. They can also take the complaint to the Commission at any time, and they do not need to complain to us first. We never treat a person badly for complaining.</w:t>
-      </w:r>
-    </w:p>
-    <w:p>
-      <w:pPr>
-        <w:spacing w:after="120"/>
-      </w:pPr>
-      <w:r>
-        <w:rPr>
-          <w:rFonts w:ascii="Calibri" w:cs="Calibri" w:eastAsia="Calibri" w:hAnsi="Calibri"/>
-          <w:sz w:val="22"/>
-          <w:szCs w:val="22"/>
-        </w:rPr>
-        <w:t xml:space="preserve">To complain to the NDIS Quality and Safeguards Commission (the Commission), a person can call 1800 035 544 or use the contact options on the Commission's website. They can complain for themselves or ask someone to do it for them. We give this information to every participant when they start with us.</w:t>
-      </w:r>
-    </w:p>
-    <w:tbl>
-      <w:tblPr>
-        <w:tblW w:type="dxa" w:w="9000"/>
-        <w:tblBorders>
-          <w:top w:val="single" w:color="auto" w:sz="4"/>
-          <w:left w:val="single" w:color="auto" w:sz="4"/>
-          <w:bottom w:val="single" w:color="auto" w:sz="4"/>
-          <w:right w:val="single" w:color="auto" w:sz="4"/>
-          <w:insideH w:val="single" w:color="auto" w:sz="4"/>
-          <w:insideV w:val="single" w:color="auto" w:sz="4"/>
-        </w:tblBorders>
-      </w:tblPr>
-      <w:tblGrid>
-        <w:gridCol w:w="9000"/>
-      </w:tblGrid>
-      <w:tr>
-        <w:tc>
-          <w:tcPr>
-            <w:tcW w:type="dxa" w:w="9000"/>
-            <w:tcBorders>
-              <w:top w:val="single" w:color="999999" w:sz="4"/>
-              <w:left w:val="single" w:color="999999" w:sz="4"/>
-              <w:bottom w:val="single" w:color="999999" w:sz="4"/>
-              <w:right w:val="single" w:color="999999" w:sz="4"/>
-            </w:tcBorders>
-            <w:shd w:fill="FFF4CE" w:val="clear"/>
-          </w:tcPr>
-          <w:p>
-            <w:r>
-              <w:rPr>
-                <w:rFonts w:ascii="Calibri" w:cs="Calibri" w:eastAsia="Calibri" w:hAnsi="Calibri"/>
-                <w:i/>
-                <w:iCs/>
-                <w:sz w:val="22"/>
-                <w:szCs w:val="22"/>
-              </w:rPr>
-              <w:t xml:space="preserve">[Provider to complete: the phone number, email address and postal address participants can use to contact us with a complaint, and any advocacy service we will name for participants in New South Wales.]</w:t>
-            </w:r>
-          </w:p>
-        </w:tc>
-      </w:tr>
-    </w:tbl>
-    <w:p>
-      <w:pPr>
-        <w:spacing w:after="120"/>
-      </w:pPr>
-      <w:r>
-        <w:rPr>
-          <w:rFonts w:ascii="Calibri" w:cs="Calibri" w:eastAsia="Calibri" w:hAnsi="Calibri"/>
-          <w:sz w:val="22"/>
-          <w:szCs w:val="22"/>
-        </w:rPr>
-        <w:t xml:space="preserve"/>
+        <w:t xml:space="preserve">We do not treat anyone worse for making a complaint. A complaint never affects the supports a participant receives from us.</w:t>
       </w:r>
     </w:p>
     <w:p>
@@ -3612,7 +2719,7 @@
           <w:sz w:val="22"/>
           <w:szCs w:val="22"/>
         </w:rPr>
-        <w:t xml:space="preserve">Feedback and complaints management policy and procedure, aligned to the Complaints Management and Resolution Rules 2018</w:t>
+        <w:t xml:space="preserve">Complaints management and resolution policy and procedure aligned to the 2018 Rules</w:t>
       </w:r>
     </w:p>
     <w:p>
@@ -3630,7 +2737,34 @@
           <w:sz w:val="22"/>
           <w:szCs w:val="22"/>
         </w:rPr>
-        <w:t xml:space="preserve">Complaints register with acknowledgement, actions, outcomes and improvements</w:t>
+        <w:t xml:space="preserve">Complaints register</w:t>
+      </w:r>
+    </w:p>
+    <w:p>
+      <w:pPr>
+        <w:pStyle w:val="Heading1"/>
+        <w:spacing w:after="120" w:before="240"/>
+      </w:pPr>
+      <w:r>
+        <w:rPr>
+          <w:rFonts w:ascii="Calibri" w:cs="Calibri" w:eastAsia="Calibri" w:hAnsi="Calibri"/>
+          <w:b/>
+          <w:bCs/>
+        </w:rPr>
+        <w:t xml:space="preserve">10 Related documents and registers</w:t>
+      </w:r>
+    </w:p>
+    <w:p>
+      <w:pPr>
+        <w:spacing w:after="120"/>
+      </w:pPr>
+      <w:r>
+        <w:rPr>
+          <w:rFonts w:ascii="Calibri" w:cs="Calibri" w:eastAsia="Calibri" w:hAnsi="Calibri"/>
+          <w:sz w:val="22"/>
+          <w:szCs w:val="22"/>
+        </w:rPr>
+        <w:t xml:space="preserve">This document is part of the Sunrise Supports policy set prepared with Readyline on 12 October 2026.</w:t>
       </w:r>
     </w:p>
     <w:p>
@@ -3648,79 +2782,11 @@
           <w:sz w:val="22"/>
           <w:szCs w:val="22"/>
         </w:rPr>
-        <w:t xml:space="preserve">Participant-facing information on how to complain, including to the Commission and advocates</w:t>
-      </w:r>
-    </w:p>
-    <w:p>
-      <w:pPr>
-        <w:pStyle w:val="ListParagraph"/>
-        <w:numPr>
-          <w:ilvl w:val="0"/>
-          <w:numId w:val="2"/>
-        </w:numPr>
-        <w:spacing w:after="60"/>
-      </w:pPr>
-      <w:r>
-        <w:rPr>
-          <w:rFonts w:ascii="Calibri" w:cs="Calibri" w:eastAsia="Calibri" w:hAnsi="Calibri"/>
-          <w:sz w:val="22"/>
-          <w:szCs w:val="22"/>
-        </w:rPr>
-        <w:t xml:space="preserve">Worker training records on complaints handling</w:t>
-      </w:r>
-    </w:p>
-    <w:p>
-      <w:pPr>
-        <w:pStyle w:val="ListParagraph"/>
-        <w:numPr>
-          <w:ilvl w:val="0"/>
-          <w:numId w:val="2"/>
-        </w:numPr>
-        <w:spacing w:after="60"/>
-      </w:pPr>
-      <w:r>
-        <w:rPr>
-          <w:rFonts w:ascii="Calibri" w:cs="Calibri" w:eastAsia="Calibri" w:hAnsi="Calibri"/>
-          <w:sz w:val="22"/>
-          <w:szCs w:val="22"/>
-        </w:rPr>
-        <w:t xml:space="preserve">Complaints management and resolution policy and procedure aligned to the 2018 Rules</w:t>
-      </w:r>
-    </w:p>
-    <w:p>
-      <w:pPr>
-        <w:pStyle w:val="ListParagraph"/>
-        <w:numPr>
-          <w:ilvl w:val="0"/>
-          <w:numId w:val="2"/>
-        </w:numPr>
-        <w:spacing w:after="60"/>
-      </w:pPr>
-      <w:r>
-        <w:rPr>
-          <w:rFonts w:ascii="Calibri" w:cs="Calibri" w:eastAsia="Calibri" w:hAnsi="Calibri"/>
-          <w:sz w:val="22"/>
-          <w:szCs w:val="22"/>
-        </w:rPr>
         <w:t xml:space="preserve">Complaints register</w:t>
       </w:r>
     </w:p>
     <w:p>
       <w:pPr>
-        <w:pStyle w:val="Heading1"/>
-        <w:spacing w:after="120" w:before="240"/>
-      </w:pPr>
-      <w:r>
-        <w:rPr>
-          <w:rFonts w:ascii="Calibri" w:cs="Calibri" w:eastAsia="Calibri" w:hAnsi="Calibri"/>
-          <w:b/>
-          <w:bCs/>
-        </w:rPr>
-        <w:t xml:space="preserve">10 Related documents and registers</w:t>
-      </w:r>
-    </w:p>
-    <w:p>
-      <w:pPr>
         <w:spacing w:after="120"/>
       </w:pPr>
       <w:r>
@@ -3729,38 +2795,7 @@
           <w:sz w:val="22"/>
           <w:szCs w:val="22"/>
         </w:rPr>
-        <w:t xml:space="preserve">This document is part of the Sunrise Supports policy set prepared with Readyline on 12 October 2026.</w:t>
-      </w:r>
-    </w:p>
-    <w:p>
-      <w:pPr>
-        <w:pStyle w:val="ListParagraph"/>
-        <w:numPr>
-          <w:ilvl w:val="0"/>
-          <w:numId w:val="2"/>
-        </w:numPr>
-        <w:spacing w:after="60"/>
-      </w:pPr>
-      <w:r>
-        <w:rPr>
-          <w:rFonts w:ascii="Calibri" w:cs="Calibri" w:eastAsia="Calibri" w:hAnsi="Calibri"/>
-          <w:sz w:val="22"/>
-          <w:szCs w:val="22"/>
-        </w:rPr>
-        <w:t xml:space="preserve">Complaints register</w:t>
-      </w:r>
-    </w:p>
-    <w:p>
-      <w:pPr>
-        <w:spacing w:after="120"/>
-      </w:pPr>
-      <w:r>
-        <w:rPr>
-          <w:rFonts w:ascii="Calibri" w:cs="Calibri" w:eastAsia="Calibri" w:hAnsi="Calibri"/>
-          <w:sz w:val="22"/>
-          <w:szCs w:val="22"/>
-        </w:rPr>
-        <w:t xml:space="preserve">Practice Standards this document supports: Feedback and complaints management; Complaints management.</w:t>
+        <w:t xml:space="preserve">Practice Standards this document supports: Complaints management.</w:t>
       </w:r>
     </w:p>
     <w:p>
@@ -4487,12 +3522,18 @@
     </w:lvlOverride>
   </w:num>
   <w:num w:numId="3">
+    <w:abstractNumId w:val="7"/>
+    <w:lvlOverride w:ilvl="0">
+      <w:startOverride w:val="1"/>
+    </w:lvlOverride>
+  </w:num>
+  <w:num w:numId="4">
     <w:abstractNumId w:val="8"/>
     <w:lvlOverride w:ilvl="0">
       <w:startOverride w:val="1"/>
     </w:lvlOverride>
   </w:num>
-  <w:num w:numId="4">
+  <w:num w:numId="5">
     <w:abstractNumId w:val="10"/>
     <w:lvlOverride w:ilvl="0">
       <w:startOverride w:val="1"/>

</xml_diff>

<commit_message>
REQ-005 D-046 prompt caching and the full sole-trader set: two-block user prompt with cache breakpoints, cache tokens in fixtures, recorder and generation log, 93 sections recorded (D-535, D-536)
The user prompt is a cached per-document block followed by the section block (PROMPT_VERSION .3,
fixtures re-keyed). The recorder prices cache writes and reads, derives the sole-trader list from the
case, and can record another model into a model-keyed directory. 90 sole-trader sections plus the three
behaviour-support sub-sections recorded with an 87% cache hit rate (about $0.83 cached, $1.25 uncached).
R-8 subject rule rebuilt and R-9 colon handling fixed after four false positives; replay listings re-pinned.
Review pack renders all 18 documents (89 model-text sections, 1 fallback).

Co-Authored-By: Claude Fable 5.1 <noreply@anthropic.com>
</commit_message>
<xml_diff>
--- a/product/evidence/req-005/sole-trader/complaints-management-policy-and-register.docx
+++ b/product/evidence/req-005/sole-trader/complaints-management-policy-and-register.docx
@@ -396,6 +396,19 @@
     </w:p>
     <w:p>
       <w:pPr>
+        <w:spacing w:after="120"/>
+      </w:pPr>
+      <w:r>
+        <w:rPr>
+          <w:rFonts w:ascii="Calibri" w:cs="Calibri" w:eastAsia="Calibri" w:hAnsi="Calibri"/>
+          <w:sz w:val="22"/>
+          <w:szCs w:val="22"/>
+        </w:rPr>
+        <w:t xml:space="preserve">Why this document: it supports the NDIS Practice Standards Complaints management for Sunrise Supports.</w:t>
+      </w:r>
+    </w:p>
+    <w:p>
+      <w:pPr>
         <w:pStyle w:val="Heading1"/>
         <w:spacing w:after="120" w:before="240"/>
       </w:pPr>
@@ -418,7 +431,7 @@
           <w:sz w:val="22"/>
           <w:szCs w:val="22"/>
         </w:rPr>
-        <w:t xml:space="preserve">This document explains how Sunrise Supports welcomes, resolves, records and learns from feedback and complaints. It supports the Complaints management standard in the NDIS Practice Standards.</w:t>
+        <w:t xml:space="preserve">This document explains how Sunrise Supports welcomes, resolves, records and learns from complaints and feedback. It supports the Complaints management standard.</w:t>
       </w:r>
     </w:p>
     <w:p>
@@ -445,20 +458,7 @@
           <w:sz w:val="22"/>
           <w:szCs w:val="22"/>
         </w:rPr>
-        <w:t xml:space="preserve">This policy covers all supports delivered by Sunrise Supports, a sole trader business. At present we deliver one type of support: 0120 Household tasks. We deliver this support in New South Wales.</w:t>
-      </w:r>
-    </w:p>
-    <w:p>
-      <w:pPr>
-        <w:spacing w:after="120"/>
-      </w:pPr>
-      <w:r>
-        <w:rPr>
-          <w:rFonts w:ascii="Calibri" w:cs="Calibri" w:eastAsia="Calibri" w:hAnsi="Calibri"/>
-          <w:sz w:val="22"/>
-          <w:szCs w:val="22"/>
-        </w:rPr>
-        <w:t xml:space="preserve">The owner is our only key personnel and our only worker. The owner is responsible for receiving, resolving and recording every complaint. If we take on more workers, this policy will apply to them in the same way.</w:t>
+        <w:t xml:space="preserve">This policy covers Sunrise Supports, a sole trader business. It applies to all supports we deliver and to everyone who may raise a concern about them.</w:t>
       </w:r>
     </w:p>
     <w:tbl>
@@ -501,7 +501,7 @@
                 <w:sz w:val="22"/>
                 <w:szCs w:val="22"/>
               </w:rPr>
-              <w:t xml:space="preserve">Covered</w:t>
+              <w:t xml:space="preserve">Area</w:t>
             </w:r>
           </w:p>
         </w:tc>
@@ -525,7 +525,7 @@
                 <w:sz w:val="22"/>
                 <w:szCs w:val="22"/>
               </w:rPr>
-              <w:t xml:space="preserve">What this means</w:t>
+              <w:t xml:space="preserve">What it covers</w:t>
             </w:r>
           </w:p>
         </w:tc>
@@ -548,7 +548,7 @@
                 <w:sz w:val="22"/>
                 <w:szCs w:val="22"/>
               </w:rPr>
-              <w:t xml:space="preserve">Who can complain</w:t>
+              <w:t xml:space="preserve">Supports</w:t>
             </w:r>
           </w:p>
         </w:tc>
@@ -569,7 +569,7 @@
                 <w:sz w:val="22"/>
                 <w:szCs w:val="22"/>
               </w:rPr>
-              <w:t xml:space="preserve">Any participant, family member, nominee, advocate, worker or member of the public</w:t>
+              <w:t xml:space="preserve">Household tasks (support type 0120).</w:t>
             </w:r>
           </w:p>
         </w:tc>
@@ -592,7 +592,7 @@
                 <w:sz w:val="22"/>
                 <w:szCs w:val="22"/>
               </w:rPr>
-              <w:t xml:space="preserve">What can be raised</w:t>
+              <w:t xml:space="preserve">Location</w:t>
             </w:r>
           </w:p>
         </w:tc>
@@ -613,7 +613,7 @@
                 <w:sz w:val="22"/>
                 <w:szCs w:val="22"/>
               </w:rPr>
-              <w:t xml:space="preserve">Any concern about our supports, our worker, how we handle information, or how we have dealt with an earlier complaint</w:t>
+              <w:t xml:space="preserve">New South Wales.</w:t>
             </w:r>
           </w:p>
         </w:tc>
@@ -636,7 +636,7 @@
                 <w:sz w:val="22"/>
                 <w:szCs w:val="22"/>
               </w:rPr>
-              <w:t xml:space="preserve">How a complaint can be made</w:t>
+              <w:t xml:space="preserve">Who delivers supports</w:t>
             </w:r>
           </w:p>
         </w:tc>
@@ -657,7 +657,7 @@
                 <w:sz w:val="22"/>
                 <w:szCs w:val="22"/>
               </w:rPr>
-              <w:t xml:space="preserve">In person, by phone, in writing or through another person, and in the way that suits the person</w:t>
+              <w:t xml:space="preserve">Sunrise Supports is a sole trader business. There are no other workers. One key personnel member is responsible for this policy.</w:t>
             </w:r>
           </w:p>
         </w:tc>
@@ -680,7 +680,7 @@
                 <w:sz w:val="22"/>
                 <w:szCs w:val="22"/>
               </w:rPr>
-              <w:t xml:space="preserve">Where it applies</w:t>
+              <w:t xml:space="preserve">Who can complain</w:t>
             </w:r>
           </w:p>
         </w:tc>
@@ -701,7 +701,7 @@
                 <w:sz w:val="22"/>
                 <w:szCs w:val="22"/>
               </w:rPr>
-              <w:t xml:space="preserve">All supports we deliver in New South Wales</w:t>
+              <w:t xml:space="preserve">Participants, and their family members, nominees, advocates and other people acting for them. Anyone else with a concern about our supports can also complain.</w:t>
             </w:r>
           </w:p>
         </w:tc>
@@ -730,7 +730,7 @@
           <w:sz w:val="22"/>
           <w:szCs w:val="22"/>
         </w:rPr>
-        <w:t xml:space="preserve">This policy covers feedback as well as complaints. We welcome compliments, suggestions and concerns, and we handle each one in line with section 7 Complaints procedure.</w:t>
+        <w:t xml:space="preserve">It covers complaints about our supports, our conduct, our decisions and how we handle earlier complaints. It also covers feedback that is not a complaint, such as a suggestion or a compliment.</w:t>
       </w:r>
     </w:p>
     <w:p>
@@ -743,510 +743,7 @@
           <w:sz w:val="22"/>
           <w:szCs w:val="22"/>
         </w:rPr>
-        <w:t xml:space="preserve">We do not use restrictive practices. If this changes, we will review this policy and our related documents before we start.</w:t>
-      </w:r>
-    </w:p>
-    <w:p>
-      <w:pPr>
-        <w:pStyle w:val="Heading1"/>
-        <w:spacing w:after="120" w:before="240"/>
-      </w:pPr>
-      <w:r>
-        <w:rPr>
-          <w:rFonts w:ascii="Calibri" w:cs="Calibri" w:eastAsia="Calibri" w:hAnsi="Calibri"/>
-          <w:b/>
-          <w:bCs/>
-        </w:rPr>
-        <w:t xml:space="preserve">3 Definitions</w:t>
-      </w:r>
-    </w:p>
-    <w:p>
-      <w:pPr>
-        <w:pStyle w:val="ListParagraph"/>
-        <w:numPr>
-          <w:ilvl w:val="0"/>
-          <w:numId w:val="2"/>
-        </w:numPr>
-        <w:spacing w:after="60"/>
-      </w:pPr>
-      <w:r>
-        <w:rPr>
-          <w:rFonts w:ascii="Calibri" w:cs="Calibri" w:eastAsia="Calibri" w:hAnsi="Calibri"/>
-          <w:sz w:val="22"/>
-          <w:szCs w:val="22"/>
-        </w:rPr>
-        <w:t xml:space="preserve">Participant: a person who receives supports from us under the NDIS.</w:t>
-      </w:r>
-    </w:p>
-    <w:p>
-      <w:pPr>
-        <w:pStyle w:val="ListParagraph"/>
-        <w:numPr>
-          <w:ilvl w:val="0"/>
-          <w:numId w:val="2"/>
-        </w:numPr>
-        <w:spacing w:after="60"/>
-      </w:pPr>
-      <w:r>
-        <w:rPr>
-          <w:rFonts w:ascii="Calibri" w:cs="Calibri" w:eastAsia="Calibri" w:hAnsi="Calibri"/>
-          <w:sz w:val="22"/>
-          <w:szCs w:val="22"/>
-        </w:rPr>
-        <w:t xml:space="preserve">Worker: anyone who delivers or supports the delivery of our services, including the owner, people we employ, contractors and volunteers.</w:t>
-      </w:r>
-    </w:p>
-    <w:p>
-      <w:pPr>
-        <w:pStyle w:val="ListParagraph"/>
-        <w:numPr>
-          <w:ilvl w:val="0"/>
-          <w:numId w:val="2"/>
-        </w:numPr>
-        <w:spacing w:after="60"/>
-      </w:pPr>
-      <w:r>
-        <w:rPr>
-          <w:rFonts w:ascii="Calibri" w:cs="Calibri" w:eastAsia="Calibri" w:hAnsi="Calibri"/>
-          <w:sz w:val="22"/>
-          <w:szCs w:val="22"/>
-        </w:rPr>
-        <w:t xml:space="preserve">Key personnel: the people who own, run or make decisions for the business.</w:t>
-      </w:r>
-    </w:p>
-    <w:p>
-      <w:pPr>
-        <w:pStyle w:val="ListParagraph"/>
-        <w:numPr>
-          <w:ilvl w:val="0"/>
-          <w:numId w:val="2"/>
-        </w:numPr>
-        <w:spacing w:after="60"/>
-      </w:pPr>
-      <w:r>
-        <w:rPr>
-          <w:rFonts w:ascii="Calibri" w:cs="Calibri" w:eastAsia="Calibri" w:hAnsi="Calibri"/>
-          <w:sz w:val="22"/>
-          <w:szCs w:val="22"/>
-        </w:rPr>
-        <w:t xml:space="preserve">Provider: our business, named in the document control table.</w:t>
-      </w:r>
-    </w:p>
-    <w:p>
-      <w:pPr>
-        <w:pStyle w:val="ListParagraph"/>
-        <w:numPr>
-          <w:ilvl w:val="0"/>
-          <w:numId w:val="2"/>
-        </w:numPr>
-        <w:spacing w:after="60"/>
-      </w:pPr>
-      <w:r>
-        <w:rPr>
-          <w:rFonts w:ascii="Calibri" w:cs="Calibri" w:eastAsia="Calibri" w:hAnsi="Calibri"/>
-          <w:sz w:val="22"/>
-          <w:szCs w:val="22"/>
-        </w:rPr>
-        <w:t xml:space="preserve">The Commission: the NDIS Quality and Safeguards Commission, which registers and regulates providers.</w:t>
-      </w:r>
-    </w:p>
-    <w:p>
-      <w:pPr>
-        <w:pStyle w:val="ListParagraph"/>
-        <w:numPr>
-          <w:ilvl w:val="0"/>
-          <w:numId w:val="2"/>
-        </w:numPr>
-        <w:spacing w:after="60"/>
-      </w:pPr>
-      <w:r>
-        <w:rPr>
-          <w:rFonts w:ascii="Calibri" w:cs="Calibri" w:eastAsia="Calibri" w:hAnsi="Calibri"/>
-          <w:sz w:val="22"/>
-          <w:szCs w:val="22"/>
-        </w:rPr>
-        <w:t xml:space="preserve">Rules: the NDIS rules made under the National Disability Insurance Scheme Act 2013 that apply to registered providers.</w:t>
-      </w:r>
-    </w:p>
-    <w:p>
-      <w:pPr>
-        <w:pStyle w:val="Heading1"/>
-        <w:spacing w:after="120" w:before="240"/>
-      </w:pPr>
-      <w:r>
-        <w:rPr>
-          <w:rFonts w:ascii="Calibri" w:cs="Calibri" w:eastAsia="Calibri" w:hAnsi="Calibri"/>
-          <w:b/>
-          <w:bCs/>
-        </w:rPr>
-        <w:t xml:space="preserve">4 Policy statement</w:t>
-      </w:r>
-    </w:p>
-    <w:p>
-      <w:pPr>
-        <w:spacing w:after="120"/>
-      </w:pPr>
-      <w:r>
-        <w:rPr>
-          <w:rFonts w:ascii="Calibri" w:cs="Calibri" w:eastAsia="Calibri" w:hAnsi="Calibri"/>
-          <w:sz w:val="22"/>
-          <w:szCs w:val="22"/>
-        </w:rPr>
-        <w:t xml:space="preserve">Sunrise Supports welcomes feedback and complaints from every participant, family member, advocate and other person who deals with us. We see a complaint as useful information that helps us do better.</w:t>
-      </w:r>
-    </w:p>
-    <w:p>
-      <w:pPr>
-        <w:spacing w:after="120"/>
-      </w:pPr>
-      <w:r>
-        <w:rPr>
-          <w:rFonts w:ascii="Calibri" w:cs="Calibri" w:eastAsia="Calibri" w:hAnsi="Calibri"/>
-          <w:sz w:val="22"/>
-          <w:szCs w:val="22"/>
-        </w:rPr>
-        <w:t xml:space="preserve">We make the following commitments. They support the Complaints management standard, quality indicator 1.</w:t>
-      </w:r>
-    </w:p>
-    <w:p>
-      <w:pPr>
-        <w:pStyle w:val="ListParagraph"/>
-        <w:numPr>
-          <w:ilvl w:val="0"/>
-          <w:numId w:val="3"/>
-        </w:numPr>
-        <w:spacing w:after="60"/>
-      </w:pPr>
-      <w:r>
-        <w:rPr>
-          <w:rFonts w:ascii="Calibri" w:cs="Calibri" w:eastAsia="Calibri" w:hAnsi="Calibri"/>
-          <w:sz w:val="22"/>
-          <w:szCs w:val="22"/>
-        </w:rPr>
-        <w:t xml:space="preserve">We keep a complaints management and resolution system that fits a sole trader delivering household tasks in New South Wales. It is simple to use and in proportion to the supports we give.</w:t>
-      </w:r>
-    </w:p>
-    <w:p>
-      <w:pPr>
-        <w:pStyle w:val="ListParagraph"/>
-        <w:numPr>
-          <w:ilvl w:val="0"/>
-          <w:numId w:val="3"/>
-        </w:numPr>
-        <w:spacing w:after="60"/>
-      </w:pPr>
-      <w:r>
-        <w:rPr>
-          <w:rFonts w:ascii="Calibri" w:cs="Calibri" w:eastAsia="Calibri" w:hAnsi="Calibri"/>
-          <w:sz w:val="22"/>
-          <w:szCs w:val="22"/>
-        </w:rPr>
-        <w:t xml:space="preserve">We tell every participant how to give feedback or make a complaint, and we make it easy to do so in the way that suits them. We accept complaints from anyone, including participants, their families, advocates and other people.</w:t>
-      </w:r>
-    </w:p>
-    <w:p>
-      <w:pPr>
-        <w:pStyle w:val="ListParagraph"/>
-        <w:numPr>
-          <w:ilvl w:val="0"/>
-          <w:numId w:val="3"/>
-        </w:numPr>
-        <w:spacing w:after="60"/>
-      </w:pPr>
-      <w:r>
-        <w:rPr>
-          <w:rFonts w:ascii="Calibri" w:cs="Calibri" w:eastAsia="Calibri" w:hAnsi="Calibri"/>
-          <w:sz w:val="22"/>
-          <w:szCs w:val="22"/>
-        </w:rPr>
-        <w:t xml:space="preserve">We acknowledge each complaint, treat the person with respect, and never treat them worse because they complained.</w:t>
-      </w:r>
-    </w:p>
-    <w:p>
-      <w:pPr>
-        <w:pStyle w:val="ListParagraph"/>
-        <w:numPr>
-          <w:ilvl w:val="0"/>
-          <w:numId w:val="3"/>
-        </w:numPr>
-        <w:spacing w:after="60"/>
-      </w:pPr>
-      <w:r>
-        <w:rPr>
-          <w:rFonts w:ascii="Calibri" w:cs="Calibri" w:eastAsia="Calibri" w:hAnsi="Calibri"/>
-          <w:sz w:val="22"/>
-          <w:szCs w:val="22"/>
-        </w:rPr>
-        <w:t xml:space="preserve">We follow procedural fairness and natural justice. We listen to all sides, tell people what is said about them, and make decisions based on the facts, without bias.</w:t>
-      </w:r>
-    </w:p>
-    <w:p>
-      <w:pPr>
-        <w:pStyle w:val="ListParagraph"/>
-        <w:numPr>
-          <w:ilvl w:val="0"/>
-          <w:numId w:val="3"/>
-        </w:numPr>
-        <w:spacing w:after="60"/>
-      </w:pPr>
-      <w:r>
-        <w:rPr>
-          <w:rFonts w:ascii="Calibri" w:cs="Calibri" w:eastAsia="Calibri" w:hAnsi="Calibri"/>
-          <w:sz w:val="22"/>
-          <w:szCs w:val="22"/>
-        </w:rPr>
-        <w:t xml:space="preserve">We follow the National Disability Insurance Scheme (Complaints Management and Resolution) Rules 2018.</w:t>
-      </w:r>
-    </w:p>
-    <w:p>
-      <w:pPr>
-        <w:pStyle w:val="ListParagraph"/>
-        <w:numPr>
-          <w:ilvl w:val="0"/>
-          <w:numId w:val="3"/>
-        </w:numPr>
-        <w:spacing w:after="60"/>
-      </w:pPr>
-      <w:r>
-        <w:rPr>
-          <w:rFonts w:ascii="Calibri" w:cs="Calibri" w:eastAsia="Calibri" w:hAnsi="Calibri"/>
-          <w:sz w:val="22"/>
-          <w:szCs w:val="22"/>
-        </w:rPr>
-        <w:t xml:space="preserve">We record every complaint in the complaints register and use what we learn to improve our supports.</w:t>
-      </w:r>
-    </w:p>
-    <w:p>
-      <w:pPr>
-        <w:spacing w:after="120"/>
-      </w:pPr>
-      <w:r>
-        <w:rPr>
-          <w:rFonts w:ascii="Calibri" w:cs="Calibri" w:eastAsia="Calibri" w:hAnsi="Calibri"/>
-          <w:sz w:val="22"/>
-          <w:szCs w:val="22"/>
-        </w:rPr>
-        <w:t xml:space="preserve">Because Sunrise Supports is run by one person, there is no one else to hand a complaint to. If a complaint is about us, the person can contact the NDIS Quality and Safeguards Commission, and we will give them the details whenever they ask. See section 7 Complaints procedure for the steps we follow.</w:t>
-      </w:r>
-    </w:p>
-    <w:p>
-      <w:pPr>
-        <w:pStyle w:val="Heading1"/>
-        <w:spacing w:after="120" w:before="240"/>
-      </w:pPr>
-      <w:r>
-        <w:rPr>
-          <w:rFonts w:ascii="Calibri" w:cs="Calibri" w:eastAsia="Calibri" w:hAnsi="Calibri"/>
-          <w:b/>
-          <w:bCs/>
-        </w:rPr>
-        <w:t xml:space="preserve">5 How we put this into practice</w:t>
-      </w:r>
-    </w:p>
-    <w:p>
-      <w:pPr>
-        <w:spacing w:after="120"/>
-      </w:pPr>
-      <w:r>
-        <w:rPr>
-          <w:rFonts w:ascii="Calibri" w:cs="Calibri" w:eastAsia="Calibri" w:hAnsi="Calibri"/>
-          <w:sz w:val="22"/>
-          <w:szCs w:val="22"/>
-        </w:rPr>
-        <w:t xml:space="preserve">Sunrise Supports is run by one person. We have no workers, so the owner handles every step below. This section sets out how we do that in practice. The detailed steps are in section 7 Complaints procedure.</w:t>
-      </w:r>
-    </w:p>
-    <w:p>
-      <w:pPr>
-        <w:pStyle w:val="ListParagraph"/>
-        <w:numPr>
-          <w:ilvl w:val="0"/>
-          <w:numId w:val="4"/>
-        </w:numPr>
-        <w:spacing w:after="60"/>
-      </w:pPr>
-      <w:r>
-        <w:rPr>
-          <w:rFonts w:ascii="Calibri" w:cs="Calibri" w:eastAsia="Calibri" w:hAnsi="Calibri"/>
-          <w:sz w:val="22"/>
-          <w:szCs w:val="22"/>
-        </w:rPr>
-        <w:t xml:space="preserve">We tell every participant how to give feedback or make a complaint before we start their supports. We say it in plain words and give it in writing if they want it.</w:t>
-      </w:r>
-    </w:p>
-    <w:p>
-      <w:pPr>
-        <w:pStyle w:val="ListParagraph"/>
-        <w:numPr>
-          <w:ilvl w:val="0"/>
-          <w:numId w:val="4"/>
-        </w:numPr>
-        <w:spacing w:after="60"/>
-      </w:pPr>
-      <w:r>
-        <w:rPr>
-          <w:rFonts w:ascii="Calibri" w:cs="Calibri" w:eastAsia="Calibri" w:hAnsi="Calibri"/>
-          <w:sz w:val="22"/>
-          <w:szCs w:val="22"/>
-        </w:rPr>
-        <w:t xml:space="preserve">We accept feedback and complaints in any way the participant chooses: by phone, message, email, in person or through someone they trust. We help them if they need support to be heard.</w:t>
-      </w:r>
-    </w:p>
-    <w:p>
-      <w:pPr>
-        <w:pStyle w:val="ListParagraph"/>
-        <w:numPr>
-          <w:ilvl w:val="0"/>
-          <w:numId w:val="4"/>
-        </w:numPr>
-        <w:spacing w:after="60"/>
-      </w:pPr>
-      <w:r>
-        <w:rPr>
-          <w:rFonts w:ascii="Calibri" w:cs="Calibri" w:eastAsia="Calibri" w:hAnsi="Calibri"/>
-          <w:sz w:val="22"/>
-          <w:szCs w:val="22"/>
-        </w:rPr>
-        <w:t xml:space="preserve">We welcome every complaint. We thank the person, listen without arguing, and do not treat a participant differently because they complained.</w:t>
-      </w:r>
-    </w:p>
-    <w:p>
-      <w:pPr>
-        <w:pStyle w:val="ListParagraph"/>
-        <w:numPr>
-          <w:ilvl w:val="0"/>
-          <w:numId w:val="4"/>
-        </w:numPr>
-        <w:spacing w:after="60"/>
-      </w:pPr>
-      <w:r>
-        <w:rPr>
-          <w:rFonts w:ascii="Calibri" w:cs="Calibri" w:eastAsia="Calibri" w:hAnsi="Calibri"/>
-          <w:sz w:val="22"/>
-          <w:szCs w:val="22"/>
-        </w:rPr>
-        <w:t xml:space="preserve">We record each complaint in the complaints register on the day we receive it. Section 8 Complaints register explains what we record.</w:t>
-      </w:r>
-    </w:p>
-    <w:p>
-      <w:pPr>
-        <w:pStyle w:val="ListParagraph"/>
-        <w:numPr>
-          <w:ilvl w:val="0"/>
-          <w:numId w:val="4"/>
-        </w:numPr>
-        <w:spacing w:after="60"/>
-      </w:pPr>
-      <w:r>
-        <w:rPr>
-          <w:rFonts w:ascii="Calibri" w:cs="Calibri" w:eastAsia="Calibri" w:hAnsi="Calibri"/>
-          <w:sz w:val="22"/>
-          <w:szCs w:val="22"/>
-        </w:rPr>
-        <w:t xml:space="preserve">We acknowledge each complaint and follow the timeframes and steps in section 7 Complaints procedure. We do not repeat them here.</w:t>
-      </w:r>
-    </w:p>
-    <w:p>
-      <w:pPr>
-        <w:pStyle w:val="ListParagraph"/>
-        <w:numPr>
-          <w:ilvl w:val="0"/>
-          <w:numId w:val="4"/>
-        </w:numPr>
-        <w:spacing w:after="60"/>
-      </w:pPr>
-      <w:r>
-        <w:rPr>
-          <w:rFonts w:ascii="Calibri" w:cs="Calibri" w:eastAsia="Calibri" w:hAnsi="Calibri"/>
-          <w:sz w:val="22"/>
-          <w:szCs w:val="22"/>
-        </w:rPr>
-        <w:t xml:space="preserve">Because we work alone, we check whether a complaint is about us. If it is, we do not judge our own conduct in secret. We write down what happened, listen to the participant's account, and tell them they can take it to an independent body, including the Commission. Section 4 Policy statement says more about their right to do this.</w:t>
-      </w:r>
-    </w:p>
-    <w:p>
-      <w:pPr>
-        <w:pStyle w:val="ListParagraph"/>
-        <w:numPr>
-          <w:ilvl w:val="0"/>
-          <w:numId w:val="4"/>
-        </w:numPr>
-        <w:spacing w:after="60"/>
-      </w:pPr>
-      <w:r>
-        <w:rPr>
-          <w:rFonts w:ascii="Calibri" w:cs="Calibri" w:eastAsia="Calibri" w:hAnsi="Calibri"/>
-          <w:sz w:val="22"/>
-          <w:szCs w:val="22"/>
-        </w:rPr>
-        <w:t xml:space="preserve">We decide the outcome fairly. We listen to the participant, look at the facts, give them a chance to respond to anything said about them, and explain our decision and the reasons for it.</w:t>
-      </w:r>
-    </w:p>
-    <w:p>
-      <w:pPr>
-        <w:pStyle w:val="ListParagraph"/>
-        <w:numPr>
-          <w:ilvl w:val="0"/>
-          <w:numId w:val="4"/>
-        </w:numPr>
-        <w:spacing w:after="60"/>
-      </w:pPr>
-      <w:r>
-        <w:rPr>
-          <w:rFonts w:ascii="Calibri" w:cs="Calibri" w:eastAsia="Calibri" w:hAnsi="Calibri"/>
-          <w:sz w:val="22"/>
-          <w:szCs w:val="22"/>
-        </w:rPr>
-        <w:t xml:space="preserve">We tell the participant what we have decided and what we will change. We also tell them what they can do if they are not satisfied.</w:t>
-      </w:r>
-    </w:p>
-    <w:p>
-      <w:pPr>
-        <w:pStyle w:val="ListParagraph"/>
-        <w:numPr>
-          <w:ilvl w:val="0"/>
-          <w:numId w:val="4"/>
-        </w:numPr>
-        <w:spacing w:after="60"/>
-      </w:pPr>
-      <w:r>
-        <w:rPr>
-          <w:rFonts w:ascii="Calibri" w:cs="Calibri" w:eastAsia="Calibri" w:hAnsi="Calibri"/>
-          <w:sz w:val="22"/>
-          <w:szCs w:val="22"/>
-        </w:rPr>
-        <w:t xml:space="preserve">We look for the cause of each complaint. Where a change to how we deliver household tasks would stop it happening again, we make that change and note it in the register.</w:t>
-      </w:r>
-    </w:p>
-    <w:p>
-      <w:pPr>
-        <w:pStyle w:val="ListParagraph"/>
-        <w:numPr>
-          <w:ilvl w:val="0"/>
-          <w:numId w:val="4"/>
-        </w:numPr>
-        <w:spacing w:after="60"/>
-      </w:pPr>
-      <w:r>
-        <w:rPr>
-          <w:rFonts w:ascii="Calibri" w:cs="Calibri" w:eastAsia="Calibri" w:hAnsi="Calibri"/>
-          <w:sz w:val="22"/>
-          <w:szCs w:val="22"/>
-        </w:rPr>
-        <w:t xml:space="preserve">We keep the records listed in section 9 Records and evidence to retain. We keep them private and share them only with people who need them.</w:t>
-      </w:r>
-    </w:p>
-    <w:p>
-      <w:pPr>
-        <w:spacing w:after="120"/>
-      </w:pPr>
-      <w:r>
-        <w:rPr>
-          <w:rFonts w:ascii="Calibri" w:cs="Calibri" w:eastAsia="Calibri" w:hAnsi="Calibri"/>
-          <w:sz w:val="22"/>
-          <w:szCs w:val="22"/>
-        </w:rPr>
-        <w:t xml:space="preserve">We review the complaints register every 3 months to look for patterns and follow up open items. We review this policy every 12 months. See section 11 Review.</w:t>
+        <w:t xml:space="preserve">If we take on workers or start delivering other types of support, we will update this section and tell all workers about the change.</w:t>
       </w:r>
     </w:p>
     <w:tbl>
@@ -1285,7 +782,7 @@
                 <w:sz w:val="22"/>
                 <w:szCs w:val="22"/>
               </w:rPr>
-              <w:t xml:space="preserve">[Provider to complete: the phone number and email address participants use to contact Sunrise Supports with feedback or a complaint.]</w:t>
+              <w:t xml:space="preserve">[Provider to complete: name of the key personnel member responsible for complaints.]</w:t>
             </w:r>
           </w:p>
         </w:tc>
@@ -1315,6 +812,605 @@
           <w:b/>
           <w:bCs/>
         </w:rPr>
+        <w:t xml:space="preserve">3 Definitions</w:t>
+      </w:r>
+    </w:p>
+    <w:p>
+      <w:pPr>
+        <w:pStyle w:val="ListParagraph"/>
+        <w:numPr>
+          <w:ilvl w:val="0"/>
+          <w:numId w:val="2"/>
+        </w:numPr>
+        <w:spacing w:after="60"/>
+      </w:pPr>
+      <w:r>
+        <w:rPr>
+          <w:rFonts w:ascii="Calibri" w:cs="Calibri" w:eastAsia="Calibri" w:hAnsi="Calibri"/>
+          <w:sz w:val="22"/>
+          <w:szCs w:val="22"/>
+        </w:rPr>
+        <w:t xml:space="preserve">Participant: a person who receives supports from us under the NDIS.</w:t>
+      </w:r>
+    </w:p>
+    <w:p>
+      <w:pPr>
+        <w:pStyle w:val="ListParagraph"/>
+        <w:numPr>
+          <w:ilvl w:val="0"/>
+          <w:numId w:val="2"/>
+        </w:numPr>
+        <w:spacing w:after="60"/>
+      </w:pPr>
+      <w:r>
+        <w:rPr>
+          <w:rFonts w:ascii="Calibri" w:cs="Calibri" w:eastAsia="Calibri" w:hAnsi="Calibri"/>
+          <w:sz w:val="22"/>
+          <w:szCs w:val="22"/>
+        </w:rPr>
+        <w:t xml:space="preserve">Worker: anyone who delivers or supports the delivery of our services, including the owner, people we employ, contractors and volunteers.</w:t>
+      </w:r>
+    </w:p>
+    <w:p>
+      <w:pPr>
+        <w:pStyle w:val="ListParagraph"/>
+        <w:numPr>
+          <w:ilvl w:val="0"/>
+          <w:numId w:val="2"/>
+        </w:numPr>
+        <w:spacing w:after="60"/>
+      </w:pPr>
+      <w:r>
+        <w:rPr>
+          <w:rFonts w:ascii="Calibri" w:cs="Calibri" w:eastAsia="Calibri" w:hAnsi="Calibri"/>
+          <w:sz w:val="22"/>
+          <w:szCs w:val="22"/>
+        </w:rPr>
+        <w:t xml:space="preserve">Key personnel: the people who own, run or make decisions for the business.</w:t>
+      </w:r>
+    </w:p>
+    <w:p>
+      <w:pPr>
+        <w:pStyle w:val="ListParagraph"/>
+        <w:numPr>
+          <w:ilvl w:val="0"/>
+          <w:numId w:val="2"/>
+        </w:numPr>
+        <w:spacing w:after="60"/>
+      </w:pPr>
+      <w:r>
+        <w:rPr>
+          <w:rFonts w:ascii="Calibri" w:cs="Calibri" w:eastAsia="Calibri" w:hAnsi="Calibri"/>
+          <w:sz w:val="22"/>
+          <w:szCs w:val="22"/>
+        </w:rPr>
+        <w:t xml:space="preserve">Provider: our business, named in the document control table.</w:t>
+      </w:r>
+    </w:p>
+    <w:p>
+      <w:pPr>
+        <w:pStyle w:val="ListParagraph"/>
+        <w:numPr>
+          <w:ilvl w:val="0"/>
+          <w:numId w:val="2"/>
+        </w:numPr>
+        <w:spacing w:after="60"/>
+      </w:pPr>
+      <w:r>
+        <w:rPr>
+          <w:rFonts w:ascii="Calibri" w:cs="Calibri" w:eastAsia="Calibri" w:hAnsi="Calibri"/>
+          <w:sz w:val="22"/>
+          <w:szCs w:val="22"/>
+        </w:rPr>
+        <w:t xml:space="preserve">The Commission: the NDIS Quality and Safeguards Commission, which registers and regulates providers.</w:t>
+      </w:r>
+    </w:p>
+    <w:p>
+      <w:pPr>
+        <w:pStyle w:val="ListParagraph"/>
+        <w:numPr>
+          <w:ilvl w:val="0"/>
+          <w:numId w:val="2"/>
+        </w:numPr>
+        <w:spacing w:after="60"/>
+      </w:pPr>
+      <w:r>
+        <w:rPr>
+          <w:rFonts w:ascii="Calibri" w:cs="Calibri" w:eastAsia="Calibri" w:hAnsi="Calibri"/>
+          <w:sz w:val="22"/>
+          <w:szCs w:val="22"/>
+        </w:rPr>
+        <w:t xml:space="preserve">Rules: the NDIS rules made under the National Disability Insurance Scheme Act 2013 that apply to registered providers.</w:t>
+      </w:r>
+    </w:p>
+    <w:p>
+      <w:pPr>
+        <w:pStyle w:val="Heading1"/>
+        <w:spacing w:after="120" w:before="240"/>
+      </w:pPr>
+      <w:r>
+        <w:rPr>
+          <w:rFonts w:ascii="Calibri" w:cs="Calibri" w:eastAsia="Calibri" w:hAnsi="Calibri"/>
+          <w:b/>
+          <w:bCs/>
+        </w:rPr>
+        <w:t xml:space="preserve">4 Policy statement</w:t>
+      </w:r>
+    </w:p>
+    <w:p>
+      <w:pPr>
+        <w:spacing w:after="120"/>
+      </w:pPr>
+      <w:r>
+        <w:rPr>
+          <w:rFonts w:ascii="Calibri" w:cs="Calibri" w:eastAsia="Calibri" w:hAnsi="Calibri"/>
+          <w:sz w:val="22"/>
+          <w:szCs w:val="22"/>
+        </w:rPr>
+        <w:t xml:space="preserve">Sunrise Supports is a sole trader that provides household task supports (0120 Household tasks) to participants in New South Wales. We welcome feedback and complaints from every participant, and from anyone else who raises a concern about our supports.</w:t>
+      </w:r>
+    </w:p>
+    <w:p>
+      <w:pPr>
+        <w:spacing w:after="120"/>
+      </w:pPr>
+      <w:r>
+        <w:rPr>
+          <w:rFonts w:ascii="Calibri" w:cs="Calibri" w:eastAsia="Calibri" w:hAnsi="Calibri"/>
+          <w:sz w:val="22"/>
+          <w:szCs w:val="22"/>
+        </w:rPr>
+        <w:t xml:space="preserve">We keep one complaints management and resolution system. It is sized to match a one-person business that provides household tasks, and it meets the National Disability Insurance Scheme (Complaints Management and Resolution) Rules 2018. This supports the Complaints management standard.</w:t>
+      </w:r>
+    </w:p>
+    <w:p>
+      <w:pPr>
+        <w:pStyle w:val="ListParagraph"/>
+        <w:numPr>
+          <w:ilvl w:val="0"/>
+          <w:numId w:val="2"/>
+        </w:numPr>
+        <w:spacing w:after="60"/>
+      </w:pPr>
+      <w:r>
+        <w:rPr>
+          <w:rFonts w:ascii="Calibri" w:cs="Calibri" w:eastAsia="Calibri" w:hAnsi="Calibri"/>
+          <w:sz w:val="22"/>
+          <w:szCs w:val="22"/>
+        </w:rPr>
+        <w:t xml:space="preserve">We make sure each participant knows how to complain and can do so easily, in the way that suits them, including through a family member, advocate or other person they choose.</w:t>
+      </w:r>
+    </w:p>
+    <w:p>
+      <w:pPr>
+        <w:pStyle w:val="ListParagraph"/>
+        <w:numPr>
+          <w:ilvl w:val="0"/>
+          <w:numId w:val="2"/>
+        </w:numPr>
+        <w:spacing w:after="60"/>
+      </w:pPr>
+      <w:r>
+        <w:rPr>
+          <w:rFonts w:ascii="Calibri" w:cs="Calibri" w:eastAsia="Calibri" w:hAnsi="Calibri"/>
+          <w:sz w:val="22"/>
+          <w:szCs w:val="22"/>
+        </w:rPr>
+        <w:t xml:space="preserve">We welcome complaints from all parties and treat each person with respect. No one is treated worse for making a complaint.</w:t>
+      </w:r>
+    </w:p>
+    <w:p>
+      <w:pPr>
+        <w:pStyle w:val="ListParagraph"/>
+        <w:numPr>
+          <w:ilvl w:val="0"/>
+          <w:numId w:val="2"/>
+        </w:numPr>
+        <w:spacing w:after="60"/>
+      </w:pPr>
+      <w:r>
+        <w:rPr>
+          <w:rFonts w:ascii="Calibri" w:cs="Calibri" w:eastAsia="Calibri" w:hAnsi="Calibri"/>
+          <w:sz w:val="22"/>
+          <w:szCs w:val="22"/>
+        </w:rPr>
+        <w:t xml:space="preserve">We acknowledge each complaint promptly and tell the person who is dealing with it and what happens next.</w:t>
+      </w:r>
+    </w:p>
+    <w:p>
+      <w:pPr>
+        <w:pStyle w:val="ListParagraph"/>
+        <w:numPr>
+          <w:ilvl w:val="0"/>
+          <w:numId w:val="2"/>
+        </w:numPr>
+        <w:spacing w:after="60"/>
+      </w:pPr>
+      <w:r>
+        <w:rPr>
+          <w:rFonts w:ascii="Calibri" w:cs="Calibri" w:eastAsia="Calibri" w:hAnsi="Calibri"/>
+          <w:sz w:val="22"/>
+          <w:szCs w:val="22"/>
+        </w:rPr>
+        <w:t xml:space="preserve">We follow procedural fairness and natural justice. We listen to everyone involved, keep an open mind and give reasons for our decision.</w:t>
+      </w:r>
+    </w:p>
+    <w:p>
+      <w:pPr>
+        <w:pStyle w:val="ListParagraph"/>
+        <w:numPr>
+          <w:ilvl w:val="0"/>
+          <w:numId w:val="2"/>
+        </w:numPr>
+        <w:spacing w:after="60"/>
+      </w:pPr>
+      <w:r>
+        <w:rPr>
+          <w:rFonts w:ascii="Calibri" w:cs="Calibri" w:eastAsia="Calibri" w:hAnsi="Calibri"/>
+          <w:sz w:val="22"/>
+          <w:szCs w:val="22"/>
+        </w:rPr>
+        <w:t xml:space="preserve">We record every complaint and its outcome in our complaints register and keep the records secure and private.</w:t>
+      </w:r>
+    </w:p>
+    <w:p>
+      <w:pPr>
+        <w:pStyle w:val="ListParagraph"/>
+        <w:numPr>
+          <w:ilvl w:val="0"/>
+          <w:numId w:val="2"/>
+        </w:numPr>
+        <w:spacing w:after="60"/>
+      </w:pPr>
+      <w:r>
+        <w:rPr>
+          <w:rFonts w:ascii="Calibri" w:cs="Calibri" w:eastAsia="Calibri" w:hAnsi="Calibri"/>
+          <w:sz w:val="22"/>
+          <w:szCs w:val="22"/>
+        </w:rPr>
+        <w:t xml:space="preserve">We use what complaints tell us to improve our supports, and we look at the register as part of each review.</w:t>
+      </w:r>
+    </w:p>
+    <w:p>
+      <w:pPr>
+        <w:pStyle w:val="ListParagraph"/>
+        <w:numPr>
+          <w:ilvl w:val="0"/>
+          <w:numId w:val="2"/>
+        </w:numPr>
+        <w:spacing w:after="60"/>
+      </w:pPr>
+      <w:r>
+        <w:rPr>
+          <w:rFonts w:ascii="Calibri" w:cs="Calibri" w:eastAsia="Calibri" w:hAnsi="Calibri"/>
+          <w:sz w:val="22"/>
+          <w:szCs w:val="22"/>
+        </w:rPr>
+        <w:t xml:space="preserve">We tell participants and others they can contact the Commission at any time, and we do not discourage them from doing so.</w:t>
+      </w:r>
+    </w:p>
+    <w:p>
+      <w:pPr>
+        <w:spacing w:after="120"/>
+      </w:pPr>
+      <w:r>
+        <w:rPr>
+          <w:rFonts w:ascii="Calibri" w:cs="Calibri" w:eastAsia="Calibri" w:hAnsi="Calibri"/>
+          <w:sz w:val="22"/>
+          <w:szCs w:val="22"/>
+        </w:rPr>
+        <w:t xml:space="preserve">The steps we follow are in section 7 Complaints procedure. The register is in section 8 Complaints register.</w:t>
+      </w:r>
+    </w:p>
+    <w:p>
+      <w:pPr>
+        <w:pStyle w:val="Heading1"/>
+        <w:spacing w:after="120" w:before="240"/>
+      </w:pPr>
+      <w:r>
+        <w:rPr>
+          <w:rFonts w:ascii="Calibri" w:cs="Calibri" w:eastAsia="Calibri" w:hAnsi="Calibri"/>
+          <w:b/>
+          <w:bCs/>
+        </w:rPr>
+        <w:t xml:space="preserve">5 How we put this into practice</w:t>
+      </w:r>
+    </w:p>
+    <w:p>
+      <w:pPr>
+        <w:spacing w:after="120"/>
+      </w:pPr>
+      <w:r>
+        <w:rPr>
+          <w:rFonts w:ascii="Calibri" w:cs="Calibri" w:eastAsia="Calibri" w:hAnsi="Calibri"/>
+          <w:sz w:val="22"/>
+          <w:szCs w:val="22"/>
+        </w:rPr>
+        <w:t xml:space="preserve">Sunrise Supports is run by one person, so I am the person who receives, looks into and resolves every complaint. These steps show how we welcome feedback and use it to improve our household tasks supports in New South Wales.</w:t>
+      </w:r>
+    </w:p>
+    <w:p>
+      <w:pPr>
+        <w:pStyle w:val="ListParagraph"/>
+        <w:numPr>
+          <w:ilvl w:val="0"/>
+          <w:numId w:val="3"/>
+        </w:numPr>
+        <w:spacing w:after="60"/>
+      </w:pPr>
+      <w:r>
+        <w:rPr>
+          <w:rFonts w:ascii="Calibri" w:cs="Calibri" w:eastAsia="Calibri" w:hAnsi="Calibri"/>
+          <w:sz w:val="22"/>
+          <w:szCs w:val="22"/>
+        </w:rPr>
+        <w:t xml:space="preserve">We tell every participant, and anyone supporting them, how to give feedback or make a complaint. We do this when supports start and again whenever they ask.</w:t>
+      </w:r>
+    </w:p>
+    <w:p>
+      <w:pPr>
+        <w:pStyle w:val="ListParagraph"/>
+        <w:numPr>
+          <w:ilvl w:val="0"/>
+          <w:numId w:val="3"/>
+        </w:numPr>
+        <w:spacing w:after="60"/>
+      </w:pPr>
+      <w:r>
+        <w:rPr>
+          <w:rFonts w:ascii="Calibri" w:cs="Calibri" w:eastAsia="Calibri" w:hAnsi="Calibri"/>
+          <w:sz w:val="22"/>
+          <w:szCs w:val="22"/>
+        </w:rPr>
+        <w:t xml:space="preserve">We accept feedback and complaints in any way a person finds easy: in person, by phone, by email, in writing, or through a family member, advocate or other person they choose.</w:t>
+      </w:r>
+    </w:p>
+    <w:p>
+      <w:pPr>
+        <w:pStyle w:val="ListParagraph"/>
+        <w:numPr>
+          <w:ilvl w:val="0"/>
+          <w:numId w:val="3"/>
+        </w:numPr>
+        <w:spacing w:after="60"/>
+      </w:pPr>
+      <w:r>
+        <w:rPr>
+          <w:rFonts w:ascii="Calibri" w:cs="Calibri" w:eastAsia="Calibri" w:hAnsi="Calibri"/>
+          <w:sz w:val="22"/>
+          <w:szCs w:val="22"/>
+        </w:rPr>
+        <w:t xml:space="preserve">We offer help to anyone who needs it to make a complaint, such as an interpreter, an easy read copy or an independent advocate. We tell participants they can also contact the Commission at any time.</w:t>
+      </w:r>
+    </w:p>
+    <w:p>
+      <w:pPr>
+        <w:pStyle w:val="ListParagraph"/>
+        <w:numPr>
+          <w:ilvl w:val="0"/>
+          <w:numId w:val="3"/>
+        </w:numPr>
+        <w:spacing w:after="60"/>
+      </w:pPr>
+      <w:r>
+        <w:rPr>
+          <w:rFonts w:ascii="Calibri" w:cs="Calibri" w:eastAsia="Calibri" w:hAnsi="Calibri"/>
+          <w:sz w:val="22"/>
+          <w:szCs w:val="22"/>
+        </w:rPr>
+        <w:t xml:space="preserve">We thank the person for raising the issue and acknowledge it as soon as we can. We follow the steps and timeframes in section 7 Complaints procedure.</w:t>
+      </w:r>
+    </w:p>
+    <w:p>
+      <w:pPr>
+        <w:pStyle w:val="ListParagraph"/>
+        <w:numPr>
+          <w:ilvl w:val="0"/>
+          <w:numId w:val="3"/>
+        </w:numPr>
+        <w:spacing w:after="60"/>
+      </w:pPr>
+      <w:r>
+        <w:rPr>
+          <w:rFonts w:ascii="Calibri" w:cs="Calibri" w:eastAsia="Calibri" w:hAnsi="Calibri"/>
+          <w:sz w:val="22"/>
+          <w:szCs w:val="22"/>
+        </w:rPr>
+        <w:t xml:space="preserve">We treat the person with respect. A complaint never changes the supports a participant receives or how we treat them.</w:t>
+      </w:r>
+    </w:p>
+    <w:p>
+      <w:pPr>
+        <w:pStyle w:val="ListParagraph"/>
+        <w:numPr>
+          <w:ilvl w:val="0"/>
+          <w:numId w:val="3"/>
+        </w:numPr>
+        <w:spacing w:after="60"/>
+      </w:pPr>
+      <w:r>
+        <w:rPr>
+          <w:rFonts w:ascii="Calibri" w:cs="Calibri" w:eastAsia="Calibri" w:hAnsi="Calibri"/>
+          <w:sz w:val="22"/>
+          <w:szCs w:val="22"/>
+        </w:rPr>
+        <w:t xml:space="preserve">We keep the details private. We share them only with people who need them to resolve the complaint or where the law requires it.</w:t>
+      </w:r>
+    </w:p>
+    <w:p>
+      <w:pPr>
+        <w:pStyle w:val="ListParagraph"/>
+        <w:numPr>
+          <w:ilvl w:val="0"/>
+          <w:numId w:val="3"/>
+        </w:numPr>
+        <w:spacing w:after="60"/>
+      </w:pPr>
+      <w:r>
+        <w:rPr>
+          <w:rFonts w:ascii="Calibri" w:cs="Calibri" w:eastAsia="Calibri" w:hAnsi="Calibri"/>
+          <w:sz w:val="22"/>
+          <w:szCs w:val="22"/>
+        </w:rPr>
+        <w:t xml:space="preserve">We look at each complaint fairly. We listen to everyone involved, tell them what is being said, and give them a chance to respond before we decide.</w:t>
+      </w:r>
+    </w:p>
+    <w:p>
+      <w:pPr>
+        <w:pStyle w:val="ListParagraph"/>
+        <w:numPr>
+          <w:ilvl w:val="0"/>
+          <w:numId w:val="3"/>
+        </w:numPr>
+        <w:spacing w:after="60"/>
+      </w:pPr>
+      <w:r>
+        <w:rPr>
+          <w:rFonts w:ascii="Calibri" w:cs="Calibri" w:eastAsia="Calibri" w:hAnsi="Calibri"/>
+          <w:sz w:val="22"/>
+          <w:szCs w:val="22"/>
+        </w:rPr>
+        <w:t xml:space="preserve">Because I am the only worker, I ask an independent person to look at any complaint about me. This could be an advocate or another provider. I do not review a complaint about myself alone.</w:t>
+      </w:r>
+    </w:p>
+    <w:p>
+      <w:pPr>
+        <w:pStyle w:val="ListParagraph"/>
+        <w:numPr>
+          <w:ilvl w:val="0"/>
+          <w:numId w:val="3"/>
+        </w:numPr>
+        <w:spacing w:after="60"/>
+      </w:pPr>
+      <w:r>
+        <w:rPr>
+          <w:rFonts w:ascii="Calibri" w:cs="Calibri" w:eastAsia="Calibri" w:hAnsi="Calibri"/>
+          <w:sz w:val="22"/>
+          <w:szCs w:val="22"/>
+        </w:rPr>
+        <w:t xml:space="preserve">We tell the person what we found, what we will do about it, and how they can ask for the outcome to be reviewed or take the matter further.</w:t>
+      </w:r>
+    </w:p>
+    <w:p>
+      <w:pPr>
+        <w:pStyle w:val="ListParagraph"/>
+        <w:numPr>
+          <w:ilvl w:val="0"/>
+          <w:numId w:val="3"/>
+        </w:numPr>
+        <w:spacing w:after="60"/>
+      </w:pPr>
+      <w:r>
+        <w:rPr>
+          <w:rFonts w:ascii="Calibri" w:cs="Calibri" w:eastAsia="Calibri" w:hAnsi="Calibri"/>
+          <w:sz w:val="22"/>
+          <w:szCs w:val="22"/>
+        </w:rPr>
+        <w:t xml:space="preserve">We record every complaint in the complaints register described in section 8 Complaints register, from the day we receive it to the day we close it.</w:t>
+      </w:r>
+    </w:p>
+    <w:p>
+      <w:pPr>
+        <w:pStyle w:val="ListParagraph"/>
+        <w:numPr>
+          <w:ilvl w:val="0"/>
+          <w:numId w:val="3"/>
+        </w:numPr>
+        <w:spacing w:after="60"/>
+      </w:pPr>
+      <w:r>
+        <w:rPr>
+          <w:rFonts w:ascii="Calibri" w:cs="Calibri" w:eastAsia="Calibri" w:hAnsi="Calibri"/>
+          <w:sz w:val="22"/>
+          <w:szCs w:val="22"/>
+        </w:rPr>
+        <w:t xml:space="preserve">We look for patterns and causes. We use each complaint to change how we work, and we record the changes we make.</w:t>
+      </w:r>
+    </w:p>
+    <w:p>
+      <w:pPr>
+        <w:pStyle w:val="ListParagraph"/>
+        <w:numPr>
+          <w:ilvl w:val="0"/>
+          <w:numId w:val="3"/>
+        </w:numPr>
+        <w:spacing w:after="60"/>
+      </w:pPr>
+      <w:r>
+        <w:rPr>
+          <w:rFonts w:ascii="Calibri" w:cs="Calibri" w:eastAsia="Calibri" w:hAnsi="Calibri"/>
+          <w:sz w:val="22"/>
+          <w:szCs w:val="22"/>
+        </w:rPr>
+        <w:t xml:space="preserve">We review this policy every 12 months and the complaints register every 3 months, as set out in section 11 Review.</w:t>
+      </w:r>
+    </w:p>
+    <w:tbl>
+      <w:tblPr>
+        <w:tblW w:type="dxa" w:w="9000"/>
+        <w:tblBorders>
+          <w:top w:val="single" w:color="auto" w:sz="4"/>
+          <w:left w:val="single" w:color="auto" w:sz="4"/>
+          <w:bottom w:val="single" w:color="auto" w:sz="4"/>
+          <w:right w:val="single" w:color="auto" w:sz="4"/>
+          <w:insideH w:val="single" w:color="auto" w:sz="4"/>
+          <w:insideV w:val="single" w:color="auto" w:sz="4"/>
+        </w:tblBorders>
+      </w:tblPr>
+      <w:tblGrid>
+        <w:gridCol w:w="9000"/>
+      </w:tblGrid>
+      <w:tr>
+        <w:tc>
+          <w:tcPr>
+            <w:tcW w:type="dxa" w:w="9000"/>
+            <w:tcBorders>
+              <w:top w:val="single" w:color="999999" w:sz="4"/>
+              <w:left w:val="single" w:color="999999" w:sz="4"/>
+              <w:bottom w:val="single" w:color="999999" w:sz="4"/>
+              <w:right w:val="single" w:color="999999" w:sz="4"/>
+            </w:tcBorders>
+            <w:shd w:fill="FFF4CE" w:val="clear"/>
+          </w:tcPr>
+          <w:p>
+            <w:r>
+              <w:rPr>
+                <w:rFonts w:ascii="Calibri" w:cs="Calibri" w:eastAsia="Calibri" w:hAnsi="Calibri"/>
+                <w:i/>
+                <w:iCs/>
+                <w:sz w:val="22"/>
+                <w:szCs w:val="22"/>
+              </w:rPr>
+              <w:t xml:space="preserve">[Provider to complete: name of the independent person or organisation who will review any complaint about the sole trader]</w:t>
+            </w:r>
+          </w:p>
+        </w:tc>
+      </w:tr>
+    </w:tbl>
+    <w:p>
+      <w:pPr>
+        <w:spacing w:after="120"/>
+      </w:pPr>
+      <w:r>
+        <w:rPr>
+          <w:rFonts w:ascii="Calibri" w:cs="Calibri" w:eastAsia="Calibri" w:hAnsi="Calibri"/>
+          <w:sz w:val="22"/>
+          <w:szCs w:val="22"/>
+        </w:rPr>
+        <w:t xml:space="preserve"/>
+      </w:r>
+    </w:p>
+    <w:p>
+      <w:pPr>
+        <w:pStyle w:val="Heading1"/>
+        <w:spacing w:after="120" w:before="240"/>
+      </w:pPr>
+      <w:r>
+        <w:rPr>
+          <w:rFonts w:ascii="Calibri" w:cs="Calibri" w:eastAsia="Calibri" w:hAnsi="Calibri"/>
+          <w:b/>
+          <w:bCs/>
+        </w:rPr>
         <w:t xml:space="preserve">6 Responsibilities</w:t>
       </w:r>
     </w:p>
@@ -1328,7 +1424,7 @@
           <w:sz w:val="22"/>
           <w:szCs w:val="22"/>
         </w:rPr>
-        <w:t xml:space="preserve">Sunrise Supports is run by one person, who is the sole trader and the only worker. That one person holds every role in this policy. The table below shows what each role does, so the work is clear to us, to participants and to an auditor.</w:t>
+        <w:t xml:space="preserve">Sunrise Supports is run by one person, a sole trader. There are no other workers. We hold every role in this policy ourselves, so we have written the table by role to show what is done and when.</w:t>
       </w:r>
     </w:p>
     <w:tbl>
@@ -1443,49 +1539,49 @@
                 <w:sz w:val="22"/>
                 <w:szCs w:val="22"/>
               </w:rPr>
-              <w:t xml:space="preserve">Owner and sole worker (complaints officer)</w:t>
-            </w:r>
-          </w:p>
-        </w:tc>
-        <w:tc>
-          <w:tcPr>
-            <w:tcW w:type="dxa" w:w="3000"/>
-            <w:tcBorders>
-              <w:top w:val="single" w:color="999999" w:sz="4"/>
-              <w:left w:val="single" w:color="999999" w:sz="4"/>
-              <w:bottom w:val="single" w:color="999999" w:sz="4"/>
-              <w:right w:val="single" w:color="999999" w:sz="4"/>
-            </w:tcBorders>
-          </w:tcPr>
-          <w:p>
-            <w:r>
-              <w:rPr>
-                <w:rFonts w:ascii="Calibri" w:cs="Calibri" w:eastAsia="Calibri" w:hAnsi="Calibri"/>
-                <w:sz w:val="22"/>
-                <w:szCs w:val="22"/>
-              </w:rPr>
-              <w:t xml:space="preserve">Welcomes feedback and complaints, acknowledges each one, looks into it fairly, decides how to resolve it, and tells the person what we decided and why. Follows section 7 Complaints procedure.</w:t>
-            </w:r>
-          </w:p>
-        </w:tc>
-        <w:tc>
-          <w:tcPr>
-            <w:tcW w:type="dxa" w:w="3000"/>
-            <w:tcBorders>
-              <w:top w:val="single" w:color="999999" w:sz="4"/>
-              <w:left w:val="single" w:color="999999" w:sz="4"/>
-              <w:bottom w:val="single" w:color="999999" w:sz="4"/>
-              <w:right w:val="single" w:color="999999" w:sz="4"/>
-            </w:tcBorders>
-          </w:tcPr>
-          <w:p>
-            <w:r>
-              <w:rPr>
-                <w:rFonts w:ascii="Calibri" w:cs="Calibri" w:eastAsia="Calibri" w:hAnsi="Calibri"/>
-                <w:sz w:val="22"/>
-                <w:szCs w:val="22"/>
-              </w:rPr>
-              <w:t xml:space="preserve">Each time feedback or a complaint is received</w:t>
+              <w:t xml:space="preserve">Owner and sole worker, Sunrise Supports</w:t>
+            </w:r>
+          </w:p>
+        </w:tc>
+        <w:tc>
+          <w:tcPr>
+            <w:tcW w:type="dxa" w:w="3000"/>
+            <w:tcBorders>
+              <w:top w:val="single" w:color="999999" w:sz="4"/>
+              <w:left w:val="single" w:color="999999" w:sz="4"/>
+              <w:bottom w:val="single" w:color="999999" w:sz="4"/>
+              <w:right w:val="single" w:color="999999" w:sz="4"/>
+            </w:tcBorders>
+          </w:tcPr>
+          <w:p>
+            <w:r>
+              <w:rPr>
+                <w:rFonts w:ascii="Calibri" w:cs="Calibri" w:eastAsia="Calibri" w:hAnsi="Calibri"/>
+                <w:sz w:val="22"/>
+                <w:szCs w:val="22"/>
+              </w:rPr>
+              <w:t xml:space="preserve">Welcomes feedback and complaints, acknowledges them, works to resolve them and keeps the complaints register up to date. The steps are in section 7 Complaints procedure.</w:t>
+            </w:r>
+          </w:p>
+        </w:tc>
+        <w:tc>
+          <w:tcPr>
+            <w:tcW w:type="dxa" w:w="3000"/>
+            <w:tcBorders>
+              <w:top w:val="single" w:color="999999" w:sz="4"/>
+              <w:left w:val="single" w:color="999999" w:sz="4"/>
+              <w:bottom w:val="single" w:color="999999" w:sz="4"/>
+              <w:right w:val="single" w:color="999999" w:sz="4"/>
+            </w:tcBorders>
+          </w:tcPr>
+          <w:p>
+            <w:r>
+              <w:rPr>
+                <w:rFonts w:ascii="Calibri" w:cs="Calibri" w:eastAsia="Calibri" w:hAnsi="Calibri"/>
+                <w:sz w:val="22"/>
+                <w:szCs w:val="22"/>
+              </w:rPr>
+              <w:t xml:space="preserve">Every time feedback or a complaint is received</w:t>
             </w:r>
           </w:p>
         </w:tc>
@@ -1508,49 +1604,49 @@
                 <w:sz w:val="22"/>
                 <w:szCs w:val="22"/>
               </w:rPr>
-              <w:t xml:space="preserve">Owner and sole worker (register keeper)</w:t>
-            </w:r>
-          </w:p>
-        </w:tc>
-        <w:tc>
-          <w:tcPr>
-            <w:tcW w:type="dxa" w:w="3000"/>
-            <w:tcBorders>
-              <w:top w:val="single" w:color="999999" w:sz="4"/>
-              <w:left w:val="single" w:color="999999" w:sz="4"/>
-              <w:bottom w:val="single" w:color="999999" w:sz="4"/>
-              <w:right w:val="single" w:color="999999" w:sz="4"/>
-            </w:tcBorders>
-          </w:tcPr>
-          <w:p>
-            <w:r>
-              <w:rPr>
-                <w:rFonts w:ascii="Calibri" w:cs="Calibri" w:eastAsia="Calibri" w:hAnsi="Calibri"/>
-                <w:sz w:val="22"/>
-                <w:szCs w:val="22"/>
-              </w:rPr>
-              <w:t xml:space="preserve">Enters every complaint in the complaints register, keeps it up to date, and keeps the records listed in section 9 Records and evidence to retain.</w:t>
-            </w:r>
-          </w:p>
-        </w:tc>
-        <w:tc>
-          <w:tcPr>
-            <w:tcW w:type="dxa" w:w="3000"/>
-            <w:tcBorders>
-              <w:top w:val="single" w:color="999999" w:sz="4"/>
-              <w:left w:val="single" w:color="999999" w:sz="4"/>
-              <w:bottom w:val="single" w:color="999999" w:sz="4"/>
-              <w:right w:val="single" w:color="999999" w:sz="4"/>
-            </w:tcBorders>
-          </w:tcPr>
-          <w:p>
-            <w:r>
-              <w:rPr>
-                <w:rFonts w:ascii="Calibri" w:cs="Calibri" w:eastAsia="Calibri" w:hAnsi="Calibri"/>
-                <w:sz w:val="22"/>
-                <w:szCs w:val="22"/>
-              </w:rPr>
-              <w:t xml:space="preserve">When a complaint is received and each time its status changes</w:t>
+              <w:t xml:space="preserve">Owner and sole worker, Sunrise Supports</w:t>
+            </w:r>
+          </w:p>
+        </w:tc>
+        <w:tc>
+          <w:tcPr>
+            <w:tcW w:type="dxa" w:w="3000"/>
+            <w:tcBorders>
+              <w:top w:val="single" w:color="999999" w:sz="4"/>
+              <w:left w:val="single" w:color="999999" w:sz="4"/>
+              <w:bottom w:val="single" w:color="999999" w:sz="4"/>
+              <w:right w:val="single" w:color="999999" w:sz="4"/>
+            </w:tcBorders>
+          </w:tcPr>
+          <w:p>
+            <w:r>
+              <w:rPr>
+                <w:rFonts w:ascii="Calibri" w:cs="Calibri" w:eastAsia="Calibri" w:hAnsi="Calibri"/>
+                <w:sz w:val="22"/>
+                <w:szCs w:val="22"/>
+              </w:rPr>
+              <w:t xml:space="preserve">Makes sure each participant knows how to give feedback or make a complaint and how to use outside help if they prefer.</w:t>
+            </w:r>
+          </w:p>
+        </w:tc>
+        <w:tc>
+          <w:tcPr>
+            <w:tcW w:type="dxa" w:w="3000"/>
+            <w:tcBorders>
+              <w:top w:val="single" w:color="999999" w:sz="4"/>
+              <w:left w:val="single" w:color="999999" w:sz="4"/>
+              <w:bottom w:val="single" w:color="999999" w:sz="4"/>
+              <w:right w:val="single" w:color="999999" w:sz="4"/>
+            </w:tcBorders>
+          </w:tcPr>
+          <w:p>
+            <w:r>
+              <w:rPr>
+                <w:rFonts w:ascii="Calibri" w:cs="Calibri" w:eastAsia="Calibri" w:hAnsi="Calibri"/>
+                <w:sz w:val="22"/>
+                <w:szCs w:val="22"/>
+              </w:rPr>
+              <w:t xml:space="preserve">When a participant starts with us, and again if they ask or their needs change</w:t>
             </w:r>
           </w:p>
         </w:tc>
@@ -1573,49 +1669,49 @@
                 <w:sz w:val="22"/>
                 <w:szCs w:val="22"/>
               </w:rPr>
-              <w:t xml:space="preserve">Owner and sole worker (improvement lead)</w:t>
-            </w:r>
-          </w:p>
-        </w:tc>
-        <w:tc>
-          <w:tcPr>
-            <w:tcW w:type="dxa" w:w="3000"/>
-            <w:tcBorders>
-              <w:top w:val="single" w:color="999999" w:sz="4"/>
-              <w:left w:val="single" w:color="999999" w:sz="4"/>
-              <w:bottom w:val="single" w:color="999999" w:sz="4"/>
-              <w:right w:val="single" w:color="999999" w:sz="4"/>
-            </w:tcBorders>
-          </w:tcPr>
-          <w:p>
-            <w:r>
-              <w:rPr>
-                <w:rFonts w:ascii="Calibri" w:cs="Calibri" w:eastAsia="Calibri" w:hAnsi="Calibri"/>
-                <w:sz w:val="22"/>
-                <w:szCs w:val="22"/>
-              </w:rPr>
-              <w:t xml:space="preserve">Looks at what complaints show us and changes how we work where needed. Records the change.</w:t>
-            </w:r>
-          </w:p>
-        </w:tc>
-        <w:tc>
-          <w:tcPr>
-            <w:tcW w:type="dxa" w:w="3000"/>
-            <w:tcBorders>
-              <w:top w:val="single" w:color="999999" w:sz="4"/>
-              <w:left w:val="single" w:color="999999" w:sz="4"/>
-              <w:bottom w:val="single" w:color="999999" w:sz="4"/>
-              <w:right w:val="single" w:color="999999" w:sz="4"/>
-            </w:tcBorders>
-          </w:tcPr>
-          <w:p>
-            <w:r>
-              <w:rPr>
-                <w:rFonts w:ascii="Calibri" w:cs="Calibri" w:eastAsia="Calibri" w:hAnsi="Calibri"/>
-                <w:sz w:val="22"/>
-                <w:szCs w:val="22"/>
-              </w:rPr>
-              <w:t xml:space="preserve">When a complaint is closed and at each register review</w:t>
+              <w:t xml:space="preserve">Owner and sole worker, Sunrise Supports</w:t>
+            </w:r>
+          </w:p>
+        </w:tc>
+        <w:tc>
+          <w:tcPr>
+            <w:tcW w:type="dxa" w:w="3000"/>
+            <w:tcBorders>
+              <w:top w:val="single" w:color="999999" w:sz="4"/>
+              <w:left w:val="single" w:color="999999" w:sz="4"/>
+              <w:bottom w:val="single" w:color="999999" w:sz="4"/>
+              <w:right w:val="single" w:color="999999" w:sz="4"/>
+            </w:tcBorders>
+          </w:tcPr>
+          <w:p>
+            <w:r>
+              <w:rPr>
+                <w:rFonts w:ascii="Calibri" w:cs="Calibri" w:eastAsia="Calibri" w:hAnsi="Calibri"/>
+                <w:sz w:val="22"/>
+                <w:szCs w:val="22"/>
+              </w:rPr>
+              <w:t xml:space="preserve">Records each complaint in the complaints register and keeps the records listed in section 9 Records and evidence to retain.</w:t>
+            </w:r>
+          </w:p>
+        </w:tc>
+        <w:tc>
+          <w:tcPr>
+            <w:tcW w:type="dxa" w:w="3000"/>
+            <w:tcBorders>
+              <w:top w:val="single" w:color="999999" w:sz="4"/>
+              <w:left w:val="single" w:color="999999" w:sz="4"/>
+              <w:bottom w:val="single" w:color="999999" w:sz="4"/>
+              <w:right w:val="single" w:color="999999" w:sz="4"/>
+            </w:tcBorders>
+          </w:tcPr>
+          <w:p>
+            <w:r>
+              <w:rPr>
+                <w:rFonts w:ascii="Calibri" w:cs="Calibri" w:eastAsia="Calibri" w:hAnsi="Calibri"/>
+                <w:sz w:val="22"/>
+                <w:szCs w:val="22"/>
+              </w:rPr>
+              <w:t xml:space="preserve">As each complaint is received and each step is taken</w:t>
             </w:r>
           </w:p>
         </w:tc>
@@ -1638,49 +1734,179 @@
                 <w:sz w:val="22"/>
                 <w:szCs w:val="22"/>
               </w:rPr>
-              <w:t xml:space="preserve">Owner and sole worker (policy owner)</w:t>
-            </w:r>
-          </w:p>
-        </w:tc>
-        <w:tc>
-          <w:tcPr>
-            <w:tcW w:type="dxa" w:w="3000"/>
-            <w:tcBorders>
-              <w:top w:val="single" w:color="999999" w:sz="4"/>
-              <w:left w:val="single" w:color="999999" w:sz="4"/>
-              <w:bottom w:val="single" w:color="999999" w:sz="4"/>
-              <w:right w:val="single" w:color="999999" w:sz="4"/>
-            </w:tcBorders>
-          </w:tcPr>
-          <w:p>
-            <w:r>
-              <w:rPr>
-                <w:rFonts w:ascii="Calibri" w:cs="Calibri" w:eastAsia="Calibri" w:hAnsi="Calibri"/>
-                <w:sz w:val="22"/>
-                <w:szCs w:val="22"/>
-              </w:rPr>
-              <w:t xml:space="preserve">Reviews this policy and the register. Review dates are set out in section 11 Review.</w:t>
-            </w:r>
-          </w:p>
-        </w:tc>
-        <w:tc>
-          <w:tcPr>
-            <w:tcW w:type="dxa" w:w="3000"/>
-            <w:tcBorders>
-              <w:top w:val="single" w:color="999999" w:sz="4"/>
-              <w:left w:val="single" w:color="999999" w:sz="4"/>
-              <w:bottom w:val="single" w:color="999999" w:sz="4"/>
-              <w:right w:val="single" w:color="999999" w:sz="4"/>
-            </w:tcBorders>
-          </w:tcPr>
-          <w:p>
-            <w:r>
-              <w:rPr>
-                <w:rFonts w:ascii="Calibri" w:cs="Calibri" w:eastAsia="Calibri" w:hAnsi="Calibri"/>
-                <w:sz w:val="22"/>
-                <w:szCs w:val="22"/>
-              </w:rPr>
-              <w:t xml:space="preserve">Policy every 12 months; register every 3 months</w:t>
+              <w:t xml:space="preserve">Owner and sole worker, Sunrise Supports</w:t>
+            </w:r>
+          </w:p>
+        </w:tc>
+        <w:tc>
+          <w:tcPr>
+            <w:tcW w:type="dxa" w:w="3000"/>
+            <w:tcBorders>
+              <w:top w:val="single" w:color="999999" w:sz="4"/>
+              <w:left w:val="single" w:color="999999" w:sz="4"/>
+              <w:bottom w:val="single" w:color="999999" w:sz="4"/>
+              <w:right w:val="single" w:color="999999" w:sz="4"/>
+            </w:tcBorders>
+          </w:tcPr>
+          <w:p>
+            <w:r>
+              <w:rPr>
+                <w:rFonts w:ascii="Calibri" w:cs="Calibri" w:eastAsia="Calibri" w:hAnsi="Calibri"/>
+                <w:sz w:val="22"/>
+                <w:szCs w:val="22"/>
+              </w:rPr>
+              <w:t xml:space="preserve">Looks at what complaints show us and decides what to change to improve our supports.</w:t>
+            </w:r>
+          </w:p>
+        </w:tc>
+        <w:tc>
+          <w:tcPr>
+            <w:tcW w:type="dxa" w:w="3000"/>
+            <w:tcBorders>
+              <w:top w:val="single" w:color="999999" w:sz="4"/>
+              <w:left w:val="single" w:color="999999" w:sz="4"/>
+              <w:bottom w:val="single" w:color="999999" w:sz="4"/>
+              <w:right w:val="single" w:color="999999" w:sz="4"/>
+            </w:tcBorders>
+          </w:tcPr>
+          <w:p>
+            <w:r>
+              <w:rPr>
+                <w:rFonts w:ascii="Calibri" w:cs="Calibri" w:eastAsia="Calibri" w:hAnsi="Calibri"/>
+                <w:sz w:val="22"/>
+                <w:szCs w:val="22"/>
+              </w:rPr>
+              <w:t xml:space="preserve">When a complaint is closed, and at each register review</w:t>
+            </w:r>
+          </w:p>
+        </w:tc>
+      </w:tr>
+      <w:tr>
+        <w:tc>
+          <w:tcPr>
+            <w:tcW w:type="dxa" w:w="3000"/>
+            <w:tcBorders>
+              <w:top w:val="single" w:color="999999" w:sz="4"/>
+              <w:left w:val="single" w:color="999999" w:sz="4"/>
+              <w:bottom w:val="single" w:color="999999" w:sz="4"/>
+              <w:right w:val="single" w:color="999999" w:sz="4"/>
+            </w:tcBorders>
+          </w:tcPr>
+          <w:p>
+            <w:r>
+              <w:rPr>
+                <w:rFonts w:ascii="Calibri" w:cs="Calibri" w:eastAsia="Calibri" w:hAnsi="Calibri"/>
+                <w:sz w:val="22"/>
+                <w:szCs w:val="22"/>
+              </w:rPr>
+              <w:t xml:space="preserve">Owner and sole worker, Sunrise Supports</w:t>
+            </w:r>
+          </w:p>
+        </w:tc>
+        <w:tc>
+          <w:tcPr>
+            <w:tcW w:type="dxa" w:w="3000"/>
+            <w:tcBorders>
+              <w:top w:val="single" w:color="999999" w:sz="4"/>
+              <w:left w:val="single" w:color="999999" w:sz="4"/>
+              <w:bottom w:val="single" w:color="999999" w:sz="4"/>
+              <w:right w:val="single" w:color="999999" w:sz="4"/>
+            </w:tcBorders>
+          </w:tcPr>
+          <w:p>
+            <w:r>
+              <w:rPr>
+                <w:rFonts w:ascii="Calibri" w:cs="Calibri" w:eastAsia="Calibri" w:hAnsi="Calibri"/>
+                <w:sz w:val="22"/>
+                <w:szCs w:val="22"/>
+              </w:rPr>
+              <w:t xml:space="preserve">Reviews this policy and procedure.</w:t>
+            </w:r>
+          </w:p>
+        </w:tc>
+        <w:tc>
+          <w:tcPr>
+            <w:tcW w:type="dxa" w:w="3000"/>
+            <w:tcBorders>
+              <w:top w:val="single" w:color="999999" w:sz="4"/>
+              <w:left w:val="single" w:color="999999" w:sz="4"/>
+              <w:bottom w:val="single" w:color="999999" w:sz="4"/>
+              <w:right w:val="single" w:color="999999" w:sz="4"/>
+            </w:tcBorders>
+          </w:tcPr>
+          <w:p>
+            <w:r>
+              <w:rPr>
+                <w:rFonts w:ascii="Calibri" w:cs="Calibri" w:eastAsia="Calibri" w:hAnsi="Calibri"/>
+                <w:sz w:val="22"/>
+                <w:szCs w:val="22"/>
+              </w:rPr>
+              <w:t xml:space="preserve">Every 12 months</w:t>
+            </w:r>
+          </w:p>
+        </w:tc>
+      </w:tr>
+      <w:tr>
+        <w:tc>
+          <w:tcPr>
+            <w:tcW w:type="dxa" w:w="3000"/>
+            <w:tcBorders>
+              <w:top w:val="single" w:color="999999" w:sz="4"/>
+              <w:left w:val="single" w:color="999999" w:sz="4"/>
+              <w:bottom w:val="single" w:color="999999" w:sz="4"/>
+              <w:right w:val="single" w:color="999999" w:sz="4"/>
+            </w:tcBorders>
+          </w:tcPr>
+          <w:p>
+            <w:r>
+              <w:rPr>
+                <w:rFonts w:ascii="Calibri" w:cs="Calibri" w:eastAsia="Calibri" w:hAnsi="Calibri"/>
+                <w:sz w:val="22"/>
+                <w:szCs w:val="22"/>
+              </w:rPr>
+              <w:t xml:space="preserve">Owner and sole worker, Sunrise Supports</w:t>
+            </w:r>
+          </w:p>
+        </w:tc>
+        <w:tc>
+          <w:tcPr>
+            <w:tcW w:type="dxa" w:w="3000"/>
+            <w:tcBorders>
+              <w:top w:val="single" w:color="999999" w:sz="4"/>
+              <w:left w:val="single" w:color="999999" w:sz="4"/>
+              <w:bottom w:val="single" w:color="999999" w:sz="4"/>
+              <w:right w:val="single" w:color="999999" w:sz="4"/>
+            </w:tcBorders>
+          </w:tcPr>
+          <w:p>
+            <w:r>
+              <w:rPr>
+                <w:rFonts w:ascii="Calibri" w:cs="Calibri" w:eastAsia="Calibri" w:hAnsi="Calibri"/>
+                <w:sz w:val="22"/>
+                <w:szCs w:val="22"/>
+              </w:rPr>
+              <w:t xml:space="preserve">Reviews the complaints register.</w:t>
+            </w:r>
+          </w:p>
+        </w:tc>
+        <w:tc>
+          <w:tcPr>
+            <w:tcW w:type="dxa" w:w="3000"/>
+            <w:tcBorders>
+              <w:top w:val="single" w:color="999999" w:sz="4"/>
+              <w:left w:val="single" w:color="999999" w:sz="4"/>
+              <w:bottom w:val="single" w:color="999999" w:sz="4"/>
+              <w:right w:val="single" w:color="999999" w:sz="4"/>
+            </w:tcBorders>
+          </w:tcPr>
+          <w:p>
+            <w:r>
+              <w:rPr>
+                <w:rFonts w:ascii="Calibri" w:cs="Calibri" w:eastAsia="Calibri" w:hAnsi="Calibri"/>
+                <w:sz w:val="22"/>
+                <w:szCs w:val="22"/>
+              </w:rPr>
+              <w:t xml:space="preserve">Every 3 months</w:t>
             </w:r>
           </w:p>
         </w:tc>
@@ -1709,7 +1935,7 @@
           <w:sz w:val="22"/>
           <w:szCs w:val="22"/>
         </w:rPr>
-        <w:t xml:space="preserve">Because one person holds every role, a complaint may be about the owner. When that happens, we offer the participant the other ways to complain described in section 5 How we put this into practice and section 7 Complaints procedure. We also keep the complaint and our response on the register, and we do not close it until the participant has been told of their options.</w:t>
+        <w:t xml:space="preserve">If a complaint is about us, we do not decide it alone without telling the complainant about their other options. Section 7 Complaints procedure explains where a complainant can take their complaint outside Sunrise Supports.</w:t>
       </w:r>
     </w:p>
     <w:p>
@@ -1722,62 +1948,7 @@
           <w:sz w:val="22"/>
           <w:szCs w:val="22"/>
         </w:rPr>
-        <w:t xml:space="preserve">Anyone can raise a concern or make a complaint. Participants, their families and nominees, and other people do not need to use any set words or form. We treat each one with respect.</w:t>
-      </w:r>
-    </w:p>
-    <w:tbl>
-      <w:tblPr>
-        <w:tblW w:type="dxa" w:w="9000"/>
-        <w:tblBorders>
-          <w:top w:val="single" w:color="auto" w:sz="4"/>
-          <w:left w:val="single" w:color="auto" w:sz="4"/>
-          <w:bottom w:val="single" w:color="auto" w:sz="4"/>
-          <w:right w:val="single" w:color="auto" w:sz="4"/>
-          <w:insideH w:val="single" w:color="auto" w:sz="4"/>
-          <w:insideV w:val="single" w:color="auto" w:sz="4"/>
-        </w:tblBorders>
-      </w:tblPr>
-      <w:tblGrid>
-        <w:gridCol w:w="9000"/>
-      </w:tblGrid>
-      <w:tr>
-        <w:tc>
-          <w:tcPr>
-            <w:tcW w:type="dxa" w:w="9000"/>
-            <w:tcBorders>
-              <w:top w:val="single" w:color="999999" w:sz="4"/>
-              <w:left w:val="single" w:color="999999" w:sz="4"/>
-              <w:bottom w:val="single" w:color="999999" w:sz="4"/>
-              <w:right w:val="single" w:color="999999" w:sz="4"/>
-            </w:tcBorders>
-            <w:shd w:fill="FFF4CE" w:val="clear"/>
-          </w:tcPr>
-          <w:p>
-            <w:r>
-              <w:rPr>
-                <w:rFonts w:ascii="Calibri" w:cs="Calibri" w:eastAsia="Calibri" w:hAnsi="Calibri"/>
-                <w:i/>
-                <w:iCs/>
-                <w:sz w:val="22"/>
-                <w:szCs w:val="22"/>
-              </w:rPr>
-              <w:t xml:space="preserve">[Provider to complete: if you later add workers or an office manager, list each new role here and who holds it.]</w:t>
-            </w:r>
-          </w:p>
-        </w:tc>
-      </w:tr>
-    </w:tbl>
-    <w:p>
-      <w:pPr>
-        <w:spacing w:after="120"/>
-      </w:pPr>
-      <w:r>
-        <w:rPr>
-          <w:rFonts w:ascii="Calibri" w:cs="Calibri" w:eastAsia="Calibri" w:hAnsi="Calibri"/>
-          <w:sz w:val="22"/>
-          <w:szCs w:val="22"/>
-        </w:rPr>
-        <w:t xml:space="preserve"/>
+        <w:t xml:space="preserve">If we take on workers later, we will add each new role to this table and tell those workers what is expected of them before they start work.</w:t>
       </w:r>
     </w:p>
     <w:p>
@@ -1804,7 +1975,7 @@
           <w:sz w:val="22"/>
           <w:szCs w:val="22"/>
         </w:rPr>
-        <w:t xml:space="preserve">Sunrise Supports is a sole trader business delivering 0120 Household tasks in New South Wales. I handle every complaint myself. This section sets out the steps we follow. The definitions are in section 3 Definitions, and the roles are in section 6 Responsibilities.</w:t>
+        <w:t xml:space="preserve">Sunrise Supports is run by one person, so every step below is done by the owner. We follow these steps for every complaint, whether it is made in person, by phone, in writing or through someone speaking for the participant.</w:t>
       </w:r>
     </w:p>
     <w:p>
@@ -1812,7 +1983,7 @@
         <w:pStyle w:val="ListParagraph"/>
         <w:numPr>
           <w:ilvl w:val="0"/>
-          <w:numId w:val="5"/>
+          <w:numId w:val="4"/>
         </w:numPr>
         <w:spacing w:after="60"/>
       </w:pPr>
@@ -1822,7 +1993,7 @@
           <w:sz w:val="22"/>
           <w:szCs w:val="22"/>
         </w:rPr>
-        <w:t xml:space="preserve">Receive the complaint. A participant, a family member, a nominee, an advocate or anyone else can complain in person, by phone, by email, in writing or through another person. We write down what was said and thank the person for raising it.</w:t>
+        <w:t xml:space="preserve">Receive the complaint. We listen, thank the person for raising it and write down what they tell us in their own words. We ask how they would like us to keep in touch.</w:t>
       </w:r>
     </w:p>
     <w:p>
@@ -1830,7 +2001,7 @@
         <w:pStyle w:val="ListParagraph"/>
         <w:numPr>
           <w:ilvl w:val="0"/>
-          <w:numId w:val="5"/>
+          <w:numId w:val="4"/>
         </w:numPr>
         <w:spacing w:after="60"/>
       </w:pPr>
@@ -1840,7 +2011,7 @@
           <w:sz w:val="22"/>
           <w:szCs w:val="22"/>
         </w:rPr>
-        <w:t xml:space="preserve">Offer support. We ask if the person wants an advocate, an interpreter or another kind of help to make or follow the complaint. We make sure the participant gets the supports they need to take part.</w:t>
+        <w:t xml:space="preserve">Record it. We add the complaint to the complaints register described in section 8 Complaints register on the day we receive it.</w:t>
       </w:r>
     </w:p>
     <w:p>
@@ -1848,7 +2019,7 @@
         <w:pStyle w:val="ListParagraph"/>
         <w:numPr>
           <w:ilvl w:val="0"/>
-          <w:numId w:val="5"/>
+          <w:numId w:val="4"/>
         </w:numPr>
         <w:spacing w:after="60"/>
       </w:pPr>
@@ -1858,7 +2029,7 @@
           <w:sz w:val="22"/>
           <w:szCs w:val="22"/>
         </w:rPr>
-        <w:t xml:space="preserve">Record it. We enter the complaint in the complaints register (see section 8 Complaints register) on the day we receive it, without participant details beyond what the entry needs.</w:t>
+        <w:t xml:space="preserve">Acknowledge it. We tell the person we have received the complaint, who is dealing with it and what happens next. We use the timeframes set out in section 4 Policy statement.</w:t>
       </w:r>
     </w:p>
     <w:p>
@@ -1866,7 +2037,7 @@
         <w:pStyle w:val="ListParagraph"/>
         <w:numPr>
           <w:ilvl w:val="0"/>
-          <w:numId w:val="5"/>
+          <w:numId w:val="4"/>
         </w:numPr>
         <w:spacing w:after="60"/>
       </w:pPr>
@@ -1876,7 +2047,7 @@
           <w:sz w:val="22"/>
           <w:szCs w:val="22"/>
         </w:rPr>
-        <w:t xml:space="preserve">Acknowledge it. We tell the person we have received the complaint, who is handling it and what happens next, within the time shown in the table below.</w:t>
+        <w:t xml:space="preserve">Check for risk. We decide whether anyone is at risk of harm right now. If a participant is at risk, we make them safe first. If the matter may be a reportable incident, we follow our incident management documents and tell the Commission as the rules require.</w:t>
       </w:r>
     </w:p>
     <w:p>
@@ -1884,7 +2055,7 @@
         <w:pStyle w:val="ListParagraph"/>
         <w:numPr>
           <w:ilvl w:val="0"/>
-          <w:numId w:val="5"/>
+          <w:numId w:val="4"/>
         </w:numPr>
         <w:spacing w:after="60"/>
       </w:pPr>
@@ -1894,7 +2065,7 @@
           <w:sz w:val="22"/>
           <w:szCs w:val="22"/>
         </w:rPr>
-        <w:t xml:space="preserve">Check for urgent risk. If anyone may be at risk of harm, we make them safe first. We then check whether the matter also needs action under the incident management documents listed in section 10 Related documents and registers.</w:t>
+        <w:t xml:space="preserve">Look into it. We gather the facts, talk with the person who complained and anyone else involved, and give each person a fair chance to share their view. We keep an open mind and do not decide before we have heard everyone.</w:t>
       </w:r>
     </w:p>
     <w:p>
@@ -1902,7 +2073,7 @@
         <w:pStyle w:val="ListParagraph"/>
         <w:numPr>
           <w:ilvl w:val="0"/>
-          <w:numId w:val="5"/>
+          <w:numId w:val="4"/>
         </w:numPr>
         <w:spacing w:after="60"/>
       </w:pPr>
@@ -1912,7 +2083,7 @@
           <w:sz w:val="22"/>
           <w:szCs w:val="22"/>
         </w:rPr>
-        <w:t xml:space="preserve">Look into it fairly. We listen to the complainant and to anyone the complaint is about. We keep an open mind, tell each person what has been said about them and give them a chance to respond. We do not decide before we have all the facts.</w:t>
+        <w:t xml:space="preserve">Decide and respond. We tell the person in plain language what we found, what we will do about it and why. We offer them a way to ask us to look at it again.</w:t>
       </w:r>
     </w:p>
     <w:p>
@@ -1920,7 +2091,7 @@
         <w:pStyle w:val="ListParagraph"/>
         <w:numPr>
           <w:ilvl w:val="0"/>
-          <w:numId w:val="5"/>
+          <w:numId w:val="4"/>
         </w:numPr>
         <w:spacing w:after="60"/>
       </w:pPr>
@@ -1930,7 +2101,7 @@
           <w:sz w:val="22"/>
           <w:szCs w:val="22"/>
         </w:rPr>
-        <w:t xml:space="preserve">Decide and act. We decide what went wrong, if anything, and what we will do to put it right. We tell the complainant our decision, our reasons and any action we will take, and we check they are satisfied.</w:t>
+        <w:t xml:space="preserve">Put things right. We make the changes we agreed to and tell the person when they are done.</w:t>
       </w:r>
     </w:p>
     <w:p>
@@ -1938,7 +2109,7 @@
         <w:pStyle w:val="ListParagraph"/>
         <w:numPr>
           <w:ilvl w:val="0"/>
-          <w:numId w:val="5"/>
+          <w:numId w:val="4"/>
         </w:numPr>
         <w:spacing w:after="60"/>
       </w:pPr>
@@ -1948,25 +2119,7 @@
           <w:sz w:val="22"/>
           <w:szCs w:val="22"/>
         </w:rPr>
-        <w:t xml:space="preserve">Explain further options. If the complainant is not satisfied, we tell them they can complain to the NDIS Quality and Safeguards Commission, and how to do it.</w:t>
-      </w:r>
-    </w:p>
-    <w:p>
-      <w:pPr>
-        <w:pStyle w:val="ListParagraph"/>
-        <w:numPr>
-          <w:ilvl w:val="0"/>
-          <w:numId w:val="5"/>
-        </w:numPr>
-        <w:spacing w:after="60"/>
-      </w:pPr>
-      <w:r>
-        <w:rPr>
-          <w:rFonts w:ascii="Calibri" w:cs="Calibri" w:eastAsia="Calibri" w:hAnsi="Calibri"/>
-          <w:sz w:val="22"/>
-          <w:szCs w:val="22"/>
-        </w:rPr>
-        <w:t xml:space="preserve">Close and learn. We record the outcome and the date in the register. We then look for patterns and decide whether any change to our work is needed, and we record that change.</w:t>
+        <w:t xml:space="preserve">Close and learn. We record the outcome and the person's response in the register. We note what we will change to stop the same problem happening again.</w:t>
       </w:r>
     </w:p>
     <w:tbl>
@@ -2034,7 +2187,7 @@
                 <w:sz w:val="22"/>
                 <w:szCs w:val="22"/>
               </w:rPr>
-              <w:t xml:space="preserve">What we do</w:t>
+              <w:t xml:space="preserve">Who does it</w:t>
             </w:r>
           </w:p>
         </w:tc>
@@ -2081,49 +2234,49 @@
                 <w:sz w:val="22"/>
                 <w:szCs w:val="22"/>
               </w:rPr>
-              <w:t xml:space="preserve">Acknowledge</w:t>
-            </w:r>
-          </w:p>
-        </w:tc>
-        <w:tc>
-          <w:tcPr>
-            <w:tcW w:type="dxa" w:w="3000"/>
-            <w:tcBorders>
-              <w:top w:val="single" w:color="999999" w:sz="4"/>
-              <w:left w:val="single" w:color="999999" w:sz="4"/>
-              <w:bottom w:val="single" w:color="999999" w:sz="4"/>
-              <w:right w:val="single" w:color="999999" w:sz="4"/>
-            </w:tcBorders>
-          </w:tcPr>
-          <w:p>
-            <w:r>
-              <w:rPr>
-                <w:rFonts w:ascii="Calibri" w:cs="Calibri" w:eastAsia="Calibri" w:hAnsi="Calibri"/>
-                <w:sz w:val="22"/>
-                <w:szCs w:val="22"/>
-              </w:rPr>
-              <w:t xml:space="preserve">Tell the person we have their complaint and who is handling it</w:t>
-            </w:r>
-          </w:p>
-        </w:tc>
-        <w:tc>
-          <w:tcPr>
-            <w:tcW w:type="dxa" w:w="3000"/>
-            <w:tcBorders>
-              <w:top w:val="single" w:color="999999" w:sz="4"/>
-              <w:left w:val="single" w:color="999999" w:sz="4"/>
-              <w:bottom w:val="single" w:color="999999" w:sz="4"/>
-              <w:right w:val="single" w:color="999999" w:sz="4"/>
-            </w:tcBorders>
-          </w:tcPr>
-          <w:p>
-            <w:r>
-              <w:rPr>
-                <w:rFonts w:ascii="Calibri" w:cs="Calibri" w:eastAsia="Calibri" w:hAnsi="Calibri"/>
-                <w:sz w:val="22"/>
-                <w:szCs w:val="22"/>
-              </w:rPr>
-              <w:t xml:space="preserve">Within the timeframe set out in section 4 Policy statement</w:t>
+              <w:t xml:space="preserve">Receive and record</w:t>
+            </w:r>
+          </w:p>
+        </w:tc>
+        <w:tc>
+          <w:tcPr>
+            <w:tcW w:type="dxa" w:w="3000"/>
+            <w:tcBorders>
+              <w:top w:val="single" w:color="999999" w:sz="4"/>
+              <w:left w:val="single" w:color="999999" w:sz="4"/>
+              <w:bottom w:val="single" w:color="999999" w:sz="4"/>
+              <w:right w:val="single" w:color="999999" w:sz="4"/>
+            </w:tcBorders>
+          </w:tcPr>
+          <w:p>
+            <w:r>
+              <w:rPr>
+                <w:rFonts w:ascii="Calibri" w:cs="Calibri" w:eastAsia="Calibri" w:hAnsi="Calibri"/>
+                <w:sz w:val="22"/>
+                <w:szCs w:val="22"/>
+              </w:rPr>
+              <w:t xml:space="preserve">Owner</w:t>
+            </w:r>
+          </w:p>
+        </w:tc>
+        <w:tc>
+          <w:tcPr>
+            <w:tcW w:type="dxa" w:w="3000"/>
+            <w:tcBorders>
+              <w:top w:val="single" w:color="999999" w:sz="4"/>
+              <w:left w:val="single" w:color="999999" w:sz="4"/>
+              <w:bottom w:val="single" w:color="999999" w:sz="4"/>
+              <w:right w:val="single" w:color="999999" w:sz="4"/>
+            </w:tcBorders>
+          </w:tcPr>
+          <w:p>
+            <w:r>
+              <w:rPr>
+                <w:rFonts w:ascii="Calibri" w:cs="Calibri" w:eastAsia="Calibri" w:hAnsi="Calibri"/>
+                <w:sz w:val="22"/>
+                <w:szCs w:val="22"/>
+              </w:rPr>
+              <w:t xml:space="preserve">On the day we receive the complaint</w:t>
             </w:r>
           </w:p>
         </w:tc>
@@ -2146,49 +2299,49 @@
                 <w:sz w:val="22"/>
                 <w:szCs w:val="22"/>
               </w:rPr>
-              <w:t xml:space="preserve">Resolve</w:t>
-            </w:r>
-          </w:p>
-        </w:tc>
-        <w:tc>
-          <w:tcPr>
-            <w:tcW w:type="dxa" w:w="3000"/>
-            <w:tcBorders>
-              <w:top w:val="single" w:color="999999" w:sz="4"/>
-              <w:left w:val="single" w:color="999999" w:sz="4"/>
-              <w:bottom w:val="single" w:color="999999" w:sz="4"/>
-              <w:right w:val="single" w:color="999999" w:sz="4"/>
-            </w:tcBorders>
-          </w:tcPr>
-          <w:p>
-            <w:r>
-              <w:rPr>
-                <w:rFonts w:ascii="Calibri" w:cs="Calibri" w:eastAsia="Calibri" w:hAnsi="Calibri"/>
-                <w:sz w:val="22"/>
-                <w:szCs w:val="22"/>
-              </w:rPr>
-              <w:t xml:space="preserve">Give the person our decision, reasons and actions</w:t>
-            </w:r>
-          </w:p>
-        </w:tc>
-        <w:tc>
-          <w:tcPr>
-            <w:tcW w:type="dxa" w:w="3000"/>
-            <w:tcBorders>
-              <w:top w:val="single" w:color="999999" w:sz="4"/>
-              <w:left w:val="single" w:color="999999" w:sz="4"/>
-              <w:bottom w:val="single" w:color="999999" w:sz="4"/>
-              <w:right w:val="single" w:color="999999" w:sz="4"/>
-            </w:tcBorders>
-          </w:tcPr>
-          <w:p>
-            <w:r>
-              <w:rPr>
-                <w:rFonts w:ascii="Calibri" w:cs="Calibri" w:eastAsia="Calibri" w:hAnsi="Calibri"/>
-                <w:sz w:val="22"/>
-                <w:szCs w:val="22"/>
-              </w:rPr>
-              <w:t xml:space="preserve">Within the timeframe set out in section 4 Policy statement</w:t>
+              <w:t xml:space="preserve">Acknowledge</w:t>
+            </w:r>
+          </w:p>
+        </w:tc>
+        <w:tc>
+          <w:tcPr>
+            <w:tcW w:type="dxa" w:w="3000"/>
+            <w:tcBorders>
+              <w:top w:val="single" w:color="999999" w:sz="4"/>
+              <w:left w:val="single" w:color="999999" w:sz="4"/>
+              <w:bottom w:val="single" w:color="999999" w:sz="4"/>
+              <w:right w:val="single" w:color="999999" w:sz="4"/>
+            </w:tcBorders>
+          </w:tcPr>
+          <w:p>
+            <w:r>
+              <w:rPr>
+                <w:rFonts w:ascii="Calibri" w:cs="Calibri" w:eastAsia="Calibri" w:hAnsi="Calibri"/>
+                <w:sz w:val="22"/>
+                <w:szCs w:val="22"/>
+              </w:rPr>
+              <w:t xml:space="preserve">Owner</w:t>
+            </w:r>
+          </w:p>
+        </w:tc>
+        <w:tc>
+          <w:tcPr>
+            <w:tcW w:type="dxa" w:w="3000"/>
+            <w:tcBorders>
+              <w:top w:val="single" w:color="999999" w:sz="4"/>
+              <w:left w:val="single" w:color="999999" w:sz="4"/>
+              <w:bottom w:val="single" w:color="999999" w:sz="4"/>
+              <w:right w:val="single" w:color="999999" w:sz="4"/>
+            </w:tcBorders>
+          </w:tcPr>
+          <w:p>
+            <w:r>
+              <w:rPr>
+                <w:rFonts w:ascii="Calibri" w:cs="Calibri" w:eastAsia="Calibri" w:hAnsi="Calibri"/>
+                <w:sz w:val="22"/>
+                <w:szCs w:val="22"/>
+              </w:rPr>
+              <w:t xml:space="preserve">As set out in section 4 Policy statement</w:t>
             </w:r>
           </w:p>
         </w:tc>
@@ -2211,49 +2364,49 @@
                 <w:sz w:val="22"/>
                 <w:szCs w:val="22"/>
               </w:rPr>
-              <w:t xml:space="preserve">Keep informed</w:t>
-            </w:r>
-          </w:p>
-        </w:tc>
-        <w:tc>
-          <w:tcPr>
-            <w:tcW w:type="dxa" w:w="3000"/>
-            <w:tcBorders>
-              <w:top w:val="single" w:color="999999" w:sz="4"/>
-              <w:left w:val="single" w:color="999999" w:sz="4"/>
-              <w:bottom w:val="single" w:color="999999" w:sz="4"/>
-              <w:right w:val="single" w:color="999999" w:sz="4"/>
-            </w:tcBorders>
-          </w:tcPr>
-          <w:p>
-            <w:r>
-              <w:rPr>
-                <w:rFonts w:ascii="Calibri" w:cs="Calibri" w:eastAsia="Calibri" w:hAnsi="Calibri"/>
-                <w:sz w:val="22"/>
-                <w:szCs w:val="22"/>
-              </w:rPr>
-              <w:t xml:space="preserve">Update the person if the matter is taking longer than expected</w:t>
-            </w:r>
-          </w:p>
-        </w:tc>
-        <w:tc>
-          <w:tcPr>
-            <w:tcW w:type="dxa" w:w="3000"/>
-            <w:tcBorders>
-              <w:top w:val="single" w:color="999999" w:sz="4"/>
-              <w:left w:val="single" w:color="999999" w:sz="4"/>
-              <w:bottom w:val="single" w:color="999999" w:sz="4"/>
-              <w:right w:val="single" w:color="999999" w:sz="4"/>
-            </w:tcBorders>
-          </w:tcPr>
-          <w:p>
-            <w:r>
-              <w:rPr>
-                <w:rFonts w:ascii="Calibri" w:cs="Calibri" w:eastAsia="Calibri" w:hAnsi="Calibri"/>
-                <w:sz w:val="22"/>
-                <w:szCs w:val="22"/>
-              </w:rPr>
-              <w:t xml:space="preserve">At each delay, and at least as often as we agreed with them</w:t>
+              <w:t xml:space="preserve">Check for risk</w:t>
+            </w:r>
+          </w:p>
+        </w:tc>
+        <w:tc>
+          <w:tcPr>
+            <w:tcW w:type="dxa" w:w="3000"/>
+            <w:tcBorders>
+              <w:top w:val="single" w:color="999999" w:sz="4"/>
+              <w:left w:val="single" w:color="999999" w:sz="4"/>
+              <w:bottom w:val="single" w:color="999999" w:sz="4"/>
+              <w:right w:val="single" w:color="999999" w:sz="4"/>
+            </w:tcBorders>
+          </w:tcPr>
+          <w:p>
+            <w:r>
+              <w:rPr>
+                <w:rFonts w:ascii="Calibri" w:cs="Calibri" w:eastAsia="Calibri" w:hAnsi="Calibri"/>
+                <w:sz w:val="22"/>
+                <w:szCs w:val="22"/>
+              </w:rPr>
+              <w:t xml:space="preserve">Owner</w:t>
+            </w:r>
+          </w:p>
+        </w:tc>
+        <w:tc>
+          <w:tcPr>
+            <w:tcW w:type="dxa" w:w="3000"/>
+            <w:tcBorders>
+              <w:top w:val="single" w:color="999999" w:sz="4"/>
+              <w:left w:val="single" w:color="999999" w:sz="4"/>
+              <w:bottom w:val="single" w:color="999999" w:sz="4"/>
+              <w:right w:val="single" w:color="999999" w:sz="4"/>
+            </w:tcBorders>
+          </w:tcPr>
+          <w:p>
+            <w:r>
+              <w:rPr>
+                <w:rFonts w:ascii="Calibri" w:cs="Calibri" w:eastAsia="Calibri" w:hAnsi="Calibri"/>
+                <w:sz w:val="22"/>
+                <w:szCs w:val="22"/>
+              </w:rPr>
+              <w:t xml:space="preserve">Straight away, and again if new facts come up</w:t>
             </w:r>
           </w:p>
         </w:tc>
@@ -2276,49 +2429,179 @@
                 <w:sz w:val="22"/>
                 <w:szCs w:val="22"/>
               </w:rPr>
-              <w:t xml:space="preserve">Record and review</w:t>
-            </w:r>
-          </w:p>
-        </w:tc>
-        <w:tc>
-          <w:tcPr>
-            <w:tcW w:type="dxa" w:w="3000"/>
-            <w:tcBorders>
-              <w:top w:val="single" w:color="999999" w:sz="4"/>
-              <w:left w:val="single" w:color="999999" w:sz="4"/>
-              <w:bottom w:val="single" w:color="999999" w:sz="4"/>
-              <w:right w:val="single" w:color="999999" w:sz="4"/>
-            </w:tcBorders>
-          </w:tcPr>
-          <w:p>
-            <w:r>
-              <w:rPr>
-                <w:rFonts w:ascii="Calibri" w:cs="Calibri" w:eastAsia="Calibri" w:hAnsi="Calibri"/>
-                <w:sz w:val="22"/>
-                <w:szCs w:val="22"/>
-              </w:rPr>
-              <w:t xml:space="preserve">Complete the register entry and note any improvement</w:t>
-            </w:r>
-          </w:p>
-        </w:tc>
-        <w:tc>
-          <w:tcPr>
-            <w:tcW w:type="dxa" w:w="3000"/>
-            <w:tcBorders>
-              <w:top w:val="single" w:color="999999" w:sz="4"/>
-              <w:left w:val="single" w:color="999999" w:sz="4"/>
-              <w:bottom w:val="single" w:color="999999" w:sz="4"/>
-              <w:right w:val="single" w:color="999999" w:sz="4"/>
-            </w:tcBorders>
-          </w:tcPr>
-          <w:p>
-            <w:r>
-              <w:rPr>
-                <w:rFonts w:ascii="Calibri" w:cs="Calibri" w:eastAsia="Calibri" w:hAnsi="Calibri"/>
-                <w:sz w:val="22"/>
-                <w:szCs w:val="22"/>
-              </w:rPr>
-              <w:t xml:space="preserve">When the complaint is closed</w:t>
+              <w:t xml:space="preserve">Look into it and decide</w:t>
+            </w:r>
+          </w:p>
+        </w:tc>
+        <w:tc>
+          <w:tcPr>
+            <w:tcW w:type="dxa" w:w="3000"/>
+            <w:tcBorders>
+              <w:top w:val="single" w:color="999999" w:sz="4"/>
+              <w:left w:val="single" w:color="999999" w:sz="4"/>
+              <w:bottom w:val="single" w:color="999999" w:sz="4"/>
+              <w:right w:val="single" w:color="999999" w:sz="4"/>
+            </w:tcBorders>
+          </w:tcPr>
+          <w:p>
+            <w:r>
+              <w:rPr>
+                <w:rFonts w:ascii="Calibri" w:cs="Calibri" w:eastAsia="Calibri" w:hAnsi="Calibri"/>
+                <w:sz w:val="22"/>
+                <w:szCs w:val="22"/>
+              </w:rPr>
+              <w:t xml:space="preserve">Owner</w:t>
+            </w:r>
+          </w:p>
+        </w:tc>
+        <w:tc>
+          <w:tcPr>
+            <w:tcW w:type="dxa" w:w="3000"/>
+            <w:tcBorders>
+              <w:top w:val="single" w:color="999999" w:sz="4"/>
+              <w:left w:val="single" w:color="999999" w:sz="4"/>
+              <w:bottom w:val="single" w:color="999999" w:sz="4"/>
+              <w:right w:val="single" w:color="999999" w:sz="4"/>
+            </w:tcBorders>
+          </w:tcPr>
+          <w:p>
+            <w:r>
+              <w:rPr>
+                <w:rFonts w:ascii="Calibri" w:cs="Calibri" w:eastAsia="Calibri" w:hAnsi="Calibri"/>
+                <w:sz w:val="22"/>
+                <w:szCs w:val="22"/>
+              </w:rPr>
+              <w:t xml:space="preserve">As quickly as we can, and within the time set out in section 4 Policy statement</w:t>
+            </w:r>
+          </w:p>
+        </w:tc>
+      </w:tr>
+      <w:tr>
+        <w:tc>
+          <w:tcPr>
+            <w:tcW w:type="dxa" w:w="3000"/>
+            <w:tcBorders>
+              <w:top w:val="single" w:color="999999" w:sz="4"/>
+              <w:left w:val="single" w:color="999999" w:sz="4"/>
+              <w:bottom w:val="single" w:color="999999" w:sz="4"/>
+              <w:right w:val="single" w:color="999999" w:sz="4"/>
+            </w:tcBorders>
+          </w:tcPr>
+          <w:p>
+            <w:r>
+              <w:rPr>
+                <w:rFonts w:ascii="Calibri" w:cs="Calibri" w:eastAsia="Calibri" w:hAnsi="Calibri"/>
+                <w:sz w:val="22"/>
+                <w:szCs w:val="22"/>
+              </w:rPr>
+              <w:t xml:space="preserve">Respond to the person</w:t>
+            </w:r>
+          </w:p>
+        </w:tc>
+        <w:tc>
+          <w:tcPr>
+            <w:tcW w:type="dxa" w:w="3000"/>
+            <w:tcBorders>
+              <w:top w:val="single" w:color="999999" w:sz="4"/>
+              <w:left w:val="single" w:color="999999" w:sz="4"/>
+              <w:bottom w:val="single" w:color="999999" w:sz="4"/>
+              <w:right w:val="single" w:color="999999" w:sz="4"/>
+            </w:tcBorders>
+          </w:tcPr>
+          <w:p>
+            <w:r>
+              <w:rPr>
+                <w:rFonts w:ascii="Calibri" w:cs="Calibri" w:eastAsia="Calibri" w:hAnsi="Calibri"/>
+                <w:sz w:val="22"/>
+                <w:szCs w:val="22"/>
+              </w:rPr>
+              <w:t xml:space="preserve">Owner</w:t>
+            </w:r>
+          </w:p>
+        </w:tc>
+        <w:tc>
+          <w:tcPr>
+            <w:tcW w:type="dxa" w:w="3000"/>
+            <w:tcBorders>
+              <w:top w:val="single" w:color="999999" w:sz="4"/>
+              <w:left w:val="single" w:color="999999" w:sz="4"/>
+              <w:bottom w:val="single" w:color="999999" w:sz="4"/>
+              <w:right w:val="single" w:color="999999" w:sz="4"/>
+            </w:tcBorders>
+          </w:tcPr>
+          <w:p>
+            <w:r>
+              <w:rPr>
+                <w:rFonts w:ascii="Calibri" w:cs="Calibri" w:eastAsia="Calibri" w:hAnsi="Calibri"/>
+                <w:sz w:val="22"/>
+                <w:szCs w:val="22"/>
+              </w:rPr>
+              <w:t xml:space="preserve">As soon as we have decided, and within the time set out in section 4 Policy statement</w:t>
+            </w:r>
+          </w:p>
+        </w:tc>
+      </w:tr>
+      <w:tr>
+        <w:tc>
+          <w:tcPr>
+            <w:tcW w:type="dxa" w:w="3000"/>
+            <w:tcBorders>
+              <w:top w:val="single" w:color="999999" w:sz="4"/>
+              <w:left w:val="single" w:color="999999" w:sz="4"/>
+              <w:bottom w:val="single" w:color="999999" w:sz="4"/>
+              <w:right w:val="single" w:color="999999" w:sz="4"/>
+            </w:tcBorders>
+          </w:tcPr>
+          <w:p>
+            <w:r>
+              <w:rPr>
+                <w:rFonts w:ascii="Calibri" w:cs="Calibri" w:eastAsia="Calibri" w:hAnsi="Calibri"/>
+                <w:sz w:val="22"/>
+                <w:szCs w:val="22"/>
+              </w:rPr>
+              <w:t xml:space="preserve">Close and learn</w:t>
+            </w:r>
+          </w:p>
+        </w:tc>
+        <w:tc>
+          <w:tcPr>
+            <w:tcW w:type="dxa" w:w="3000"/>
+            <w:tcBorders>
+              <w:top w:val="single" w:color="999999" w:sz="4"/>
+              <w:left w:val="single" w:color="999999" w:sz="4"/>
+              <w:bottom w:val="single" w:color="999999" w:sz="4"/>
+              <w:right w:val="single" w:color="999999" w:sz="4"/>
+            </w:tcBorders>
+          </w:tcPr>
+          <w:p>
+            <w:r>
+              <w:rPr>
+                <w:rFonts w:ascii="Calibri" w:cs="Calibri" w:eastAsia="Calibri" w:hAnsi="Calibri"/>
+                <w:sz w:val="22"/>
+                <w:szCs w:val="22"/>
+              </w:rPr>
+              <w:t xml:space="preserve">Owner</w:t>
+            </w:r>
+          </w:p>
+        </w:tc>
+        <w:tc>
+          <w:tcPr>
+            <w:tcW w:type="dxa" w:w="3000"/>
+            <w:tcBorders>
+              <w:top w:val="single" w:color="999999" w:sz="4"/>
+              <w:left w:val="single" w:color="999999" w:sz="4"/>
+              <w:bottom w:val="single" w:color="999999" w:sz="4"/>
+              <w:right w:val="single" w:color="999999" w:sz="4"/>
+            </w:tcBorders>
+          </w:tcPr>
+          <w:p>
+            <w:r>
+              <w:rPr>
+                <w:rFonts w:ascii="Calibri" w:cs="Calibri" w:eastAsia="Calibri" w:hAnsi="Calibri"/>
+                <w:sz w:val="22"/>
+                <w:szCs w:val="22"/>
+              </w:rPr>
+              <w:t xml:space="preserve">After the person has had our response; we record any changes we make</w:t>
             </w:r>
           </w:p>
         </w:tc>
@@ -2347,7 +2630,7 @@
           <w:sz w:val="22"/>
           <w:szCs w:val="22"/>
         </w:rPr>
-        <w:t xml:space="preserve">The statutory timeframes and the Commission's definitions are not restated here. Use the ones set out in section 3 Definitions and section 4 Policy statement.</w:t>
+        <w:t xml:space="preserve">If we cannot finish within the timeframes, we tell the person why, tell them when to expect an answer and keep them updated.</w:t>
       </w:r>
     </w:p>
     <w:p>
@@ -2360,7 +2643,20 @@
           <w:sz w:val="22"/>
           <w:szCs w:val="22"/>
         </w:rPr>
-        <w:t xml:space="preserve">A participant, or anyone acting for them, can complain to the NDIS Quality and Safeguards Commission at any time. They do not have to complain to us first, and they do not have to wait for our process to finish. They can contact the Commission by phone, in writing or through its website, and we give them the current contact details when we explain their options.</w:t>
+        <w:t xml:space="preserve">A participant, or anyone acting for them, can also complain to the NDIS Quality and Safeguards Commission at any time. They do not have to complain to us first, and they can still go to the Commission if they are unhappy with our response. They can call 1800 035 544 (free from landlines) or use the complaint form on the Commission's website at ndiscommission.gov.au. They can also ask someone they trust, or an advocate, to help them make the complaint.</w:t>
+      </w:r>
+    </w:p>
+    <w:p>
+      <w:pPr>
+        <w:spacing w:after="120"/>
+      </w:pPr>
+      <w:r>
+        <w:rPr>
+          <w:rFonts w:ascii="Calibri" w:cs="Calibri" w:eastAsia="Calibri" w:hAnsi="Calibri"/>
+          <w:sz w:val="22"/>
+          <w:szCs w:val="22"/>
+        </w:rPr>
+        <w:t xml:space="preserve">We tell every participant how to complain to us and to the Commission when they start with us. We also tell them again whenever they ask, and when they are unhappy with something we have done. No participant is treated worse because they made a complaint.</w:t>
       </w:r>
     </w:p>
     <w:tbl>
@@ -2399,7 +2695,7 @@
                 <w:sz w:val="22"/>
                 <w:szCs w:val="22"/>
               </w:rPr>
-              <w:t xml:space="preserve">[Provider to complete: Sunrise Supports phone number and email address for making a complaint, and the Commission's current contact details as at the date of issue.]</w:t>
+              <w:t xml:space="preserve">[Provider to complete: the phone number, email address and postal address participants should use to contact Sunrise Supports with a complaint.]</w:t>
             </w:r>
           </w:p>
         </w:tc>
@@ -2416,19 +2712,6 @@
           <w:szCs w:val="22"/>
         </w:rPr>
         <w:t xml:space="preserve"/>
-      </w:r>
-    </w:p>
-    <w:p>
-      <w:pPr>
-        <w:spacing w:after="120"/>
-      </w:pPr>
-      <w:r>
-        <w:rPr>
-          <w:rFonts w:ascii="Calibri" w:cs="Calibri" w:eastAsia="Calibri" w:hAnsi="Calibri"/>
-          <w:sz w:val="22"/>
-          <w:szCs w:val="22"/>
-        </w:rPr>
-        <w:t xml:space="preserve">We do not treat anyone worse for making a complaint. A complaint never affects the supports a participant receives from us.</w:t>
       </w:r>
     </w:p>
     <w:p>
@@ -3522,18 +3805,12 @@
     </w:lvlOverride>
   </w:num>
   <w:num w:numId="3">
-    <w:abstractNumId w:val="7"/>
+    <w:abstractNumId w:val="8"/>
     <w:lvlOverride w:ilvl="0">
       <w:startOverride w:val="1"/>
     </w:lvlOverride>
   </w:num>
   <w:num w:numId="4">
-    <w:abstractNumId w:val="8"/>
-    <w:lvlOverride w:ilvl="0">
-      <w:startOverride w:val="1"/>
-    </w:lvlOverride>
-  </w:num>
-  <w:num w:numId="5">
     <w:abstractNumId w:val="10"/>
     <w:lvlOverride w:ilvl="0">
       <w:startOverride w:val="1"/>

</xml_diff>